<commit_message>
resume: update Tangible/HD-EMG/skills/languages; add 2nd-author bullet; regen PDF
</commit_message>
<xml_diff>
--- a/public/resume_2026.docx
+++ b/public/resume_2026.docx
@@ -93,7 +93,7 @@
           <w:sz w:val="16"/>
           <w:lang w:val="fr-FR"/>
         </w:rPr>
-        <w:t>281 rue du Faubourg Saint-Antoine, Paris, France | paulpeterarslan@gmail.com | polpii97@mit.edu | +33 7 83 59 65 83</w:t>
+        <w:t>Paris, France | paulpeterarslan@gmail.com | polpii97@mit.edu | +33 7 83 59 65 83</w:t>
       </w:r>
     </w:p>
     <w:p>
@@ -592,86 +592,6 @@
     </w:p>
     <w:p>
       <w:pPr>
-        <w:spacing w:before="1"/>
-        <w:ind w:left="14"/>
-        <w:rPr>
-          <w:i/>
-          <w:sz w:val="18"/>
-        </w:rPr>
-      </w:pPr>
-      <w:proofErr w:type="gramStart"/>
-      <w:r>
-        <w:rPr>
-          <w:i/>
-          <w:sz w:val="18"/>
-        </w:rPr>
-        <w:t>GPA</w:t>
-      </w:r>
-      <w:r>
-        <w:rPr>
-          <w:i/>
-          <w:spacing w:val="10"/>
-          <w:sz w:val="18"/>
-        </w:rPr>
-        <w:t xml:space="preserve"> </w:t>
-      </w:r>
-      <w:r>
-        <w:rPr>
-          <w:i/>
-          <w:sz w:val="18"/>
-        </w:rPr>
-        <w:t>:</w:t>
-      </w:r>
-      <w:proofErr w:type="gramEnd"/>
-      <w:r>
-        <w:rPr>
-          <w:i/>
-          <w:spacing w:val="8"/>
-          <w:sz w:val="18"/>
-        </w:rPr>
-        <w:t xml:space="preserve"> </w:t>
-      </w:r>
-      <w:r>
-        <w:rPr>
-          <w:i/>
-          <w:sz w:val="18"/>
-        </w:rPr>
-        <w:t>3.2</w:t>
-      </w:r>
-      <w:r>
-        <w:rPr>
-          <w:i/>
-          <w:spacing w:val="9"/>
-          <w:sz w:val="18"/>
-        </w:rPr>
-        <w:t xml:space="preserve"> </w:t>
-      </w:r>
-      <w:r>
-        <w:rPr>
-          <w:i/>
-          <w:sz w:val="18"/>
-        </w:rPr>
-        <w:t>/</w:t>
-      </w:r>
-      <w:r>
-        <w:rPr>
-          <w:i/>
-          <w:spacing w:val="7"/>
-          <w:sz w:val="18"/>
-        </w:rPr>
-        <w:t xml:space="preserve"> </w:t>
-      </w:r>
-      <w:r>
-        <w:rPr>
-          <w:i/>
-          <w:spacing w:val="-10"/>
-          <w:sz w:val="18"/>
-        </w:rPr>
-        <w:t>4</w:t>
-      </w:r>
-    </w:p>
-    <w:p>
-      <w:pPr>
         <w:pStyle w:val="Titre2"/>
       </w:pPr>
       <w:r>
@@ -1320,7 +1240,7 @@
         <w:rPr>
           <w:sz w:val="18"/>
         </w:rPr>
-        <w:t>• HD-EMG &amp; AI: Developed continuous finger-force decoding from 224-channel HD-EMG using CNN-LSTM architectures</w:t>
+        <w:t>• HD-EMG &amp; AI: Finger-force decoding from 224-channel HD-EMG using Transformer (FITLight) and GRU architectures</w:t>
       </w:r>
     </w:p>
     <w:p>
@@ -1331,7 +1251,18 @@
         <w:rPr>
           <w:sz w:val="18"/>
         </w:rPr>
-        <w:t>• Tangible Co-Ideation: Submitted to ACM DIS 2026 Student Design Competition</w:t>
+        <w:t>• Tangible Co-Ideation (embodied prompting): Finalist, ACM DIS 2026 Student Design Competition; submitted to ACM UIST 2026</w:t>
+      </w:r>
+    </w:p>
+    <w:p>
+      <w:pPr>
+        <w:spacing w:before="3"/>
+      </w:pPr>
+      <w:r>
+        <w:rPr>
+          <w:sz w:val="18"/>
+        </w:rPr>
+        <w:t xml:space="preserve">• 2nd-author contributions across papers: TMS experiments, haptic feedback, embedded dev., UX interfaces</w:t>
       </w:r>
     </w:p>
     <w:p>
@@ -6382,7 +6313,7 @@
       </w:r>
       <w:proofErr w:type="spellEnd"/>
       <w:r>
-        <w:t xml:space="preserve">, TensorFlow, scikit-learn), JavaScript/TypeScript (React, Next.js, Node.js), C/C++, C#, MATLAB, </w:t>
+        <w:t xml:space="preserve">, TensorFlow, scikit-learn), JavaScript/TypeScript (React, Next.js, Node.js), C#, MATLAB, </w:t>
       </w:r>
       <w:proofErr w:type="gramStart"/>
       <w:r>
@@ -6445,13 +6376,12 @@
         <w:rPr>
           <w:sz w:val="18"/>
         </w:rPr>
-        <w:t xml:space="preserve">Languages: French (native), English (fluent — academic writing &amp; presentations), Spanish (conversational), </w:t>
-      </w:r>
-      <w:r>
-        <w:rPr>
-          <w:sz w:val="18"/>
-        </w:rPr>
-        <w:t>Lebanese</w:t>
+        <w:t>Languages: French (native), English (fluent — academic writing &amp; presentations), Spanish (conversational)</w:t>
+      </w:r>
+      <w:r>
+        <w:rPr>
+          <w:sz w:val="18"/>
+        </w:rPr>
       </w:r>
     </w:p>
     <w:sectPr>

</xml_diff>

<commit_message>
Resume: add personal statement, education/skills layout, right-aligned locations; Publications sync; add project videos
</commit_message>
<xml_diff>
--- a/public/resume_2026.docx
+++ b/public/resume_2026.docx
@@ -23,22 +23,6 @@
           <w:sz w:val="22"/>
         </w:rPr>
       </w:pPr>
-    </w:p>
-    <w:p>
-      <w:pPr>
-        <w:pStyle w:val="Titre1"/>
-        <w:rPr>
-          <w:lang w:val="fr-FR"/>
-        </w:rPr>
-      </w:pPr>
-      <w:r>
-        <w:rPr>
-          <w:spacing w:val="-2"/>
-          <w:w w:val="120"/>
-          <w:lang w:val="fr-FR"/>
-        </w:rPr>
-        <w:t>EDUCATION</w:t>
-      </w:r>
     </w:p>
     <w:p>
       <w:pPr>
@@ -116,6 +100,746 @@
     </w:p>
     <w:p>
       <w:pPr>
+        <w:pStyle w:val="Titre1"/>
+        <w:pBdr>
+          <w:bottom w:val="single" w:sz="6" w:space="1" w:color="auto"/>
+        </w:pBdr>
+        <w:spacing w:before="80" w:after="120"/>
+        <w:rPr>
+          <w:rFonts w:ascii="Calibri" w:hAnsi="Calibri" w:cs="Calibri"/>
+          <w:b w:val="0"/>
+          <w:sz w:val="20"/>
+        </w:rPr>
+      </w:pPr>
+      <w:r>
+        <w:rPr>
+          <w:rFonts w:ascii="Calibri" w:hAnsi="Calibri" w:cs="Calibri"/>
+          <w:b w:val="0"/>
+          <w:sz w:val="20"/>
+        </w:rPr>
+        <w:t>Research Scientist with a PhD focus on large language model systems, multi-agent architectures, and rigorous behavioral evaluation of human-AI interaction. My work is driven by the conviction that the next generation of AI should be built to genuinely understand and serve diverse communities, through responsible engineering and breakthrough research. I build end-to-end LLM systems, from multi-agent reasoning pipelines to behavioral evaluation, with the goal of creating AI that advances science and improves how people learn, create, and recover.</w:t>
+      </w:r>
+    </w:p>
+    <w:p>
+      <w:pPr>
+        <w:pStyle w:val="Titre1"/>
+        <w:pBdr>
+          <w:bottom w:val="single" w:sz="6" w:space="1" w:color="auto"/>
+        </w:pBdr>
+        <w:spacing w:before="3"/>
+      </w:pPr>
+      <w:r>
+        <w:t>RESEARCH EXPERIENCE</w:t>
+      </w:r>
+    </w:p>
+    <w:p>
+      <w:pPr>
+        <w:tabs>
+          <w:tab w:val="decimal" w:pos="10334"/>
+        </w:tabs>
+        <w:spacing w:before="3"/>
+        <w:rPr>
+          <w:b/>
+          <w:sz w:val="20"/>
+        </w:rPr>
+      </w:pPr>
+      <w:r>
+        <w:rPr>
+          <w:b/>
+          <w:sz w:val="20"/>
+        </w:rPr>
+        <w:t>Visiting Research Student, MIT Media Lab (Tangible Media Group)</w:t>
+      </w:r>
+      <w:r>
+        <w:rPr>
+          <w:b/>
+          <w:sz w:val="20"/>
+        </w:rPr>
+        <w:tab/>
+        <w:t>Cambridge, MA, USA</w:t>
+      </w:r>
+    </w:p>
+    <w:p>
+      <w:pPr>
+        <w:tabs>
+          <w:tab w:val="decimal" w:pos="9080"/>
+        </w:tabs>
+        <w:spacing w:before="3"/>
+      </w:pPr>
+      <w:r>
+        <w:rPr>
+          <w:sz w:val="18"/>
+        </w:rPr>
+        <w:t>• Co-first author (equal contribution), Tangible Co-Ideation: multi-agent LLM system with multimodal RAG, fine-tuning and prompt engineering. Within-subjects user study (N=32, 16 pairs) compared tangible vs. screen-only conditions with statistically significant effects on verbal interaction and ideation behaviour. Advised by Prof. Hiroshi Ishii. Submitted to ACM UIST 2026; ACM DIS 2026 SDC finalist.</w:t>
+      </w:r>
+    </w:p>
+    <w:p>
+      <w:pPr>
+        <w:spacing w:before="3"/>
+      </w:pPr>
+      <w:r>
+        <w:rPr>
+          <w:sz w:val="18"/>
+        </w:rPr>
+        <w:t>• Coursework: Interaction Intelligence: Teleabsence (Prof. H. Ishii), Design Intelligence (Prof. M. Coelho)</w:t>
+      </w:r>
+    </w:p>
+    <w:p>
+      <w:pPr>
+        <w:spacing w:before="3"/>
+      </w:pPr>
+      <w:r>
+        <w:rPr>
+          <w:sz w:val="18"/>
+        </w:rPr>
+        <w:t>• Winner, Connect track at MIT Hard Mode: Hardware AI Hackathon 2026 (IPheromone: wearable multi-agent LLM system for proximity-based human compatibility, agent-to-agent reasoning)</w:t>
+      </w:r>
+    </w:p>
+    <w:p>
+      <w:pPr>
+        <w:spacing w:before="3"/>
+      </w:pPr>
+    </w:p>
+    <w:p>
+      <w:pPr>
+        <w:tabs>
+          <w:tab w:val="decimal" w:pos="10334"/>
+        </w:tabs>
+        <w:spacing w:before="3"/>
+        <w:rPr>
+          <w:sz w:val="18"/>
+          <w:szCs w:val="18"/>
+        </w:rPr>
+      </w:pPr>
+      <w:r>
+        <w:rPr>
+          <w:b/>
+          <w:sz w:val="20"/>
+        </w:rPr>
+        <w:t>Ph.D. Researcher, Institute for Future Technologies / Neuroscience Institute Paris</w:t>
+      </w:r>
+      <w:r>
+        <w:rPr>
+          <w:b/>
+          <w:sz w:val="20"/>
+        </w:rPr>
+        <w:tab/>
+        <w:t>Paris, France</w:t>
+      </w:r>
+    </w:p>
+    <w:p>
+      <w:pPr>
+        <w:tabs>
+          <w:tab w:val="decimal" w:pos="10334"/>
+        </w:tabs>
+        <w:spacing w:before="3"/>
+        <w:rPr>
+          <w:sz w:val="18"/>
+          <w:szCs w:val="18"/>
+        </w:rPr>
+      </w:pPr>
+      <w:r>
+        <w:rPr>
+          <w:sz w:val="18"/>
+          <w:szCs w:val="18"/>
+        </w:rPr>
+        <w:t>Supervisors: Dr. Xiao Xiao (Institute for Future Technologies / MIT), Dr. Pavel Lindberg (INSERM)</w:t>
+      </w:r>
+      <w:r>
+        <w:rPr>
+          <w:sz w:val="18"/>
+          <w:szCs w:val="18"/>
+        </w:rPr>
+        <w:tab/>
+        <w:t>2023 – Present</w:t>
+      </w:r>
+    </w:p>
+    <w:p>
+      <w:pPr>
+        <w:spacing w:before="3"/>
+        <w:rPr>
+          <w:sz w:val="18"/>
+          <w:szCs w:val="18"/>
+        </w:rPr>
+      </w:pPr>
+      <w:r>
+        <w:rPr>
+          <w:sz w:val="18"/>
+          <w:szCs w:val="18"/>
+        </w:rPr>
+        <w:t>• Tangible Co-Ideation: multi-agent LLM system (co-first author, equal contribution): AI Mentors as LLM-simulated expert perspectives on text and image, grounded by a multimodal RAG knowledge base (OCR + cross-modal retrieval); fine-tuning and prompt engineering align each agent with its persona voice. Related-work module queries arXiv, Semantic Scholar, and CrossRef. Evaluation: within-subjects user study N=32 (16 pairs), tangible vs. screen-only, on verbal interaction.</w:t>
+      </w:r>
+    </w:p>
+    <w:p>
+      <w:pPr>
+        <w:spacing w:before="3"/>
+      </w:pPr>
+      <w:r>
+        <w:rPr>
+          <w:sz w:val="18"/>
+        </w:rPr>
+        <w:t>• IPheromone: personalized LLM agents (team project): Wearable Raspberry Pi system; each user has a personal LLM agent that builds a structured profile from conversation; agents exchange profiles and reason about compatibility, producing match scores. End-to-end functioning prototype on real hardware. Winner, Connect track at MIT Hard Mode Hardware AI Hackathon 2026.</w:t>
+      </w:r>
+    </w:p>
+    <w:p>
+      <w:pPr>
+        <w:spacing w:before="3"/>
+      </w:pPr>
+      <w:r>
+        <w:rPr>
+          <w:sz w:val="18"/>
+        </w:rPr>
+        <w:t>• HD-EMG Deep Learning: high-density (224-channel) signal decoding with a causal Transformer (FITLight, FFT-based attention) and a GRU branch (MFTEventGRU); full PyTorch pipeline (dataset, training loop, mixed-precision, hyperparameter sweeps, with low-latency inference suitable for biofeedback.</w:t>
+      </w:r>
+    </w:p>
+    <w:p>
+      <w:pPr>
+        <w:spacing w:before="3"/>
+      </w:pPr>
+      <w:r>
+        <w:rPr>
+          <w:sz w:val="18"/>
+        </w:rPr>
+        <w:t>• ReTouche: Projection-AR piano-learning system; mixed-methods evaluation: 3-arm comparative study (n=18) + longitudinal autoethnography + expert focus group. ACM CHI 2026</w:t>
+      </w:r>
+    </w:p>
+    <w:p>
+      <w:pPr>
+        <w:spacing w:before="3"/>
+      </w:pPr>
+      <w:r>
+        <w:rPr>
+          <w:sz w:val="18"/>
+        </w:rPr>
+        <w:t>• Rhythm Karaoke: Millisecond-resolution timing engine for fine motor behavior; powers downstream ML feature extraction. Submitted to Springer Nature (Scientific Reports)</w:t>
+      </w:r>
+    </w:p>
+    <w:p>
+      <w:pPr>
+        <w:spacing w:before="3"/>
+      </w:pPr>
+      <w:r>
+        <w:rPr>
+          <w:sz w:val="18"/>
+        </w:rPr>
+        <w:t>• 2nd-author contributions: TMS-based motor mapping, haptic feedback prototypes, embedded firmware, and front-end interfaces for collaborator studies</w:t>
+      </w:r>
+    </w:p>
+    <w:p>
+      <w:pPr>
+        <w:spacing w:before="3"/>
+      </w:pPr>
+      <w:r>
+        <w:rPr>
+          <w:sz w:val="18"/>
+        </w:rPr>
+        <w:t>• Teaching: Web Development, AI with Bio-sensors, Research Workshops for Master students</w:t>
+      </w:r>
+    </w:p>
+    <w:p>
+      <w:pPr>
+        <w:spacing w:before="3"/>
+      </w:pPr>
+    </w:p>
+    <w:p>
+      <w:pPr>
+        <w:pStyle w:val="Titre1"/>
+        <w:pBdr>
+          <w:bottom w:val="single" w:sz="6" w:space="1" w:color="auto"/>
+        </w:pBdr>
+        <w:spacing w:before="3"/>
+      </w:pPr>
+      <w:r>
+        <w:t>PUBLICATIONS</w:t>
+      </w:r>
+    </w:p>
+    <w:p>
+      <w:pPr>
+        <w:pStyle w:val="Titre1"/>
+        <w:spacing w:before="3"/>
+      </w:pPr>
+      <w:r>
+        <w:rPr>
+          <w:i/>
+          <w:sz w:val="18"/>
+        </w:rPr>
+        <w:t>First Author</w:t>
+      </w:r>
+    </w:p>
+    <w:p>
+      <w:pPr>
+        <w:pStyle w:val="Titre1"/>
+        <w:spacing w:before="3"/>
+      </w:pPr>
+      <w:r>
+        <w:rPr>
+          <w:b w:val="0"/>
+          <w:i/>
+          <w:sz w:val="17"/>
+        </w:rPr>
+        <w:t>Peer-Reviewed</w:t>
+      </w:r>
+    </w:p>
+    <w:p>
+      <w:pPr>
+        <w:pStyle w:val="Titre1"/>
+        <w:spacing w:before="3"/>
+      </w:pPr>
+      <w:r>
+        <w:rPr>
+          <w:sz w:val="18"/>
+        </w:rPr>
+        <w:t>•  Arslan, P.-P.</w:t>
+      </w:r>
+      <w:r>
+        <w:rPr>
+          <w:b w:val="0"/>
+          <w:sz w:val="18"/>
+        </w:rPr>
+        <w:t xml:space="preserve">, Xiao, X., et al. ReTouche: Embodied Representations for Self-Directed Piano Learning. </w:t>
+      </w:r>
+      <w:r>
+        <w:rPr>
+          <w:b w:val="0"/>
+          <w:i/>
+          <w:sz w:val="18"/>
+        </w:rPr>
+        <w:t>ACM CHI 2026</w:t>
+      </w:r>
+      <w:r>
+        <w:rPr>
+          <w:b w:val="0"/>
+          <w:sz w:val="18"/>
+        </w:rPr>
+        <w:t xml:space="preserve"> (full paper, accepted).</w:t>
+      </w:r>
+    </w:p>
+    <w:p>
+      <w:pPr>
+        <w:pStyle w:val="Titre1"/>
+        <w:spacing w:before="3"/>
+      </w:pPr>
+      <w:r>
+        <w:rPr>
+          <w:b w:val="0"/>
+          <w:i/>
+          <w:sz w:val="17"/>
+        </w:rPr>
+        <w:t>Under Review</w:t>
+      </w:r>
+    </w:p>
+    <w:p>
+      <w:pPr>
+        <w:pStyle w:val="Titre1"/>
+        <w:spacing w:before="3"/>
+      </w:pPr>
+      <w:r>
+        <w:rPr>
+          <w:sz w:val="18"/>
+        </w:rPr>
+        <w:t xml:space="preserve">•  </w:t>
+      </w:r>
+      <w:r>
+        <w:rPr>
+          <w:b w:val="0"/>
+          <w:sz w:val="18"/>
+        </w:rPr>
+        <w:t xml:space="preserve">Li, Y. L.*, Kuang, Q.*, </w:t>
+      </w:r>
+      <w:r>
+        <w:rPr>
+          <w:sz w:val="18"/>
+        </w:rPr>
+        <w:t>Arslan, P.-P.*</w:t>
+      </w:r>
+      <w:r>
+        <w:rPr>
+          <w:b w:val="0"/>
+          <w:sz w:val="18"/>
+        </w:rPr>
+        <w:t xml:space="preserve">, Xiao, X., Ishii, H. Tangible Prompting: A Physical Vocabulary for Navigating Conceptual Spaces in Human-AI Co-Ideation. Submitted to </w:t>
+      </w:r>
+      <w:r>
+        <w:rPr>
+          <w:b w:val="0"/>
+          <w:i/>
+          <w:sz w:val="18"/>
+        </w:rPr>
+        <w:t>ACM UIST 2026</w:t>
+      </w:r>
+      <w:r>
+        <w:rPr>
+          <w:b w:val="0"/>
+          <w:sz w:val="18"/>
+        </w:rPr>
+        <w:t xml:space="preserve">; Demo accepted at </w:t>
+      </w:r>
+      <w:r>
+        <w:rPr>
+          <w:b w:val="0"/>
+          <w:i/>
+          <w:sz w:val="18"/>
+        </w:rPr>
+        <w:t>ACM CHI 2026</w:t>
+      </w:r>
+      <w:r>
+        <w:rPr>
+          <w:b w:val="0"/>
+          <w:sz w:val="18"/>
+        </w:rPr>
+        <w:t>. (*equal contribution)</w:t>
+      </w:r>
+    </w:p>
+    <w:p>
+      <w:pPr>
+        <w:pStyle w:val="Titre1"/>
+        <w:spacing w:before="3"/>
+      </w:pPr>
+      <w:r>
+        <w:rPr>
+          <w:sz w:val="18"/>
+        </w:rPr>
+        <w:t xml:space="preserve">•  </w:t>
+      </w:r>
+      <w:r>
+        <w:rPr>
+          <w:b w:val="0"/>
+          <w:sz w:val="18"/>
+        </w:rPr>
+        <w:t xml:space="preserve">Li, Y. L.*, Kuang, Q.*, </w:t>
+      </w:r>
+      <w:r>
+        <w:rPr>
+          <w:sz w:val="18"/>
+        </w:rPr>
+        <w:t>Arslan, P.-P.*</w:t>
+      </w:r>
+      <w:r>
+        <w:rPr>
+          <w:b w:val="0"/>
+          <w:sz w:val="18"/>
+        </w:rPr>
+        <w:t xml:space="preserve">, Xiao, X., Ishii, H. Tangible Co-Ideation: Designing Embodied Prompting for Creative Thinking with Large Language Models. </w:t>
+      </w:r>
+      <w:r>
+        <w:rPr>
+          <w:b w:val="0"/>
+          <w:i/>
+          <w:sz w:val="18"/>
+        </w:rPr>
+        <w:t>ACM DIS 2026 SDC</w:t>
+      </w:r>
+      <w:r>
+        <w:rPr>
+          <w:b w:val="0"/>
+          <w:sz w:val="18"/>
+        </w:rPr>
+        <w:t xml:space="preserve"> (finalist). (*equal contribution)</w:t>
+      </w:r>
+    </w:p>
+    <w:p>
+      <w:pPr>
+        <w:pStyle w:val="Titre1"/>
+        <w:spacing w:before="3"/>
+      </w:pPr>
+      <w:r>
+        <w:rPr>
+          <w:sz w:val="18"/>
+        </w:rPr>
+        <w:t>•  Arslan, P.-P.</w:t>
+      </w:r>
+      <w:r>
+        <w:rPr>
+          <w:b w:val="0"/>
+          <w:sz w:val="18"/>
+        </w:rPr>
+        <w:t xml:space="preserve">, et al. A Novel Method for Rhythmic Imitation of Finger Movements and the Effects of Auditory Stimuli and Feedback. Submitted to </w:t>
+      </w:r>
+      <w:r>
+        <w:rPr>
+          <w:b w:val="0"/>
+          <w:i/>
+          <w:sz w:val="18"/>
+        </w:rPr>
+        <w:t>Scientific Reports</w:t>
+      </w:r>
+      <w:r>
+        <w:rPr>
+          <w:b w:val="0"/>
+          <w:sz w:val="18"/>
+        </w:rPr>
+        <w:t xml:space="preserve"> (Springer Nature).</w:t>
+      </w:r>
+    </w:p>
+    <w:p>
+      <w:pPr>
+        <w:pStyle w:val="Titre1"/>
+        <w:spacing w:before="3"/>
+      </w:pPr>
+      <w:r>
+        <w:rPr>
+          <w:b w:val="0"/>
+          <w:i/>
+          <w:sz w:val="17"/>
+        </w:rPr>
+        <w:t>In Preparation</w:t>
+      </w:r>
+    </w:p>
+    <w:p>
+      <w:pPr>
+        <w:pStyle w:val="Titre1"/>
+        <w:spacing w:before="3"/>
+      </w:pPr>
+      <w:r>
+        <w:rPr>
+          <w:sz w:val="18"/>
+        </w:rPr>
+        <w:t>•  Arslan, P.-P.</w:t>
+      </w:r>
+      <w:r>
+        <w:rPr>
+          <w:b w:val="0"/>
+          <w:sz w:val="18"/>
+        </w:rPr>
+        <w:t xml:space="preserve">, et al. Predicting Continuous Finger Forces from High-Density EMG with AI Regression Models. In preparation (target: </w:t>
+      </w:r>
+      <w:r>
+        <w:rPr>
+          <w:b w:val="0"/>
+          <w:i/>
+          <w:sz w:val="18"/>
+        </w:rPr>
+        <w:t>Nature</w:t>
+      </w:r>
+      <w:r>
+        <w:rPr>
+          <w:b w:val="0"/>
+          <w:sz w:val="18"/>
+        </w:rPr>
+        <w:t>-family journal).</w:t>
+      </w:r>
+    </w:p>
+    <w:p>
+      <w:pPr>
+        <w:pStyle w:val="Titre1"/>
+        <w:spacing w:before="3"/>
+      </w:pPr>
+      <w:r>
+        <w:rPr>
+          <w:sz w:val="18"/>
+        </w:rPr>
+        <w:t>•  Arslan, P.-P.</w:t>
+      </w:r>
+      <w:r>
+        <w:rPr>
+          <w:b w:val="0"/>
+          <w:sz w:val="18"/>
+        </w:rPr>
+        <w:t>, et al. Rhythmic Finger Tapping Performance in Stroke Survivors: Effects of Auditory Stimuli and Feedback. In preparation.</w:t>
+      </w:r>
+    </w:p>
+    <w:p>
+      <w:pPr>
+        <w:pStyle w:val="Titre1"/>
+        <w:spacing w:before="3"/>
+      </w:pPr>
+      <w:r>
+        <w:rPr>
+          <w:i/>
+          <w:sz w:val="18"/>
+        </w:rPr>
+        <w:t>Co-Authored</w:t>
+      </w:r>
+    </w:p>
+    <w:p>
+      <w:pPr>
+        <w:pStyle w:val="Titre1"/>
+        <w:spacing w:before="3"/>
+      </w:pPr>
+      <w:r>
+        <w:rPr>
+          <w:b w:val="0"/>
+          <w:i/>
+          <w:sz w:val="17"/>
+        </w:rPr>
+        <w:t>Peer-Reviewed</w:t>
+      </w:r>
+    </w:p>
+    <w:p>
+      <w:pPr>
+        <w:pStyle w:val="Titre1"/>
+        <w:spacing w:before="3"/>
+      </w:pPr>
+      <w:r>
+        <w:rPr>
+          <w:sz w:val="18"/>
+        </w:rPr>
+        <w:t xml:space="preserve">•  </w:t>
+      </w:r>
+      <w:r>
+        <w:rPr>
+          <w:b w:val="0"/>
+          <w:sz w:val="18"/>
+        </w:rPr>
+        <w:t xml:space="preserve">Dziezuk, E., </w:t>
+      </w:r>
+      <w:r>
+        <w:rPr>
+          <w:sz w:val="18"/>
+        </w:rPr>
+        <w:t>Arslan, P.-P.</w:t>
+      </w:r>
+      <w:r>
+        <w:rPr>
+          <w:b w:val="0"/>
+          <w:sz w:val="18"/>
+        </w:rPr>
+        <w:t xml:space="preserve">, et al. (2025). Mécanismes sensoriels de la récupération de la dextérité manuelle après AVC : protocole d’une étude de cohorte prospective. </w:t>
+      </w:r>
+      <w:r>
+        <w:rPr>
+          <w:b w:val="0"/>
+          <w:i/>
+          <w:sz w:val="18"/>
+        </w:rPr>
+        <w:t>Kinésithérapie Scientifique</w:t>
+      </w:r>
+      <w:r>
+        <w:rPr>
+          <w:b w:val="0"/>
+          <w:sz w:val="18"/>
+        </w:rPr>
+        <w:t>.</w:t>
+      </w:r>
+    </w:p>
+    <w:p>
+      <w:pPr>
+        <w:pStyle w:val="Titre1"/>
+        <w:spacing w:before="3"/>
+      </w:pPr>
+      <w:r>
+        <w:rPr>
+          <w:b w:val="0"/>
+          <w:i/>
+          <w:sz w:val="17"/>
+        </w:rPr>
+        <w:t>Under Review</w:t>
+      </w:r>
+    </w:p>
+    <w:p>
+      <w:pPr>
+        <w:pStyle w:val="Titre1"/>
+        <w:spacing w:before="3"/>
+      </w:pPr>
+      <w:r>
+        <w:rPr>
+          <w:sz w:val="18"/>
+        </w:rPr>
+        <w:t xml:space="preserve">•  </w:t>
+      </w:r>
+      <w:r>
+        <w:rPr>
+          <w:b w:val="0"/>
+          <w:sz w:val="18"/>
+        </w:rPr>
+        <w:t xml:space="preserve">Dziezuk, E., Badr, L., </w:t>
+      </w:r>
+      <w:r>
+        <w:rPr>
+          <w:sz w:val="18"/>
+        </w:rPr>
+        <w:t>Arslan, P.-P.</w:t>
+      </w:r>
+      <w:r>
+        <w:rPr>
+          <w:b w:val="0"/>
+          <w:sz w:val="18"/>
+        </w:rPr>
+        <w:t xml:space="preserve">, et al. A novel haptic stimulation device to improve finger movements – a validation and reliability study in healthy subjects. Submitted to </w:t>
+      </w:r>
+      <w:r>
+        <w:rPr>
+          <w:b w:val="0"/>
+          <w:i/>
+          <w:sz w:val="18"/>
+        </w:rPr>
+        <w:t>IEEE Transactions on Haptics</w:t>
+      </w:r>
+      <w:r>
+        <w:rPr>
+          <w:b w:val="0"/>
+          <w:sz w:val="18"/>
+        </w:rPr>
+        <w:t xml:space="preserve"> (Feb. 2026).</w:t>
+      </w:r>
+    </w:p>
+    <w:p>
+      <w:pPr>
+        <w:pStyle w:val="Titre1"/>
+        <w:spacing w:before="3"/>
+      </w:pPr>
+      <w:r>
+        <w:rPr>
+          <w:b w:val="0"/>
+          <w:i/>
+          <w:sz w:val="17"/>
+        </w:rPr>
+        <w:t>In Preparation</w:t>
+      </w:r>
+    </w:p>
+    <w:p>
+      <w:pPr>
+        <w:pStyle w:val="Titre1"/>
+        <w:spacing w:before="3"/>
+      </w:pPr>
+      <w:r>
+        <w:rPr>
+          <w:sz w:val="18"/>
+        </w:rPr>
+        <w:t xml:space="preserve">•  </w:t>
+      </w:r>
+      <w:r>
+        <w:rPr>
+          <w:b w:val="0"/>
+          <w:sz w:val="18"/>
+        </w:rPr>
+        <w:t xml:space="preserve">Duan, Z., </w:t>
+      </w:r>
+      <w:r>
+        <w:rPr>
+          <w:sz w:val="18"/>
+        </w:rPr>
+        <w:t>Arslan, P.-P.</w:t>
+      </w:r>
+      <w:r>
+        <w:rPr>
+          <w:b w:val="0"/>
+          <w:sz w:val="18"/>
+        </w:rPr>
+        <w:t>, Plantin, J., Lindberg, P. G., Wang, R. Motor Unit Coherence and Discharge Behavior During Single-Finger Isometric Contractions After Stroke. In preparation.</w:t>
+      </w:r>
+    </w:p>
+    <w:p>
+      <w:pPr>
+        <w:pStyle w:val="Corpsdetexte"/>
+      </w:pPr>
+    </w:p>
+    <w:p>
+      <w:pPr>
+        <w:pStyle w:val="Titre1"/>
+        <w:pageBreakBefore/>
+        <w:pBdr>
+          <w:bottom w:val="single" w:sz="6" w:space="1" w:color="auto"/>
+        </w:pBdr>
+        <w:spacing w:before="3"/>
+      </w:pPr>
+      <w:r>
+        <w:lastRenderedPageBreak/>
+        <w:t>EDUCATION</w:t>
+      </w:r>
+    </w:p>
+    <w:p>
+      <w:pPr>
         <w:pStyle w:val="Titre2"/>
         <w:tabs>
           <w:tab w:val="left" w:pos="9672"/>
@@ -127,242 +851,6 @@
       </w:pPr>
       <w:r>
         <w:rPr>
-          <w:b w:val="0"/>
-          <w:i/>
-          <w:noProof/>
-        </w:rPr>
-        <mc:AlternateContent>
-          <mc:Choice Requires="wpg">
-            <w:drawing>
-              <wp:anchor distT="0" distB="0" distL="0" distR="0" simplePos="0" relativeHeight="251659264" behindDoc="0" locked="0" layoutInCell="1" allowOverlap="1" wp14:anchorId="39F237AD" wp14:editId="1C4EC9B5">
-                <wp:simplePos x="0" y="0"/>
-                <wp:positionH relativeFrom="page">
-                  <wp:posOffset>449580</wp:posOffset>
-                </wp:positionH>
-                <wp:positionV relativeFrom="paragraph">
-                  <wp:posOffset>0</wp:posOffset>
-                </wp:positionV>
-                <wp:extent cx="6645275" cy="57785"/>
-                <wp:effectExtent l="0" t="0" r="0" b="0"/>
-                <wp:wrapNone/>
-                <wp:docPr id="1" name="Group 1"/>
-                <wp:cNvGraphicFramePr>
-                  <a:graphicFrameLocks xmlns:a="http://schemas.openxmlformats.org/drawingml/2006/main"/>
-                </wp:cNvGraphicFramePr>
-                <a:graphic xmlns:a="http://schemas.openxmlformats.org/drawingml/2006/main">
-                  <a:graphicData uri="http://schemas.microsoft.com/office/word/2010/wordprocessingGroup">
-                    <wpg:wgp>
-                      <wpg:cNvGrpSpPr>
-                        <a:grpSpLocks/>
-                      </wpg:cNvGrpSpPr>
-                      <wpg:grpSpPr>
-                        <a:xfrm>
-                          <a:off x="0" y="0"/>
-                          <a:ext cx="6645275" cy="57785"/>
-                          <a:chOff x="0" y="0"/>
-                          <a:chExt cx="6645275" cy="57785"/>
-                        </a:xfrm>
-                      </wpg:grpSpPr>
-                      <wps:wsp>
-                        <wps:cNvPr id="2" name="Graphic 2"/>
-                        <wps:cNvSpPr/>
-                        <wps:spPr>
-                          <a:xfrm>
-                            <a:off x="0" y="52705"/>
-                            <a:ext cx="6645275" cy="1270"/>
-                          </a:xfrm>
-                          <a:custGeom>
-                            <a:avLst/>
-                            <a:gdLst/>
-                            <a:ahLst/>
-                            <a:cxnLst/>
-                            <a:rect l="l" t="t" r="r" b="b"/>
-                            <a:pathLst>
-                              <a:path w="6645275">
-                                <a:moveTo>
-                                  <a:pt x="6645275" y="0"/>
-                                </a:moveTo>
-                                <a:lnTo>
-                                  <a:pt x="0" y="0"/>
-                                </a:lnTo>
-                              </a:path>
-                            </a:pathLst>
-                          </a:custGeom>
-                          <a:ln w="9525">
-                            <a:solidFill>
-                              <a:srgbClr val="000000"/>
-                            </a:solidFill>
-                            <a:prstDash val="solid"/>
-                          </a:ln>
-                        </wps:spPr>
-                        <wps:bodyPr wrap="square" lIns="0" tIns="0" rIns="0" bIns="0" rtlCol="0">
-                          <a:prstTxWarp prst="textNoShape">
-                            <a:avLst/>
-                          </a:prstTxWarp>
-                          <a:noAutofit/>
-                        </wps:bodyPr>
-                      </wps:wsp>
-                      <wps:wsp>
-                        <wps:cNvPr id="3" name="Graphic 3"/>
-                        <wps:cNvSpPr/>
-                        <wps:spPr>
-                          <a:xfrm>
-                            <a:off x="0" y="0"/>
-                            <a:ext cx="6645275" cy="38100"/>
-                          </a:xfrm>
-                          <a:custGeom>
-                            <a:avLst/>
-                            <a:gdLst/>
-                            <a:ahLst/>
-                            <a:cxnLst/>
-                            <a:rect l="l" t="t" r="r" b="b"/>
-                            <a:pathLst>
-                              <a:path w="6645275" h="38100">
-                                <a:moveTo>
-                                  <a:pt x="0" y="38100"/>
-                                </a:moveTo>
-                                <a:lnTo>
-                                  <a:pt x="6645275" y="38100"/>
-                                </a:lnTo>
-                                <a:lnTo>
-                                  <a:pt x="6645275" y="0"/>
-                                </a:lnTo>
-                                <a:lnTo>
-                                  <a:pt x="0" y="0"/>
-                                </a:lnTo>
-                                <a:lnTo>
-                                  <a:pt x="0" y="38100"/>
-                                </a:lnTo>
-                                <a:close/>
-                              </a:path>
-                            </a:pathLst>
-                          </a:custGeom>
-                          <a:solidFill>
-                            <a:srgbClr val="000000"/>
-                          </a:solidFill>
-                        </wps:spPr>
-                        <wps:bodyPr wrap="square" lIns="0" tIns="0" rIns="0" bIns="0" rtlCol="0">
-                          <a:prstTxWarp prst="textNoShape">
-                            <a:avLst/>
-                          </a:prstTxWarp>
-                          <a:noAutofit/>
-                        </wps:bodyPr>
-                      </wps:wsp>
-                      <wps:wsp>
-                        <wps:cNvPr id="4" name="Graphic 4"/>
-                        <wps:cNvSpPr/>
-                        <wps:spPr>
-                          <a:xfrm>
-                            <a:off x="0" y="52705"/>
-                            <a:ext cx="6645275" cy="1270"/>
-                          </a:xfrm>
-                          <a:custGeom>
-                            <a:avLst/>
-                            <a:gdLst/>
-                            <a:ahLst/>
-                            <a:cxnLst/>
-                            <a:rect l="l" t="t" r="r" b="b"/>
-                            <a:pathLst>
-                              <a:path w="6645275">
-                                <a:moveTo>
-                                  <a:pt x="6645275" y="0"/>
-                                </a:moveTo>
-                                <a:lnTo>
-                                  <a:pt x="0" y="0"/>
-                                </a:lnTo>
-                              </a:path>
-                            </a:pathLst>
-                          </a:custGeom>
-                          <a:ln w="9525">
-                            <a:solidFill>
-                              <a:srgbClr val="000000"/>
-                            </a:solidFill>
-                            <a:prstDash val="solid"/>
-                          </a:ln>
-                        </wps:spPr>
-                        <wps:bodyPr wrap="square" lIns="0" tIns="0" rIns="0" bIns="0" rtlCol="0">
-                          <a:prstTxWarp prst="textNoShape">
-                            <a:avLst/>
-                          </a:prstTxWarp>
-                          <a:noAutofit/>
-                        </wps:bodyPr>
-                      </wps:wsp>
-                      <wps:wsp>
-                        <wps:cNvPr id="5" name="Graphic 5"/>
-                        <wps:cNvSpPr/>
-                        <wps:spPr>
-                          <a:xfrm>
-                            <a:off x="0" y="0"/>
-                            <a:ext cx="6645275" cy="38100"/>
-                          </a:xfrm>
-                          <a:custGeom>
-                            <a:avLst/>
-                            <a:gdLst/>
-                            <a:ahLst/>
-                            <a:cxnLst/>
-                            <a:rect l="l" t="t" r="r" b="b"/>
-                            <a:pathLst>
-                              <a:path w="6645275" h="38100">
-                                <a:moveTo>
-                                  <a:pt x="0" y="38100"/>
-                                </a:moveTo>
-                                <a:lnTo>
-                                  <a:pt x="6645275" y="38100"/>
-                                </a:lnTo>
-                                <a:lnTo>
-                                  <a:pt x="6645275" y="0"/>
-                                </a:lnTo>
-                                <a:lnTo>
-                                  <a:pt x="0" y="0"/>
-                                </a:lnTo>
-                                <a:lnTo>
-                                  <a:pt x="0" y="38100"/>
-                                </a:lnTo>
-                                <a:close/>
-                              </a:path>
-                            </a:pathLst>
-                          </a:custGeom>
-                          <a:solidFill>
-                            <a:srgbClr val="000000"/>
-                          </a:solidFill>
-                        </wps:spPr>
-                        <wps:bodyPr wrap="square" lIns="0" tIns="0" rIns="0" bIns="0" rtlCol="0">
-                          <a:prstTxWarp prst="textNoShape">
-                            <a:avLst/>
-                          </a:prstTxWarp>
-                          <a:noAutofit/>
-                        </wps:bodyPr>
-                      </wps:wsp>
-                    </wpg:wgp>
-                  </a:graphicData>
-                </a:graphic>
-              </wp:anchor>
-            </w:drawing>
-          </mc:Choice>
-          <mc:Fallback>
-            <w:pict>
-              <v:group w14:anchorId="4C2551A6" id="Group 1" o:spid="_x0000_s1026" style="position:absolute;margin-left:35.4pt;margin-top:0;width:523.25pt;height:4.55pt;z-index:251659264;mso-wrap-distance-left:0;mso-wrap-distance-right:0;mso-position-horizontal-relative:page" coordsize="66452,577" o:gfxdata="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">
-                <v:shape id="Graphic 2" o:spid="_x0000_s1027" style="position:absolute;top:527;width:66452;height:12;visibility:visible;mso-wrap-style:square;v-text-anchor:top" coordsize="6645275,1270" o:gfxdata="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" path="m6645275,l,e" filled="f">
-                  <v:path arrowok="t"/>
-                </v:shape>
-                <v:shape id="Graphic 3" o:spid="_x0000_s1028" style="position:absolute;width:66452;height:381;visibility:visible;mso-wrap-style:square;v-text-anchor:top" coordsize="6645275,38100" o:gfxdata="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" path="m,38100r6645275,l6645275,,,,,38100xe" fillcolor="black" stroked="f">
-                  <v:path arrowok="t"/>
-                </v:shape>
-                <v:shape id="Graphic 4" o:spid="_x0000_s1029" style="position:absolute;top:527;width:66452;height:12;visibility:visible;mso-wrap-style:square;v-text-anchor:top" coordsize="6645275,1270" o:gfxdata="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" path="m6645275,l,e" filled="f">
-                  <v:path arrowok="t"/>
-                </v:shape>
-                <v:shape id="Graphic 5" o:spid="_x0000_s1030" style="position:absolute;width:66452;height:381;visibility:visible;mso-wrap-style:square;v-text-anchor:top" coordsize="6645275,38100" o:gfxdata="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" path="m,38100r6645275,l6645275,,,,,38100xe" fillcolor="black" stroked="f">
-                  <v:path arrowok="t"/>
-                </v:shape>
-                <w10:wrap anchorx="page"/>
-              </v:group>
-            </w:pict>
-          </mc:Fallback>
-        </mc:AlternateContent>
-      </w:r>
-      <w:proofErr w:type="gramStart"/>
-      <w:r>
-        <w:rPr>
           <w:w w:val="120"/>
         </w:rPr>
         <w:t>Master</w:t>
@@ -380,7 +868,6 @@
         </w:rPr>
         <w:t>Degree</w:t>
       </w:r>
-      <w:proofErr w:type="gramEnd"/>
       <w:r>
         <w:rPr>
           <w:spacing w:val="7"/>
@@ -575,7 +1062,6 @@
       </w:r>
       <w:r>
         <w:rPr>
-          <w:rFonts w:ascii="Times New Roman" w:hAnsi="Times New Roman"/>
           <w:b w:val="0"/>
         </w:rPr>
         <w:tab/>
@@ -708,25 +1194,7 @@
           <w:w w:val="110"/>
           <w:sz w:val="18"/>
         </w:rPr>
-        <w:t xml:space="preserve">Graphics, Advanced </w:t>
-      </w:r>
-      <w:proofErr w:type="spellStart"/>
-      <w:r>
-        <w:rPr>
-          <w:i/>
-          <w:w w:val="110"/>
-          <w:sz w:val="18"/>
-        </w:rPr>
-        <w:t>electonic</w:t>
-      </w:r>
-      <w:proofErr w:type="spellEnd"/>
-      <w:r>
-        <w:rPr>
-          <w:i/>
-          <w:w w:val="110"/>
-          <w:sz w:val="18"/>
-        </w:rPr>
-        <w:t xml:space="preserve"> and mechanic, Soft and Active Matter</w:t>
+        <w:t>Graphics, Advanced electonic and mechanic, Soft and Active Matter</w:t>
       </w:r>
     </w:p>
     <w:p>
@@ -743,7 +1211,6 @@
       <w:r>
         <w:rPr>
           <w:b/>
-          <w:color w:val="202020"/>
           <w:spacing w:val="-2"/>
           <w:w w:val="120"/>
           <w:sz w:val="18"/>
@@ -753,7 +1220,6 @@
       <w:r>
         <w:rPr>
           <w:b/>
-          <w:color w:val="202020"/>
           <w:spacing w:val="-5"/>
           <w:w w:val="120"/>
           <w:sz w:val="18"/>
@@ -764,7 +1230,6 @@
         <w:rPr>
           <w:b/>
           <w:i/>
-          <w:color w:val="202020"/>
           <w:spacing w:val="-2"/>
           <w:w w:val="120"/>
           <w:sz w:val="18"/>
@@ -775,7 +1240,6 @@
         <w:rPr>
           <w:b/>
           <w:i/>
-          <w:color w:val="202020"/>
           <w:spacing w:val="-5"/>
           <w:w w:val="120"/>
           <w:sz w:val="18"/>
@@ -786,7 +1250,6 @@
         <w:rPr>
           <w:b/>
           <w:i/>
-          <w:color w:val="202020"/>
           <w:spacing w:val="-2"/>
           <w:w w:val="120"/>
           <w:sz w:val="18"/>
@@ -797,7 +1260,6 @@
         <w:rPr>
           <w:b/>
           <w:i/>
-          <w:color w:val="202020"/>
           <w:spacing w:val="-7"/>
           <w:w w:val="120"/>
           <w:sz w:val="18"/>
@@ -808,7 +1270,6 @@
         <w:rPr>
           <w:b/>
           <w:i/>
-          <w:color w:val="202020"/>
           <w:spacing w:val="-2"/>
           <w:w w:val="120"/>
           <w:sz w:val="18"/>
@@ -819,14 +1280,12 @@
         <w:rPr>
           <w:b/>
           <w:i/>
-          <w:color w:val="202020"/>
           <w:sz w:val="18"/>
         </w:rPr>
         <w:tab/>
       </w:r>
       <w:r>
         <w:rPr>
-          <w:color w:val="202020"/>
           <w:spacing w:val="-2"/>
           <w:w w:val="120"/>
           <w:sz w:val="18"/>
@@ -851,7 +1310,6 @@
       <w:r>
         <w:rPr>
           <w:i/>
-          <w:color w:val="202020"/>
           <w:w w:val="110"/>
           <w:sz w:val="18"/>
         </w:rPr>
@@ -860,17 +1318,14 @@
       <w:r>
         <w:rPr>
           <w:i/>
-          <w:color w:val="202020"/>
           <w:w w:val="110"/>
           <w:sz w:val="18"/>
         </w:rPr>
         <w:t xml:space="preserve">    </w:t>
       </w:r>
-      <w:proofErr w:type="gramStart"/>
-      <w:r>
-        <w:rPr>
-          <w:i/>
-          <w:color w:val="202020"/>
+      <w:r>
+        <w:rPr>
+          <w:i/>
           <w:sz w:val="18"/>
         </w:rPr>
         <w:tab/>
@@ -878,7 +1333,6 @@
       <w:r>
         <w:rPr>
           <w:i/>
-          <w:color w:val="202020"/>
           <w:sz w:val="18"/>
         </w:rPr>
         <w:t xml:space="preserve">  </w:t>
@@ -886,26 +1340,14 @@
       <w:r>
         <w:rPr>
           <w:i/>
-          <w:color w:val="202020"/>
-          <w:w w:val="110"/>
-          <w:sz w:val="18"/>
-        </w:rPr>
-        <w:t>Sept</w:t>
-      </w:r>
-      <w:proofErr w:type="gramEnd"/>
-      <w:r>
-        <w:rPr>
-          <w:i/>
-          <w:color w:val="202020"/>
-          <w:w w:val="110"/>
-          <w:sz w:val="18"/>
-        </w:rPr>
-        <w:t xml:space="preserve"> 2018 – Dec 2018 GPA: 3.96 </w:t>
-      </w:r>
-      <w:r>
-        <w:rPr>
-          <w:i/>
-          <w:color w:val="202020"/>
+          <w:w w:val="110"/>
+          <w:sz w:val="18"/>
+        </w:rPr>
+        <w:t xml:space="preserve">Sept 2018 – Dec 2018 GPA: 3.96 </w:t>
+      </w:r>
+      <w:r>
+        <w:rPr>
+          <w:i/>
           <w:sz w:val="18"/>
         </w:rPr>
         <w:t xml:space="preserve">/ </w:t>
@@ -913,7 +1355,6 @@
       <w:r>
         <w:rPr>
           <w:i/>
-          <w:color w:val="202020"/>
           <w:w w:val="110"/>
           <w:sz w:val="18"/>
         </w:rPr>
@@ -935,629 +1376,72 @@
     </w:p>
     <w:p>
       <w:pPr>
+        <w:pStyle w:val="Titre1"/>
+        <w:pBdr>
+          <w:bottom w:val="single" w:sz="6" w:space="1" w:color="auto"/>
+        </w:pBdr>
+        <w:spacing w:before="59"/>
+      </w:pPr>
+      <w:r>
+        <w:t>SKILLS</w:t>
+      </w:r>
+    </w:p>
+    <w:p>
+      <w:pPr>
+        <w:pStyle w:val="Corpsdetexte"/>
+        <w:spacing w:before="168"/>
+        <w:ind w:left="14" w:right="68" w:firstLine="0"/>
+      </w:pPr>
+      <w:r>
+        <w:t>Machine Learning &amp; AI: PyTorch  ·  TensorFlow / Keras  ·  scikit-learn  ·  Transformer architectures  ·  CNN, GRU, LSTM  ·  Large Language Models  ·  Retrieval-Augmented Generation (RAG)  ·  Prompt engineering &amp; multi-agent orchestration   ·  Signal processing &amp; neural decoding  ·  Real-time inference pipelines</w:t>
+      </w:r>
+    </w:p>
+    <w:p>
+      <w:pPr>
+        <w:pStyle w:val="Corpsdetexte"/>
+        <w:spacing w:before="168"/>
+        <w:ind w:left="14" w:right="68" w:firstLine="0"/>
+      </w:pPr>
+      <w:r>
+        <w:t>Software Engineering: Python  ·  TypeScript / JavaScript (React, Next.js, Node.js)  ·  C#  ·  MATLAB, R  ·  REST APIs  ·  Git, Docker, Linux  ·  Unity  ·  Arduino, Raspberry Pi, embedded firmware  ·  CAD &amp; rapid prototyping</w:t>
+      </w:r>
+    </w:p>
+    <w:p>
+      <w:pPr>
+        <w:spacing w:before="59"/>
+        <w:ind w:left="14"/>
+        <w:rPr>
+          <w:sz w:val="20"/>
+        </w:rPr>
+      </w:pPr>
+      <w:r>
+        <w:rPr>
+          <w:sz w:val="18"/>
+        </w:rPr>
+        <w:t>Languages: French (native), English (fluent, academic writing &amp; presentations), Spanish (conversational)</w:t>
+      </w:r>
+    </w:p>
+    <w:p>
+      <w:pPr>
+        <w:pStyle w:val="Corpsdetexte"/>
+      </w:pPr>
+    </w:p>
+    <w:p>
+      <w:pPr>
+        <w:pStyle w:val="Titre1"/>
+        <w:pBdr>
+          <w:bottom w:val="single" w:sz="6" w:space="1" w:color="auto"/>
+        </w:pBdr>
         <w:spacing w:before="3"/>
       </w:pPr>
       <w:r>
-        <w:rPr>
-          <w:b/>
-        </w:rPr>
-        <w:t>RESEARCH EXPERIENCE</w:t>
-      </w:r>
-    </w:p>
-    <w:p>
-      <w:pPr>
-        <w:spacing w:before="3"/>
-      </w:pPr>
-      <w:r>
-        <w:rPr>
-          <w:b/>
-          <w:sz w:val="20"/>
-        </w:rPr>
-        <w:t>Visiting Research Student — MIT Media Lab (Tangible Media Group)</w:t>
-      </w:r>
-      <w:r>
-        <w:tab/>
-      </w:r>
-      <w:r>
-        <w:tab/>
-      </w:r>
-      <w:r>
-        <w:tab/>
-      </w:r>
-      <w:r>
-        <w:tab/>
-        <w:t xml:space="preserve">   </w:t>
-      </w:r>
-      <w:r>
-        <w:rPr>
-          <w:sz w:val="18"/>
-        </w:rPr>
-        <w:t>Cambridge, MA, USA</w:t>
-      </w:r>
-    </w:p>
-    <w:p>
-      <w:pPr>
-        <w:spacing w:before="3"/>
-      </w:pPr>
-      <w:r>
-        <w:rPr>
-          <w:sz w:val="18"/>
-        </w:rPr>
-        <w:t xml:space="preserve">• Designing embodied prompting interfaces for creative thinking with LLMs (Tangible Co-Ideation </w:t>
-      </w:r>
-      <w:proofErr w:type="gramStart"/>
-      <w:r>
-        <w:rPr>
-          <w:sz w:val="18"/>
-        </w:rPr>
-        <w:t>project)</w:t>
-      </w:r>
-      <w:r>
-        <w:rPr>
-          <w:sz w:val="18"/>
-        </w:rPr>
-        <w:t xml:space="preserve"> </w:t>
-      </w:r>
-      <w:r>
-        <w:rPr>
-          <w:sz w:val="18"/>
-        </w:rPr>
-        <w:t xml:space="preserve">  </w:t>
-      </w:r>
-      <w:proofErr w:type="gramEnd"/>
-      <w:r>
-        <w:rPr>
-          <w:sz w:val="18"/>
-        </w:rPr>
-        <w:t xml:space="preserve">    Jan 2026 – Present</w:t>
-      </w:r>
-    </w:p>
-    <w:p>
-      <w:pPr>
-        <w:spacing w:before="3"/>
-      </w:pPr>
-      <w:r>
-        <w:rPr>
-          <w:sz w:val="18"/>
-        </w:rPr>
-        <w:t xml:space="preserve">• Coursework: Interaction Intelligence — </w:t>
-      </w:r>
-      <w:proofErr w:type="spellStart"/>
-      <w:r>
-        <w:rPr>
-          <w:sz w:val="18"/>
-        </w:rPr>
-        <w:t>Teleabsence</w:t>
-      </w:r>
-      <w:proofErr w:type="spellEnd"/>
-      <w:r>
-        <w:rPr>
-          <w:sz w:val="18"/>
-        </w:rPr>
-        <w:t xml:space="preserve"> (Prof. H. Ishii), Design Intelligence (Prof. M. Coelho)</w:t>
-      </w:r>
-    </w:p>
-    <w:p>
-      <w:pPr>
-        <w:spacing w:before="3"/>
-      </w:pPr>
-      <w:r>
-        <w:rPr>
-          <w:sz w:val="18"/>
-        </w:rPr>
-        <w:t>• Winner, Connect track — MIT Hard Mode: Hardware AI Hackathon 2026 (</w:t>
-      </w:r>
-      <w:proofErr w:type="spellStart"/>
-      <w:r>
-        <w:rPr>
-          <w:sz w:val="18"/>
-        </w:rPr>
-        <w:t>IPheromone</w:t>
-      </w:r>
-      <w:proofErr w:type="spellEnd"/>
-      <w:r>
-        <w:rPr>
-          <w:sz w:val="18"/>
-        </w:rPr>
-        <w:t>)</w:t>
-      </w:r>
-    </w:p>
-    <w:p>
-      <w:pPr>
-        <w:spacing w:before="3"/>
-      </w:pPr>
-    </w:p>
-    <w:p>
-      <w:pPr>
-        <w:spacing w:before="3"/>
-        <w:rPr>
-          <w:sz w:val="18"/>
-          <w:szCs w:val="18"/>
-        </w:rPr>
-      </w:pPr>
-      <w:r>
-        <w:rPr>
-          <w:b/>
-          <w:sz w:val="20"/>
-        </w:rPr>
-        <w:t xml:space="preserve">Ph.D. Researcher — </w:t>
-      </w:r>
-      <w:r>
-        <w:rPr>
-          <w:b/>
-          <w:sz w:val="20"/>
-        </w:rPr>
-        <w:t xml:space="preserve">Institute </w:t>
-      </w:r>
-      <w:r>
-        <w:rPr>
-          <w:b/>
-          <w:sz w:val="20"/>
-        </w:rPr>
-        <w:t>for Future Technologies / Neuroscience Institute Paris</w:t>
-      </w:r>
-      <w:r>
-        <w:rPr>
-          <w:b/>
-          <w:sz w:val="20"/>
-        </w:rPr>
-        <w:t xml:space="preserve">                          </w:t>
-      </w:r>
-      <w:proofErr w:type="spellStart"/>
-      <w:r>
-        <w:rPr>
-          <w:sz w:val="18"/>
-          <w:szCs w:val="18"/>
-        </w:rPr>
-        <w:t>Paris</w:t>
-      </w:r>
-      <w:proofErr w:type="spellEnd"/>
-      <w:r>
-        <w:rPr>
-          <w:sz w:val="18"/>
-          <w:szCs w:val="18"/>
-        </w:rPr>
-        <w:t>, France</w:t>
-      </w:r>
-    </w:p>
-    <w:p>
-      <w:pPr>
-        <w:spacing w:before="3"/>
-        <w:rPr>
-          <w:sz w:val="18"/>
-          <w:szCs w:val="18"/>
-        </w:rPr>
-      </w:pPr>
-      <w:r>
-        <w:rPr>
-          <w:sz w:val="18"/>
-          <w:szCs w:val="18"/>
-        </w:rPr>
-        <w:t xml:space="preserve">Supervisors: Dr. Xiao </w:t>
-      </w:r>
-      <w:proofErr w:type="spellStart"/>
-      <w:r>
-        <w:rPr>
-          <w:sz w:val="18"/>
-          <w:szCs w:val="18"/>
-        </w:rPr>
-        <w:t>Xiao</w:t>
-      </w:r>
-      <w:proofErr w:type="spellEnd"/>
-      <w:r>
-        <w:rPr>
-          <w:sz w:val="18"/>
-          <w:szCs w:val="18"/>
-        </w:rPr>
-        <w:t xml:space="preserve"> (Institute for Future Technologies / MIT), Dr. Pavel Lindberg (</w:t>
-      </w:r>
-      <w:proofErr w:type="gramStart"/>
-      <w:r>
-        <w:rPr>
-          <w:sz w:val="18"/>
-          <w:szCs w:val="18"/>
-        </w:rPr>
-        <w:t>INSERM)</w:t>
-      </w:r>
-      <w:r>
-        <w:rPr>
-          <w:sz w:val="18"/>
-          <w:szCs w:val="18"/>
-        </w:rPr>
-        <w:t xml:space="preserve"> </w:t>
-      </w:r>
-      <w:r>
-        <w:rPr>
-          <w:sz w:val="18"/>
-          <w:szCs w:val="18"/>
-        </w:rPr>
-        <w:t xml:space="preserve">  </w:t>
-      </w:r>
-      <w:proofErr w:type="gramEnd"/>
-      <w:r>
-        <w:rPr>
-          <w:sz w:val="18"/>
-          <w:szCs w:val="18"/>
-        </w:rPr>
-        <w:t xml:space="preserve">                         </w:t>
-      </w:r>
-      <w:r>
-        <w:rPr>
-          <w:sz w:val="18"/>
-          <w:szCs w:val="18"/>
-        </w:rPr>
-        <w:t>2023 – Present</w:t>
-      </w:r>
-    </w:p>
-    <w:p>
-      <w:pPr>
-        <w:spacing w:before="3"/>
-        <w:rPr>
-          <w:sz w:val="18"/>
-          <w:szCs w:val="18"/>
-        </w:rPr>
-      </w:pPr>
-      <w:r>
-        <w:rPr>
-          <w:sz w:val="18"/>
-          <w:szCs w:val="18"/>
-        </w:rPr>
-        <w:t xml:space="preserve">• </w:t>
-      </w:r>
-      <w:proofErr w:type="spellStart"/>
-      <w:r>
-        <w:rPr>
-          <w:sz w:val="18"/>
-          <w:szCs w:val="18"/>
-        </w:rPr>
-        <w:t>ReTouche</w:t>
-      </w:r>
-      <w:proofErr w:type="spellEnd"/>
-      <w:r>
-        <w:rPr>
-          <w:sz w:val="18"/>
-          <w:szCs w:val="18"/>
-        </w:rPr>
-        <w:t>: Designed piano learning system with embodied feedback; validated via comparative study. ACM CHI 2026</w:t>
-      </w:r>
-    </w:p>
-    <w:p>
-      <w:pPr>
-        <w:spacing w:before="3"/>
-      </w:pPr>
-      <w:r>
-        <w:rPr>
-          <w:sz w:val="18"/>
-        </w:rPr>
-        <w:t>• Rhythm Karaoke: Built rhythmic timing engine for fine motor precision; submitted to Scientific Reports (Springer Nature)</w:t>
-      </w:r>
-    </w:p>
-    <w:p>
-      <w:pPr>
-        <w:spacing w:before="3"/>
-      </w:pPr>
-      <w:r>
-        <w:rPr>
-          <w:sz w:val="18"/>
-        </w:rPr>
-        <w:t>• HD-EMG &amp; AI: Finger-force decoding from 224-channel HD-EMG using Transformer (FITLight) and GRU architectures</w:t>
-      </w:r>
-    </w:p>
-    <w:p>
-      <w:pPr>
-        <w:spacing w:before="3"/>
-      </w:pPr>
-      <w:r>
-        <w:rPr>
-          <w:sz w:val="18"/>
-        </w:rPr>
-        <w:t>• Tangible Co-Ideation (embodied prompting): Finalist, ACM DIS 2026 Student Design Competition; submitted to ACM UIST 2026</w:t>
-      </w:r>
-    </w:p>
-    <w:p>
-      <w:pPr>
-        <w:spacing w:before="3"/>
-      </w:pPr>
-      <w:r>
-        <w:rPr>
-          <w:sz w:val="18"/>
-        </w:rPr>
-        <w:t xml:space="preserve">• 2nd-author contributions across papers: TMS experiments, haptic feedback, embedded dev., UX interfaces</w:t>
-      </w:r>
-    </w:p>
-    <w:p>
-      <w:pPr>
-        <w:spacing w:before="3"/>
-      </w:pPr>
-      <w:r>
-        <w:rPr>
-          <w:sz w:val="18"/>
-        </w:rPr>
-        <w:t xml:space="preserve">• Teaching: Web Development, AI with </w:t>
-      </w:r>
-      <w:proofErr w:type="gramStart"/>
-      <w:r>
-        <w:rPr>
-          <w:sz w:val="18"/>
-        </w:rPr>
-        <w:t>Bio-sensors</w:t>
-      </w:r>
-      <w:proofErr w:type="gramEnd"/>
-      <w:r>
-        <w:rPr>
-          <w:sz w:val="18"/>
-        </w:rPr>
-        <w:t>, Research Workshops for Master students</w:t>
-      </w:r>
-    </w:p>
-    <w:p>
-      <w:pPr>
-        <w:spacing w:before="3"/>
-      </w:pPr>
-    </w:p>
-    <w:p>
-      <w:pPr>
-        <w:pStyle w:val="Titre1"/>
-        <w:spacing w:before="3"/>
-      </w:pPr>
-      <w:r>
-        <w:rPr>
-          <w:noProof/>
-        </w:rPr>
-        <mc:AlternateContent>
-          <mc:Choice Requires="wpg">
-            <w:drawing>
-              <wp:anchor distT="0" distB="0" distL="0" distR="0" simplePos="0" relativeHeight="15729152" behindDoc="0" locked="0" layoutInCell="1" allowOverlap="1" wp14:anchorId="41F27642" wp14:editId="0DAFA077">
-                <wp:simplePos x="0" y="0"/>
-                <wp:positionH relativeFrom="page">
-                  <wp:posOffset>457200</wp:posOffset>
-                </wp:positionH>
-                <wp:positionV relativeFrom="paragraph">
-                  <wp:posOffset>178159</wp:posOffset>
-                </wp:positionV>
-                <wp:extent cx="6645275" cy="57785"/>
-                <wp:effectExtent l="0" t="0" r="0" b="0"/>
-                <wp:wrapNone/>
-                <wp:docPr id="6" name="Group 6"/>
-                <wp:cNvGraphicFramePr>
-                  <a:graphicFrameLocks xmlns:a="http://schemas.openxmlformats.org/drawingml/2006/main"/>
-                </wp:cNvGraphicFramePr>
-                <a:graphic xmlns:a="http://schemas.openxmlformats.org/drawingml/2006/main">
-                  <a:graphicData uri="http://schemas.microsoft.com/office/word/2010/wordprocessingGroup">
-                    <wpg:wgp>
-                      <wpg:cNvGrpSpPr>
-                        <a:grpSpLocks/>
-                      </wpg:cNvGrpSpPr>
-                      <wpg:grpSpPr>
-                        <a:xfrm>
-                          <a:off x="0" y="0"/>
-                          <a:ext cx="6645275" cy="57785"/>
-                          <a:chOff x="0" y="0"/>
-                          <a:chExt cx="6645275" cy="57785"/>
-                        </a:xfrm>
-                      </wpg:grpSpPr>
-                      <wps:wsp>
-                        <wps:cNvPr id="7" name="Graphic 7"/>
-                        <wps:cNvSpPr/>
-                        <wps:spPr>
-                          <a:xfrm>
-                            <a:off x="0" y="52705"/>
-                            <a:ext cx="6645275" cy="1270"/>
-                          </a:xfrm>
-                          <a:custGeom>
-                            <a:avLst/>
-                            <a:gdLst/>
-                            <a:ahLst/>
-                            <a:cxnLst/>
-                            <a:rect l="l" t="t" r="r" b="b"/>
-                            <a:pathLst>
-                              <a:path w="6645275">
-                                <a:moveTo>
-                                  <a:pt x="6645275" y="0"/>
-                                </a:moveTo>
-                                <a:lnTo>
-                                  <a:pt x="0" y="0"/>
-                                </a:lnTo>
-                              </a:path>
-                            </a:pathLst>
-                          </a:custGeom>
-                          <a:ln w="9525">
-                            <a:solidFill>
-                              <a:srgbClr val="000000"/>
-                            </a:solidFill>
-                            <a:prstDash val="solid"/>
-                          </a:ln>
-                        </wps:spPr>
-                        <wps:bodyPr wrap="square" lIns="0" tIns="0" rIns="0" bIns="0" rtlCol="0">
-                          <a:prstTxWarp prst="textNoShape">
-                            <a:avLst/>
-                          </a:prstTxWarp>
-                          <a:noAutofit/>
-                        </wps:bodyPr>
-                      </wps:wsp>
-                      <wps:wsp>
-                        <wps:cNvPr id="8" name="Graphic 8"/>
-                        <wps:cNvSpPr/>
-                        <wps:spPr>
-                          <a:xfrm>
-                            <a:off x="0" y="0"/>
-                            <a:ext cx="6645275" cy="38100"/>
-                          </a:xfrm>
-                          <a:custGeom>
-                            <a:avLst/>
-                            <a:gdLst/>
-                            <a:ahLst/>
-                            <a:cxnLst/>
-                            <a:rect l="l" t="t" r="r" b="b"/>
-                            <a:pathLst>
-                              <a:path w="6645275" h="38100">
-                                <a:moveTo>
-                                  <a:pt x="0" y="38100"/>
-                                </a:moveTo>
-                                <a:lnTo>
-                                  <a:pt x="6645275" y="38100"/>
-                                </a:lnTo>
-                                <a:lnTo>
-                                  <a:pt x="6645275" y="0"/>
-                                </a:lnTo>
-                                <a:lnTo>
-                                  <a:pt x="0" y="0"/>
-                                </a:lnTo>
-                                <a:lnTo>
-                                  <a:pt x="0" y="38100"/>
-                                </a:lnTo>
-                                <a:close/>
-                              </a:path>
-                            </a:pathLst>
-                          </a:custGeom>
-                          <a:solidFill>
-                            <a:srgbClr val="000000"/>
-                          </a:solidFill>
-                        </wps:spPr>
-                        <wps:bodyPr wrap="square" lIns="0" tIns="0" rIns="0" bIns="0" rtlCol="0">
-                          <a:prstTxWarp prst="textNoShape">
-                            <a:avLst/>
-                          </a:prstTxWarp>
-                          <a:noAutofit/>
-                        </wps:bodyPr>
-                      </wps:wsp>
-                      <wps:wsp>
-                        <wps:cNvPr id="9" name="Graphic 9"/>
-                        <wps:cNvSpPr/>
-                        <wps:spPr>
-                          <a:xfrm>
-                            <a:off x="0" y="52705"/>
-                            <a:ext cx="6645275" cy="1270"/>
-                          </a:xfrm>
-                          <a:custGeom>
-                            <a:avLst/>
-                            <a:gdLst/>
-                            <a:ahLst/>
-                            <a:cxnLst/>
-                            <a:rect l="l" t="t" r="r" b="b"/>
-                            <a:pathLst>
-                              <a:path w="6645275">
-                                <a:moveTo>
-                                  <a:pt x="6645275" y="0"/>
-                                </a:moveTo>
-                                <a:lnTo>
-                                  <a:pt x="0" y="0"/>
-                                </a:lnTo>
-                              </a:path>
-                            </a:pathLst>
-                          </a:custGeom>
-                          <a:ln w="9525">
-                            <a:solidFill>
-                              <a:srgbClr val="000000"/>
-                            </a:solidFill>
-                            <a:prstDash val="solid"/>
-                          </a:ln>
-                        </wps:spPr>
-                        <wps:bodyPr wrap="square" lIns="0" tIns="0" rIns="0" bIns="0" rtlCol="0">
-                          <a:prstTxWarp prst="textNoShape">
-                            <a:avLst/>
-                          </a:prstTxWarp>
-                          <a:noAutofit/>
-                        </wps:bodyPr>
-                      </wps:wsp>
-                      <wps:wsp>
-                        <wps:cNvPr id="10" name="Graphic 10"/>
-                        <wps:cNvSpPr/>
-                        <wps:spPr>
-                          <a:xfrm>
-                            <a:off x="0" y="0"/>
-                            <a:ext cx="6645275" cy="38100"/>
-                          </a:xfrm>
-                          <a:custGeom>
-                            <a:avLst/>
-                            <a:gdLst/>
-                            <a:ahLst/>
-                            <a:cxnLst/>
-                            <a:rect l="l" t="t" r="r" b="b"/>
-                            <a:pathLst>
-                              <a:path w="6645275" h="38100">
-                                <a:moveTo>
-                                  <a:pt x="0" y="38100"/>
-                                </a:moveTo>
-                                <a:lnTo>
-                                  <a:pt x="6645275" y="38100"/>
-                                </a:lnTo>
-                                <a:lnTo>
-                                  <a:pt x="6645275" y="0"/>
-                                </a:lnTo>
-                                <a:lnTo>
-                                  <a:pt x="0" y="0"/>
-                                </a:lnTo>
-                                <a:lnTo>
-                                  <a:pt x="0" y="38100"/>
-                                </a:lnTo>
-                                <a:close/>
-                              </a:path>
-                            </a:pathLst>
-                          </a:custGeom>
-                          <a:solidFill>
-                            <a:srgbClr val="000000"/>
-                          </a:solidFill>
-                        </wps:spPr>
-                        <wps:bodyPr wrap="square" lIns="0" tIns="0" rIns="0" bIns="0" rtlCol="0">
-                          <a:prstTxWarp prst="textNoShape">
-                            <a:avLst/>
-                          </a:prstTxWarp>
-                          <a:noAutofit/>
-                        </wps:bodyPr>
-                      </wps:wsp>
-                    </wpg:wgp>
-                  </a:graphicData>
-                </a:graphic>
-              </wp:anchor>
-            </w:drawing>
-          </mc:Choice>
-          <mc:Fallback>
-            <w:pict>
-              <v:group w14:anchorId="731DEA72" id="Group 6" o:spid="_x0000_s1026" style="position:absolute;margin-left:36pt;margin-top:14.05pt;width:523.25pt;height:4.55pt;z-index:15729152;mso-wrap-distance-left:0;mso-wrap-distance-right:0;mso-position-horizontal-relative:page" coordsize="66452,577" o:gfxdata="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">
-                <v:shape id="Graphic 7" o:spid="_x0000_s1027" style="position:absolute;top:527;width:66452;height:12;visibility:visible;mso-wrap-style:square;v-text-anchor:top" coordsize="6645275,1270" o:gfxdata="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" path="m6645275,l,e" filled="f">
-                  <v:path arrowok="t"/>
-                </v:shape>
-                <v:shape id="Graphic 8" o:spid="_x0000_s1028" style="position:absolute;width:66452;height:381;visibility:visible;mso-wrap-style:square;v-text-anchor:top" coordsize="6645275,38100" o:gfxdata="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" path="m,38100r6645275,l6645275,,,,,38100xe" fillcolor="black" stroked="f">
-                  <v:path arrowok="t"/>
-                </v:shape>
-                <v:shape id="Graphic 9" o:spid="_x0000_s1029" style="position:absolute;top:527;width:66452;height:12;visibility:visible;mso-wrap-style:square;v-text-anchor:top" coordsize="6645275,1270" o:gfxdata="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" path="m6645275,l,e" filled="f">
-                  <v:path arrowok="t"/>
-                </v:shape>
-                <v:shape id="Graphic 10" o:spid="_x0000_s1030" style="position:absolute;width:66452;height:381;visibility:visible;mso-wrap-style:square;v-text-anchor:top" coordsize="6645275,38100" o:gfxdata="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" path="m,38100r6645275,l6645275,,,,,38100xe" fillcolor="black" stroked="f">
-                  <v:path arrowok="t"/>
-                </v:shape>
-                <w10:wrap anchorx="page"/>
-              </v:group>
-            </w:pict>
-          </mc:Fallback>
-        </mc:AlternateContent>
-      </w:r>
-      <w:r>
-        <w:rPr>
-          <w:w w:val="125"/>
-        </w:rPr>
-        <w:t>WORK</w:t>
-      </w:r>
-      <w:r>
-        <w:rPr>
-          <w:spacing w:val="-18"/>
-          <w:w w:val="125"/>
-        </w:rPr>
-        <w:t xml:space="preserve"> </w:t>
-      </w:r>
-      <w:r>
-        <w:rPr>
-          <w:spacing w:val="-2"/>
-          <w:w w:val="125"/>
-        </w:rPr>
-        <w:t>EXPERIENCE</w:t>
+        <w:t>WORK EXPERIENCE</w:t>
       </w:r>
     </w:p>
     <w:p>
       <w:pPr>
         <w:tabs>
-          <w:tab w:val="left" w:pos="9672"/>
+          <w:tab w:val="decimal" w:pos="10334"/>
         </w:tabs>
         <w:spacing w:before="110"/>
         <w:ind w:left="14"/>
@@ -1642,7 +1526,7 @@
     <w:p>
       <w:pPr>
         <w:tabs>
-          <w:tab w:val="left" w:pos="7859"/>
+          <w:tab w:val="decimal" w:pos="10334"/>
         </w:tabs>
         <w:spacing w:before="1"/>
         <w:ind w:left="14"/>
@@ -1830,7 +1714,6 @@
       </w:pPr>
       <w:r>
         <w:rPr>
-          <w:color w:val="101010"/>
           <w:spacing w:val="-2"/>
           <w:w w:val="115"/>
           <w:sz w:val="18"/>
@@ -1839,7 +1722,6 @@
       </w:r>
       <w:r>
         <w:rPr>
-          <w:color w:val="101010"/>
           <w:spacing w:val="-3"/>
           <w:w w:val="115"/>
           <w:sz w:val="18"/>
@@ -1848,7 +1730,6 @@
       </w:r>
       <w:r>
         <w:rPr>
-          <w:color w:val="101010"/>
           <w:spacing w:val="-2"/>
           <w:w w:val="115"/>
           <w:sz w:val="18"/>
@@ -1857,7 +1738,6 @@
       </w:r>
       <w:r>
         <w:rPr>
-          <w:color w:val="101010"/>
           <w:spacing w:val="-5"/>
           <w:w w:val="115"/>
           <w:sz w:val="18"/>
@@ -1866,7 +1746,6 @@
       </w:r>
       <w:r>
         <w:rPr>
-          <w:color w:val="101010"/>
           <w:spacing w:val="-2"/>
           <w:w w:val="115"/>
           <w:sz w:val="18"/>
@@ -1875,7 +1754,6 @@
       </w:r>
       <w:r>
         <w:rPr>
-          <w:color w:val="101010"/>
           <w:spacing w:val="-5"/>
           <w:w w:val="115"/>
           <w:sz w:val="18"/>
@@ -1884,7 +1762,6 @@
       </w:r>
       <w:r>
         <w:rPr>
-          <w:color w:val="101010"/>
           <w:spacing w:val="-2"/>
           <w:w w:val="115"/>
           <w:sz w:val="18"/>
@@ -1893,7 +1770,6 @@
       </w:r>
       <w:r>
         <w:rPr>
-          <w:color w:val="101010"/>
           <w:spacing w:val="-5"/>
           <w:w w:val="115"/>
           <w:sz w:val="18"/>
@@ -1902,7 +1778,6 @@
       </w:r>
       <w:r>
         <w:rPr>
-          <w:color w:val="101010"/>
           <w:spacing w:val="-2"/>
           <w:w w:val="115"/>
           <w:sz w:val="18"/>
@@ -1911,7 +1786,6 @@
       </w:r>
       <w:r>
         <w:rPr>
-          <w:color w:val="101010"/>
           <w:spacing w:val="-5"/>
           <w:w w:val="115"/>
           <w:sz w:val="18"/>
@@ -1920,7 +1794,6 @@
       </w:r>
       <w:r>
         <w:rPr>
-          <w:color w:val="101010"/>
           <w:spacing w:val="-2"/>
           <w:w w:val="115"/>
           <w:sz w:val="18"/>
@@ -2048,7 +1921,6 @@
         </w:rPr>
         <w:t xml:space="preserve"> </w:t>
       </w:r>
-      <w:proofErr w:type="gramStart"/>
       <w:r>
         <w:rPr>
           <w:w w:val="110"/>
@@ -2056,7 +1928,6 @@
         </w:rPr>
         <w:t>back-end</w:t>
       </w:r>
-      <w:proofErr w:type="gramEnd"/>
       <w:r>
         <w:rPr>
           <w:spacing w:val="2"/>
@@ -2282,7 +2153,7 @@
       <w:pPr>
         <w:pStyle w:val="Titre2"/>
         <w:tabs>
-          <w:tab w:val="left" w:pos="9672"/>
+          <w:tab w:val="decimal" w:pos="10334"/>
         </w:tabs>
         <w:rPr>
           <w:b w:val="0"/>
@@ -2400,7 +2271,7 @@
     <w:p>
       <w:pPr>
         <w:tabs>
-          <w:tab w:val="left" w:pos="8509"/>
+          <w:tab w:val="decimal" w:pos="10334"/>
         </w:tabs>
         <w:spacing w:before="1"/>
         <w:ind w:left="14"/>
@@ -3002,7 +2873,7 @@
     <w:p>
       <w:pPr>
         <w:tabs>
-          <w:tab w:val="left" w:pos="9637"/>
+          <w:tab w:val="decimal" w:pos="10334"/>
         </w:tabs>
         <w:spacing w:before="1"/>
         <w:ind w:left="14"/>
@@ -3105,7 +2976,7 @@
     <w:p>
       <w:pPr>
         <w:tabs>
-          <w:tab w:val="left" w:pos="8697"/>
+          <w:tab w:val="decimal" w:pos="10334"/>
         </w:tabs>
         <w:spacing w:before="1"/>
         <w:ind w:left="14"/>
@@ -3244,7 +3115,6 @@
           <w:sz w:val="18"/>
         </w:rPr>
       </w:pPr>
-      <w:proofErr w:type="gramStart"/>
       <w:r>
         <w:rPr>
           <w:w w:val="110"/>
@@ -3267,7 +3137,6 @@
         </w:rPr>
         <w:t>of</w:t>
       </w:r>
-      <w:proofErr w:type="gramEnd"/>
       <w:r>
         <w:rPr>
           <w:spacing w:val="-3"/>
@@ -3726,7 +3595,7 @@
     <w:p>
       <w:pPr>
         <w:tabs>
-          <w:tab w:val="left" w:pos="9217"/>
+          <w:tab w:val="decimal" w:pos="10334"/>
         </w:tabs>
         <w:spacing w:before="1"/>
         <w:ind w:left="14"/>
@@ -3794,7 +3663,7 @@
     <w:p>
       <w:pPr>
         <w:tabs>
-          <w:tab w:val="left" w:pos="8573"/>
+          <w:tab w:val="decimal" w:pos="10334"/>
         </w:tabs>
         <w:spacing w:before="1"/>
         <w:ind w:left="14"/>
@@ -4274,7 +4143,7 @@
     <w:p>
       <w:pPr>
         <w:tabs>
-          <w:tab w:val="left" w:pos="9469"/>
+          <w:tab w:val="decimal" w:pos="10334"/>
         </w:tabs>
         <w:spacing w:before="1"/>
         <w:ind w:left="14"/>
@@ -4343,7 +4212,7 @@
     <w:p>
       <w:pPr>
         <w:tabs>
-          <w:tab w:val="left" w:pos="9719"/>
+          <w:tab w:val="decimal" w:pos="10334"/>
         </w:tabs>
         <w:spacing w:before="1"/>
         <w:ind w:left="14"/>
@@ -4657,282 +4526,27 @@
     </w:p>
     <w:p>
       <w:pPr>
+        <w:pStyle w:val="Corpsdetexte"/>
+      </w:pPr>
+    </w:p>
+    <w:p>
+      <w:pPr>
         <w:pStyle w:val="Titre1"/>
+        <w:pBdr>
+          <w:bottom w:val="single" w:sz="6" w:space="1" w:color="auto"/>
+        </w:pBdr>
         <w:spacing w:before="57"/>
       </w:pPr>
       <w:r>
-        <w:rPr>
-          <w:noProof/>
-        </w:rPr>
-        <mc:AlternateContent>
-          <mc:Choice Requires="wpg">
-            <w:drawing>
-              <wp:anchor distT="0" distB="0" distL="0" distR="0" simplePos="0" relativeHeight="15729664" behindDoc="0" locked="0" layoutInCell="1" allowOverlap="1" wp14:anchorId="25ABAA95" wp14:editId="45BBD631">
-                <wp:simplePos x="0" y="0"/>
-                <wp:positionH relativeFrom="page">
-                  <wp:posOffset>457200</wp:posOffset>
-                </wp:positionH>
-                <wp:positionV relativeFrom="paragraph">
-                  <wp:posOffset>212725</wp:posOffset>
-                </wp:positionV>
-                <wp:extent cx="6645275" cy="57785"/>
-                <wp:effectExtent l="0" t="0" r="0" b="0"/>
-                <wp:wrapNone/>
-                <wp:docPr id="11" name="Group 11"/>
-                <wp:cNvGraphicFramePr>
-                  <a:graphicFrameLocks xmlns:a="http://schemas.openxmlformats.org/drawingml/2006/main"/>
-                </wp:cNvGraphicFramePr>
-                <a:graphic xmlns:a="http://schemas.openxmlformats.org/drawingml/2006/main">
-                  <a:graphicData uri="http://schemas.microsoft.com/office/word/2010/wordprocessingGroup">
-                    <wpg:wgp>
-                      <wpg:cNvGrpSpPr>
-                        <a:grpSpLocks/>
-                      </wpg:cNvGrpSpPr>
-                      <wpg:grpSpPr>
-                        <a:xfrm>
-                          <a:off x="0" y="0"/>
-                          <a:ext cx="6645275" cy="57785"/>
-                          <a:chOff x="0" y="0"/>
-                          <a:chExt cx="6645275" cy="57785"/>
-                        </a:xfrm>
-                      </wpg:grpSpPr>
-                      <wps:wsp>
-                        <wps:cNvPr id="12" name="Graphic 12"/>
-                        <wps:cNvSpPr/>
-                        <wps:spPr>
-                          <a:xfrm>
-                            <a:off x="0" y="52705"/>
-                            <a:ext cx="6645275" cy="1270"/>
-                          </a:xfrm>
-                          <a:custGeom>
-                            <a:avLst/>
-                            <a:gdLst/>
-                            <a:ahLst/>
-                            <a:cxnLst/>
-                            <a:rect l="l" t="t" r="r" b="b"/>
-                            <a:pathLst>
-                              <a:path w="6645275">
-                                <a:moveTo>
-                                  <a:pt x="6645275" y="0"/>
-                                </a:moveTo>
-                                <a:lnTo>
-                                  <a:pt x="0" y="0"/>
-                                </a:lnTo>
-                              </a:path>
-                            </a:pathLst>
-                          </a:custGeom>
-                          <a:ln w="9525">
-                            <a:solidFill>
-                              <a:srgbClr val="000000"/>
-                            </a:solidFill>
-                            <a:prstDash val="solid"/>
-                          </a:ln>
-                        </wps:spPr>
-                        <wps:bodyPr wrap="square" lIns="0" tIns="0" rIns="0" bIns="0" rtlCol="0">
-                          <a:prstTxWarp prst="textNoShape">
-                            <a:avLst/>
-                          </a:prstTxWarp>
-                          <a:noAutofit/>
-                        </wps:bodyPr>
-                      </wps:wsp>
-                      <wps:wsp>
-                        <wps:cNvPr id="13" name="Graphic 13"/>
-                        <wps:cNvSpPr/>
-                        <wps:spPr>
-                          <a:xfrm>
-                            <a:off x="0" y="0"/>
-                            <a:ext cx="6645275" cy="38100"/>
-                          </a:xfrm>
-                          <a:custGeom>
-                            <a:avLst/>
-                            <a:gdLst/>
-                            <a:ahLst/>
-                            <a:cxnLst/>
-                            <a:rect l="l" t="t" r="r" b="b"/>
-                            <a:pathLst>
-                              <a:path w="6645275" h="38100">
-                                <a:moveTo>
-                                  <a:pt x="0" y="38099"/>
-                                </a:moveTo>
-                                <a:lnTo>
-                                  <a:pt x="6645275" y="38099"/>
-                                </a:lnTo>
-                                <a:lnTo>
-                                  <a:pt x="6645275" y="0"/>
-                                </a:lnTo>
-                                <a:lnTo>
-                                  <a:pt x="0" y="0"/>
-                                </a:lnTo>
-                                <a:lnTo>
-                                  <a:pt x="0" y="38099"/>
-                                </a:lnTo>
-                                <a:close/>
-                              </a:path>
-                            </a:pathLst>
-                          </a:custGeom>
-                          <a:solidFill>
-                            <a:srgbClr val="000000"/>
-                          </a:solidFill>
-                        </wps:spPr>
-                        <wps:bodyPr wrap="square" lIns="0" tIns="0" rIns="0" bIns="0" rtlCol="0">
-                          <a:prstTxWarp prst="textNoShape">
-                            <a:avLst/>
-                          </a:prstTxWarp>
-                          <a:noAutofit/>
-                        </wps:bodyPr>
-                      </wps:wsp>
-                      <wps:wsp>
-                        <wps:cNvPr id="14" name="Graphic 14"/>
-                        <wps:cNvSpPr/>
-                        <wps:spPr>
-                          <a:xfrm>
-                            <a:off x="0" y="52705"/>
-                            <a:ext cx="6645275" cy="1270"/>
-                          </a:xfrm>
-                          <a:custGeom>
-                            <a:avLst/>
-                            <a:gdLst/>
-                            <a:ahLst/>
-                            <a:cxnLst/>
-                            <a:rect l="l" t="t" r="r" b="b"/>
-                            <a:pathLst>
-                              <a:path w="6645275">
-                                <a:moveTo>
-                                  <a:pt x="6645275" y="0"/>
-                                </a:moveTo>
-                                <a:lnTo>
-                                  <a:pt x="0" y="0"/>
-                                </a:lnTo>
-                              </a:path>
-                            </a:pathLst>
-                          </a:custGeom>
-                          <a:ln w="9525">
-                            <a:solidFill>
-                              <a:srgbClr val="000000"/>
-                            </a:solidFill>
-                            <a:prstDash val="solid"/>
-                          </a:ln>
-                        </wps:spPr>
-                        <wps:bodyPr wrap="square" lIns="0" tIns="0" rIns="0" bIns="0" rtlCol="0">
-                          <a:prstTxWarp prst="textNoShape">
-                            <a:avLst/>
-                          </a:prstTxWarp>
-                          <a:noAutofit/>
-                        </wps:bodyPr>
-                      </wps:wsp>
-                      <wps:wsp>
-                        <wps:cNvPr id="15" name="Graphic 15"/>
-                        <wps:cNvSpPr/>
-                        <wps:spPr>
-                          <a:xfrm>
-                            <a:off x="0" y="0"/>
-                            <a:ext cx="6645275" cy="38100"/>
-                          </a:xfrm>
-                          <a:custGeom>
-                            <a:avLst/>
-                            <a:gdLst/>
-                            <a:ahLst/>
-                            <a:cxnLst/>
-                            <a:rect l="l" t="t" r="r" b="b"/>
-                            <a:pathLst>
-                              <a:path w="6645275" h="38100">
-                                <a:moveTo>
-                                  <a:pt x="0" y="38099"/>
-                                </a:moveTo>
-                                <a:lnTo>
-                                  <a:pt x="6645275" y="38099"/>
-                                </a:lnTo>
-                                <a:lnTo>
-                                  <a:pt x="6645275" y="0"/>
-                                </a:lnTo>
-                                <a:lnTo>
-                                  <a:pt x="0" y="0"/>
-                                </a:lnTo>
-                                <a:lnTo>
-                                  <a:pt x="0" y="38099"/>
-                                </a:lnTo>
-                                <a:close/>
-                              </a:path>
-                            </a:pathLst>
-                          </a:custGeom>
-                          <a:solidFill>
-                            <a:srgbClr val="000000"/>
-                          </a:solidFill>
-                        </wps:spPr>
-                        <wps:bodyPr wrap="square" lIns="0" tIns="0" rIns="0" bIns="0" rtlCol="0">
-                          <a:prstTxWarp prst="textNoShape">
-                            <a:avLst/>
-                          </a:prstTxWarp>
-                          <a:noAutofit/>
-                        </wps:bodyPr>
-                      </wps:wsp>
-                    </wpg:wgp>
-                  </a:graphicData>
-                </a:graphic>
-              </wp:anchor>
-            </w:drawing>
-          </mc:Choice>
-          <mc:Fallback>
-            <w:pict>
-              <v:group w14:anchorId="0EACBB94" id="Group 11" o:spid="_x0000_s1026" style="position:absolute;margin-left:36pt;margin-top:16.75pt;width:523.25pt;height:4.55pt;z-index:15729664;mso-wrap-distance-left:0;mso-wrap-distance-right:0;mso-position-horizontal-relative:page" coordsize="66452,577" o:gfxdata="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">
-                <v:shape id="Graphic 12" o:spid="_x0000_s1027" style="position:absolute;top:527;width:66452;height:12;visibility:visible;mso-wrap-style:square;v-text-anchor:top" coordsize="6645275,1270" o:gfxdata="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" path="m6645275,l,e" filled="f">
-                  <v:path arrowok="t"/>
-                </v:shape>
-                <v:shape id="Graphic 13" o:spid="_x0000_s1028" style="position:absolute;width:66452;height:381;visibility:visible;mso-wrap-style:square;v-text-anchor:top" coordsize="6645275,38100" o:gfxdata="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" path="m,38099r6645275,l6645275,,,,,38099xe" fillcolor="black" stroked="f">
-                  <v:path arrowok="t"/>
-                </v:shape>
-                <v:shape id="Graphic 14" o:spid="_x0000_s1029" style="position:absolute;top:527;width:66452;height:12;visibility:visible;mso-wrap-style:square;v-text-anchor:top" coordsize="6645275,1270" o:gfxdata="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" path="m6645275,l,e" filled="f">
-                  <v:path arrowok="t"/>
-                </v:shape>
-                <v:shape id="Graphic 15" o:spid="_x0000_s1030" style="position:absolute;width:66452;height:381;visibility:visible;mso-wrap-style:square;v-text-anchor:top" coordsize="6645275,38100" o:gfxdata="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" path="m,38099r6645275,l6645275,,,,,38099xe" fillcolor="black" stroked="f">
-                  <v:path arrowok="t"/>
-                </v:shape>
-                <w10:wrap anchorx="page"/>
-              </v:group>
-            </w:pict>
-          </mc:Fallback>
-        </mc:AlternateContent>
-      </w:r>
-      <w:r>
-        <w:rPr>
-          <w:w w:val="125"/>
-        </w:rPr>
-        <w:t>LEADERSHIP</w:t>
-      </w:r>
-      <w:r>
-        <w:rPr>
-          <w:spacing w:val="-14"/>
-          <w:w w:val="125"/>
-        </w:rPr>
-        <w:t xml:space="preserve"> </w:t>
-      </w:r>
-      <w:r>
-        <w:rPr>
-          <w:w w:val="125"/>
-        </w:rPr>
-        <w:t>&amp;</w:t>
-      </w:r>
-      <w:r>
-        <w:rPr>
-          <w:spacing w:val="-16"/>
-          <w:w w:val="125"/>
-        </w:rPr>
-        <w:t xml:space="preserve"> </w:t>
-      </w:r>
-      <w:r>
-        <w:rPr>
-          <w:spacing w:val="-2"/>
-          <w:w w:val="125"/>
-        </w:rPr>
         <w:t>ACTIVITIES</w:t>
       </w:r>
     </w:p>
     <w:p>
       <w:pPr>
         <w:tabs>
-          <w:tab w:val="left" w:pos="9325"/>
+          <w:tab w:val="decimal" w:pos="10334"/>
         </w:tabs>
-        <w:spacing w:before="168"/>
+        <w:spacing w:before="160"/>
         <w:ind w:left="14"/>
         <w:rPr>
           <w:sz w:val="18"/>
@@ -4941,45 +4555,10 @@
       <w:r>
         <w:rPr>
           <w:b/>
-          <w:w w:val="115"/>
-          <w:sz w:val="18"/>
-        </w:rPr>
-        <w:t>LCE</w:t>
-      </w:r>
-      <w:r>
-        <w:rPr>
-          <w:b/>
-          <w:spacing w:val="26"/>
-          <w:w w:val="115"/>
-          <w:sz w:val="18"/>
-        </w:rPr>
-        <w:t xml:space="preserve"> </w:t>
-      </w:r>
-      <w:r>
-        <w:rPr>
-          <w:b/>
-          <w:w w:val="115"/>
-          <w:sz w:val="18"/>
-        </w:rPr>
-        <w:t>Chess</w:t>
-      </w:r>
-      <w:r>
-        <w:rPr>
-          <w:b/>
-          <w:spacing w:val="29"/>
-          <w:w w:val="115"/>
-          <w:sz w:val="18"/>
-        </w:rPr>
-        <w:t xml:space="preserve"> </w:t>
-      </w:r>
-      <w:r>
-        <w:rPr>
-          <w:b/>
-          <w:spacing w:val="-4"/>
-          <w:w w:val="115"/>
-          <w:sz w:val="18"/>
-        </w:rPr>
-        <w:t>club</w:t>
+          <w:w w:val="120"/>
+          <w:sz w:val="18"/>
+        </w:rPr>
+        <w:t>LCE Chess club</w:t>
       </w:r>
       <w:r>
         <w:rPr>
@@ -4993,55 +4572,15 @@
           <w:w w:val="110"/>
           <w:sz w:val="18"/>
         </w:rPr>
-        <w:t>La</w:t>
-      </w:r>
-      <w:r>
-        <w:rPr>
-          <w:spacing w:val="-15"/>
-          <w:w w:val="110"/>
-          <w:sz w:val="18"/>
-        </w:rPr>
-        <w:t xml:space="preserve"> </w:t>
-      </w:r>
-      <w:proofErr w:type="spellStart"/>
-      <w:r>
-        <w:rPr>
-          <w:w w:val="110"/>
-          <w:sz w:val="18"/>
-        </w:rPr>
-        <w:t>Ciotat</w:t>
-      </w:r>
-      <w:proofErr w:type="spellEnd"/>
-      <w:r>
-        <w:rPr>
-          <w:w w:val="110"/>
-          <w:sz w:val="18"/>
-        </w:rPr>
-        <w:t>,</w:t>
-      </w:r>
-      <w:r>
-        <w:rPr>
-          <w:spacing w:val="-13"/>
-          <w:w w:val="110"/>
-          <w:sz w:val="18"/>
-        </w:rPr>
-        <w:t xml:space="preserve"> </w:t>
-      </w:r>
-      <w:r>
-        <w:rPr>
-          <w:spacing w:val="-5"/>
-          <w:w w:val="110"/>
-          <w:sz w:val="18"/>
-        </w:rPr>
-        <w:t>FR</w:t>
+        <w:t>La Ciotat, FR</w:t>
       </w:r>
     </w:p>
     <w:p>
       <w:pPr>
         <w:tabs>
-          <w:tab w:val="left" w:pos="9469"/>
+          <w:tab w:val="decimal" w:pos="10334"/>
         </w:tabs>
-        <w:spacing w:before="59"/>
+        <w:spacing w:before="1"/>
         <w:ind w:left="14"/>
         <w:rPr>
           <w:i/>
@@ -5052,34 +4591,15 @@
         <w:rPr>
           <w:b/>
           <w:i/>
-          <w:w w:val="120"/>
-          <w:sz w:val="18"/>
-        </w:rPr>
-        <w:t>Chess</w:t>
-      </w:r>
-      <w:r>
-        <w:rPr>
-          <w:b/>
-          <w:i/>
-          <w:spacing w:val="15"/>
-          <w:w w:val="120"/>
-          <w:sz w:val="18"/>
-        </w:rPr>
-        <w:t xml:space="preserve"> </w:t>
-      </w:r>
-      <w:r>
-        <w:rPr>
-          <w:b/>
-          <w:i/>
-          <w:spacing w:val="-2"/>
-          <w:w w:val="115"/>
-          <w:sz w:val="18"/>
-        </w:rPr>
-        <w:t>instructor</w:t>
-      </w:r>
-      <w:r>
-        <w:rPr>
-          <w:rFonts w:ascii="Times New Roman"/>
+          <w:w w:val="110"/>
+          <w:sz w:val="18"/>
+        </w:rPr>
+        <w:t>Chess instructor</w:t>
+      </w:r>
+      <w:r>
+        <w:rPr>
+          <w:b/>
+          <w:i/>
           <w:sz w:val="18"/>
         </w:rPr>
         <w:tab/>
@@ -5087,19 +4607,10 @@
       <w:r>
         <w:rPr>
           <w:i/>
-          <w:w w:val="115"/>
-          <w:sz w:val="18"/>
-        </w:rPr>
-        <w:t>2007-</w:t>
-      </w:r>
-      <w:r>
-        <w:rPr>
-          <w:i/>
-          <w:spacing w:val="-4"/>
-          <w:w w:val="120"/>
-          <w:sz w:val="18"/>
-        </w:rPr>
-        <w:t>2018</w:t>
+          <w:w w:val="110"/>
+          <w:sz w:val="18"/>
+        </w:rPr>
+        <w:t>2007 – 2018</w:t>
       </w:r>
     </w:p>
     <w:p>
@@ -5122,143 +4633,7 @@
           <w:w w:val="110"/>
           <w:sz w:val="18"/>
         </w:rPr>
-        <w:t>DIFF</w:t>
-      </w:r>
-      <w:r>
-        <w:rPr>
-          <w:spacing w:val="-11"/>
-          <w:w w:val="110"/>
-          <w:sz w:val="18"/>
-        </w:rPr>
-        <w:t xml:space="preserve"> </w:t>
-      </w:r>
-      <w:r>
-        <w:rPr>
-          <w:w w:val="110"/>
-          <w:sz w:val="18"/>
-        </w:rPr>
-        <w:t>certificate,</w:t>
-      </w:r>
-      <w:r>
-        <w:rPr>
-          <w:spacing w:val="-8"/>
-          <w:w w:val="110"/>
-          <w:sz w:val="18"/>
-        </w:rPr>
-        <w:t xml:space="preserve"> </w:t>
-      </w:r>
-      <w:r>
-        <w:rPr>
-          <w:w w:val="110"/>
-          <w:sz w:val="18"/>
-        </w:rPr>
-        <w:t>certified</w:t>
-      </w:r>
-      <w:r>
-        <w:rPr>
-          <w:spacing w:val="-9"/>
-          <w:w w:val="110"/>
-          <w:sz w:val="18"/>
-        </w:rPr>
-        <w:t xml:space="preserve"> </w:t>
-      </w:r>
-      <w:r>
-        <w:rPr>
-          <w:w w:val="110"/>
-          <w:sz w:val="18"/>
-        </w:rPr>
-        <w:t>by</w:t>
-      </w:r>
-      <w:r>
-        <w:rPr>
-          <w:spacing w:val="-10"/>
-          <w:w w:val="110"/>
-          <w:sz w:val="18"/>
-        </w:rPr>
-        <w:t xml:space="preserve"> </w:t>
-      </w:r>
-      <w:r>
-        <w:rPr>
-          <w:w w:val="110"/>
-          <w:sz w:val="18"/>
-        </w:rPr>
-        <w:t>the</w:t>
-      </w:r>
-      <w:r>
-        <w:rPr>
-          <w:spacing w:val="-12"/>
-          <w:w w:val="110"/>
-          <w:sz w:val="18"/>
-        </w:rPr>
-        <w:t xml:space="preserve"> </w:t>
-      </w:r>
-      <w:r>
-        <w:rPr>
-          <w:w w:val="110"/>
-          <w:sz w:val="18"/>
-        </w:rPr>
-        <w:t>French</w:t>
-      </w:r>
-      <w:r>
-        <w:rPr>
-          <w:spacing w:val="-10"/>
-          <w:w w:val="110"/>
-          <w:sz w:val="18"/>
-        </w:rPr>
-        <w:t xml:space="preserve"> </w:t>
-      </w:r>
-      <w:r>
-        <w:rPr>
-          <w:w w:val="110"/>
-          <w:sz w:val="18"/>
-        </w:rPr>
-        <w:t>federation</w:t>
-      </w:r>
-      <w:r>
-        <w:rPr>
-          <w:spacing w:val="-9"/>
-          <w:w w:val="110"/>
-          <w:sz w:val="18"/>
-        </w:rPr>
-        <w:t xml:space="preserve"> </w:t>
-      </w:r>
-      <w:r>
-        <w:rPr>
-          <w:w w:val="110"/>
-          <w:sz w:val="18"/>
-        </w:rPr>
-        <w:t>(chess</w:t>
-      </w:r>
-      <w:r>
-        <w:rPr>
-          <w:spacing w:val="-10"/>
-          <w:w w:val="110"/>
-          <w:sz w:val="18"/>
-        </w:rPr>
-        <w:t xml:space="preserve"> </w:t>
-      </w:r>
-      <w:r>
-        <w:rPr>
-          <w:w w:val="110"/>
-          <w:sz w:val="18"/>
-        </w:rPr>
-        <w:t>instructor</w:t>
-      </w:r>
-      <w:r>
-        <w:rPr>
-          <w:spacing w:val="-9"/>
-          <w:w w:val="110"/>
-          <w:sz w:val="18"/>
-        </w:rPr>
-        <w:t xml:space="preserve"> </w:t>
-      </w:r>
-      <w:r>
-        <w:rPr>
-          <w:spacing w:val="-2"/>
-          <w:w w:val="110"/>
-          <w:sz w:val="18"/>
-        </w:rPr>
-        <w:t>certificate)</w:t>
+        <w:t>DIFF certificate (French Chess Federation)</w:t>
       </w:r>
     </w:p>
     <w:p>
@@ -5281,143 +4656,7 @@
           <w:w w:val="110"/>
           <w:sz w:val="18"/>
         </w:rPr>
-        <w:t>Elo</w:t>
-      </w:r>
-      <w:r>
-        <w:rPr>
-          <w:spacing w:val="-1"/>
-          <w:w w:val="110"/>
-          <w:sz w:val="18"/>
-        </w:rPr>
-        <w:t xml:space="preserve"> </w:t>
-      </w:r>
-      <w:r>
-        <w:rPr>
-          <w:w w:val="110"/>
-          <w:sz w:val="18"/>
-        </w:rPr>
-        <w:t>chess</w:t>
-      </w:r>
-      <w:r>
-        <w:rPr>
-          <w:spacing w:val="4"/>
-          <w:w w:val="110"/>
-          <w:sz w:val="18"/>
-        </w:rPr>
-        <w:t xml:space="preserve"> </w:t>
-      </w:r>
-      <w:r>
-        <w:rPr>
-          <w:w w:val="110"/>
-          <w:sz w:val="18"/>
-        </w:rPr>
-        <w:t>ranking</w:t>
-      </w:r>
-      <w:r>
-        <w:rPr>
-          <w:spacing w:val="2"/>
-          <w:w w:val="110"/>
-          <w:sz w:val="18"/>
-        </w:rPr>
-        <w:t xml:space="preserve"> </w:t>
-      </w:r>
-      <w:r>
-        <w:rPr>
-          <w:w w:val="110"/>
-          <w:sz w:val="18"/>
-        </w:rPr>
-        <w:t>delivered</w:t>
-      </w:r>
-      <w:r>
-        <w:rPr>
-          <w:spacing w:val="4"/>
-          <w:w w:val="110"/>
-          <w:sz w:val="18"/>
-        </w:rPr>
-        <w:t xml:space="preserve"> </w:t>
-      </w:r>
-      <w:r>
-        <w:rPr>
-          <w:w w:val="110"/>
-          <w:sz w:val="18"/>
-        </w:rPr>
-        <w:t>by</w:t>
-      </w:r>
-      <w:r>
-        <w:rPr>
-          <w:spacing w:val="2"/>
-          <w:w w:val="110"/>
-          <w:sz w:val="18"/>
-        </w:rPr>
-        <w:t xml:space="preserve"> </w:t>
-      </w:r>
-      <w:r>
-        <w:rPr>
-          <w:w w:val="110"/>
-          <w:sz w:val="18"/>
-        </w:rPr>
-        <w:t>the</w:t>
-      </w:r>
-      <w:r>
-        <w:rPr>
-          <w:spacing w:val="1"/>
-          <w:w w:val="110"/>
-          <w:sz w:val="18"/>
-        </w:rPr>
-        <w:t xml:space="preserve"> </w:t>
-      </w:r>
-      <w:r>
-        <w:rPr>
-          <w:w w:val="110"/>
-          <w:sz w:val="18"/>
-        </w:rPr>
-        <w:t>world chess</w:t>
-      </w:r>
-      <w:r>
-        <w:rPr>
-          <w:spacing w:val="4"/>
-          <w:w w:val="110"/>
-          <w:sz w:val="18"/>
-        </w:rPr>
-        <w:t xml:space="preserve"> </w:t>
-      </w:r>
-      <w:r>
-        <w:rPr>
-          <w:w w:val="110"/>
-          <w:sz w:val="18"/>
-        </w:rPr>
-        <w:t>federation</w:t>
-      </w:r>
-      <w:r>
-        <w:rPr>
-          <w:spacing w:val="1"/>
-          <w:w w:val="110"/>
-          <w:sz w:val="18"/>
-        </w:rPr>
-        <w:t xml:space="preserve"> </w:t>
-      </w:r>
-      <w:r>
-        <w:rPr>
-          <w:w w:val="110"/>
-          <w:sz w:val="18"/>
-        </w:rPr>
-        <w:t>(rating:</w:t>
-      </w:r>
-      <w:r>
-        <w:rPr>
-          <w:spacing w:val="3"/>
-          <w:w w:val="110"/>
-          <w:sz w:val="18"/>
-        </w:rPr>
-        <w:t xml:space="preserve"> </w:t>
-      </w:r>
-      <w:r>
-        <w:rPr>
-          <w:spacing w:val="-2"/>
-          <w:w w:val="110"/>
-          <w:sz w:val="18"/>
-        </w:rPr>
-        <w:t>1880)</w:t>
+        <w:t>FIDE Elo rating: 1880 (World Chess Federation)</w:t>
       </w:r>
     </w:p>
     <w:p>
@@ -5437,101 +4676,10 @@
       </w:pPr>
       <w:r>
         <w:rPr>
-          <w:w w:val="115"/>
-          <w:sz w:val="18"/>
-        </w:rPr>
-        <w:t>Instructed</w:t>
-      </w:r>
-      <w:r>
-        <w:rPr>
-          <w:spacing w:val="-14"/>
-          <w:w w:val="115"/>
-          <w:sz w:val="18"/>
-        </w:rPr>
-        <w:t xml:space="preserve"> </w:t>
-      </w:r>
-      <w:r>
-        <w:rPr>
-          <w:w w:val="115"/>
-          <w:sz w:val="18"/>
-        </w:rPr>
-        <w:t>a</w:t>
-      </w:r>
-      <w:r>
-        <w:rPr>
-          <w:spacing w:val="-15"/>
-          <w:w w:val="115"/>
-          <w:sz w:val="18"/>
-        </w:rPr>
-        <w:t xml:space="preserve"> </w:t>
-      </w:r>
-      <w:r>
-        <w:rPr>
-          <w:w w:val="115"/>
-          <w:sz w:val="18"/>
-        </w:rPr>
-        <w:t>senior</w:t>
-      </w:r>
-      <w:r>
-        <w:rPr>
-          <w:spacing w:val="-15"/>
-          <w:w w:val="115"/>
-          <w:sz w:val="18"/>
-        </w:rPr>
-        <w:t xml:space="preserve"> </w:t>
-      </w:r>
-      <w:r>
-        <w:rPr>
-          <w:w w:val="115"/>
-          <w:sz w:val="18"/>
-        </w:rPr>
-        <w:t>class</w:t>
-      </w:r>
-      <w:r>
-        <w:rPr>
-          <w:spacing w:val="-15"/>
-          <w:w w:val="115"/>
-          <w:sz w:val="18"/>
-        </w:rPr>
-        <w:t xml:space="preserve"> </w:t>
-      </w:r>
-      <w:r>
-        <w:rPr>
-          <w:w w:val="115"/>
-          <w:sz w:val="18"/>
-        </w:rPr>
-        <w:t>of</w:t>
-      </w:r>
-      <w:r>
-        <w:rPr>
-          <w:spacing w:val="-16"/>
-          <w:w w:val="115"/>
-          <w:sz w:val="18"/>
-        </w:rPr>
-        <w:t xml:space="preserve"> </w:t>
-      </w:r>
-      <w:r>
-        <w:rPr>
-          <w:w w:val="115"/>
-          <w:sz w:val="18"/>
-        </w:rPr>
-        <w:t>10</w:t>
-      </w:r>
-      <w:r>
-        <w:rPr>
-          <w:spacing w:val="-14"/>
-          <w:w w:val="115"/>
-          <w:sz w:val="18"/>
-        </w:rPr>
-        <w:t xml:space="preserve"> </w:t>
-      </w:r>
-      <w:r>
-        <w:rPr>
-          <w:spacing w:val="-2"/>
-          <w:w w:val="115"/>
-          <w:sz w:val="18"/>
-        </w:rPr>
-        <w:t>students</w:t>
+          <w:w w:val="110"/>
+          <w:sz w:val="18"/>
+        </w:rPr>
+        <w:t>Instructed a senior class of 10 students</w:t>
       </w:r>
     </w:p>
     <w:p>
@@ -5546,351 +4694,81 @@
         </w:tabs>
         <w:ind w:left="733" w:hanging="359"/>
         <w:rPr>
-          <w:sz w:val="16"/>
-        </w:rPr>
-      </w:pPr>
-      <w:r>
-        <w:rPr>
-          <w:w w:val="110"/>
-          <w:sz w:val="18"/>
-        </w:rPr>
-        <w:t>2</w:t>
-      </w:r>
-      <w:r>
-        <w:rPr>
-          <w:w w:val="110"/>
-          <w:sz w:val="18"/>
-          <w:vertAlign w:val="superscript"/>
-        </w:rPr>
-        <w:t>nd</w:t>
-      </w:r>
-      <w:r>
-        <w:rPr>
-          <w:w w:val="110"/>
-          <w:sz w:val="18"/>
-        </w:rPr>
-        <w:t xml:space="preserve"> of a</w:t>
-      </w:r>
-      <w:r>
-        <w:rPr>
-          <w:spacing w:val="1"/>
-          <w:w w:val="110"/>
-          <w:sz w:val="18"/>
-        </w:rPr>
-        <w:t xml:space="preserve"> </w:t>
-      </w:r>
-      <w:r>
-        <w:rPr>
-          <w:w w:val="110"/>
-          <w:sz w:val="18"/>
-        </w:rPr>
-        <w:t>PACA</w:t>
-      </w:r>
-      <w:r>
-        <w:rPr>
-          <w:spacing w:val="2"/>
-          <w:w w:val="110"/>
-          <w:sz w:val="18"/>
-        </w:rPr>
-        <w:t xml:space="preserve"> </w:t>
-      </w:r>
-      <w:r>
-        <w:rPr>
-          <w:w w:val="110"/>
-          <w:sz w:val="18"/>
-        </w:rPr>
-        <w:t>Open</w:t>
-      </w:r>
-      <w:r>
-        <w:rPr>
-          <w:spacing w:val="1"/>
-          <w:w w:val="110"/>
-          <w:sz w:val="18"/>
-        </w:rPr>
-        <w:t xml:space="preserve"> </w:t>
-      </w:r>
-      <w:r>
-        <w:rPr>
-          <w:w w:val="110"/>
-          <w:sz w:val="18"/>
-        </w:rPr>
-        <w:t>and</w:t>
-      </w:r>
-      <w:r>
-        <w:rPr>
-          <w:spacing w:val="1"/>
-          <w:w w:val="110"/>
-          <w:sz w:val="18"/>
-        </w:rPr>
-        <w:t xml:space="preserve"> </w:t>
-      </w:r>
-      <w:r>
-        <w:rPr>
-          <w:w w:val="110"/>
-          <w:sz w:val="18"/>
-        </w:rPr>
-        <w:t>1</w:t>
-      </w:r>
-      <w:r>
-        <w:rPr>
-          <w:w w:val="110"/>
-          <w:sz w:val="18"/>
-          <w:vertAlign w:val="superscript"/>
-        </w:rPr>
-        <w:t>st</w:t>
-      </w:r>
-      <w:r>
-        <w:rPr>
-          <w:spacing w:val="2"/>
-          <w:w w:val="110"/>
-          <w:sz w:val="18"/>
-        </w:rPr>
-        <w:t xml:space="preserve"> </w:t>
-      </w:r>
-      <w:r>
-        <w:rPr>
-          <w:w w:val="110"/>
-          <w:sz w:val="18"/>
-        </w:rPr>
-        <w:t>of</w:t>
-      </w:r>
-      <w:r>
-        <w:rPr>
-          <w:spacing w:val="-1"/>
-          <w:w w:val="110"/>
-          <w:sz w:val="18"/>
-        </w:rPr>
-        <w:t xml:space="preserve"> </w:t>
-      </w:r>
-      <w:r>
-        <w:rPr>
-          <w:w w:val="110"/>
-          <w:sz w:val="18"/>
-        </w:rPr>
-        <w:t>the National</w:t>
-      </w:r>
-      <w:r>
-        <w:rPr>
-          <w:spacing w:val="3"/>
-          <w:w w:val="110"/>
-          <w:sz w:val="18"/>
-        </w:rPr>
-        <w:t xml:space="preserve"> </w:t>
-      </w:r>
-      <w:r>
-        <w:rPr>
-          <w:w w:val="110"/>
-          <w:sz w:val="18"/>
-        </w:rPr>
-        <w:t>IV</w:t>
-      </w:r>
-      <w:r>
-        <w:rPr>
-          <w:spacing w:val="2"/>
-          <w:w w:val="110"/>
-          <w:sz w:val="18"/>
-        </w:rPr>
-        <w:t xml:space="preserve"> </w:t>
-      </w:r>
-      <w:r>
-        <w:rPr>
-          <w:w w:val="110"/>
-          <w:sz w:val="18"/>
-        </w:rPr>
-        <w:t xml:space="preserve">Team </w:t>
-      </w:r>
-      <w:r>
-        <w:rPr>
-          <w:spacing w:val="-2"/>
-          <w:w w:val="110"/>
-          <w:sz w:val="18"/>
-        </w:rPr>
-        <w:t>Competition</w:t>
+          <w:sz w:val="18"/>
+        </w:rPr>
+      </w:pPr>
+      <w:r>
+        <w:rPr>
+          <w:w w:val="110"/>
+          <w:sz w:val="18"/>
+        </w:rPr>
+        <w:t>2nd place, PACA Open; 1st place, National IV Team Competition</w:t>
       </w:r>
     </w:p>
     <w:p>
       <w:pPr>
         <w:tabs>
-          <w:tab w:val="left" w:pos="9657"/>
+          <w:tab w:val="decimal" w:pos="10334"/>
+        </w:tabs>
+        <w:spacing w:before="160"/>
+        <w:ind w:left="14"/>
+        <w:rPr>
+          <w:sz w:val="18"/>
+        </w:rPr>
+      </w:pPr>
+      <w:r>
+        <w:rPr>
+          <w:b/>
+          <w:w w:val="120"/>
+          <w:sz w:val="18"/>
+        </w:rPr>
+        <w:t>Eagles, ESILV US Football Team</w:t>
+      </w:r>
+      <w:r>
+        <w:rPr>
+          <w:b/>
+          <w:sz w:val="18"/>
+        </w:rPr>
+        <w:tab/>
+        <w:t>Paris, FR</w:t>
+      </w:r>
+    </w:p>
+    <w:p>
+      <w:pPr>
+        <w:tabs>
+          <w:tab w:val="decimal" w:pos="10334"/>
         </w:tabs>
         <w:spacing w:before="1"/>
         <w:ind w:left="14"/>
         <w:rPr>
-          <w:sz w:val="18"/>
-        </w:rPr>
-      </w:pPr>
-      <w:r>
-        <w:rPr>
-          <w:b/>
-          <w:w w:val="120"/>
-          <w:sz w:val="18"/>
-        </w:rPr>
-        <w:t>Eagles,</w:t>
-      </w:r>
-      <w:r>
-        <w:rPr>
-          <w:b/>
-          <w:spacing w:val="9"/>
-          <w:w w:val="120"/>
-          <w:sz w:val="18"/>
-        </w:rPr>
-        <w:t xml:space="preserve"> </w:t>
-      </w:r>
-      <w:r>
-        <w:rPr>
-          <w:b/>
-          <w:w w:val="120"/>
-          <w:sz w:val="18"/>
-        </w:rPr>
-        <w:t>ESILV</w:t>
-      </w:r>
-      <w:r>
-        <w:rPr>
-          <w:b/>
-          <w:spacing w:val="16"/>
-          <w:w w:val="120"/>
-          <w:sz w:val="18"/>
-        </w:rPr>
-        <w:t xml:space="preserve"> </w:t>
-      </w:r>
-      <w:r>
-        <w:rPr>
-          <w:b/>
-          <w:w w:val="120"/>
-          <w:sz w:val="18"/>
-        </w:rPr>
-        <w:t>US</w:t>
-      </w:r>
-      <w:r>
-        <w:rPr>
-          <w:b/>
-          <w:spacing w:val="13"/>
-          <w:w w:val="120"/>
-          <w:sz w:val="18"/>
-        </w:rPr>
-        <w:t xml:space="preserve"> </w:t>
-      </w:r>
-      <w:r>
-        <w:rPr>
-          <w:b/>
-          <w:w w:val="120"/>
-          <w:sz w:val="18"/>
-        </w:rPr>
-        <w:t>Football</w:t>
-      </w:r>
-      <w:r>
-        <w:rPr>
-          <w:b/>
-          <w:spacing w:val="10"/>
-          <w:w w:val="120"/>
-          <w:sz w:val="18"/>
-        </w:rPr>
-        <w:t xml:space="preserve"> </w:t>
-      </w:r>
-      <w:r>
-        <w:rPr>
-          <w:b/>
-          <w:spacing w:val="-4"/>
-          <w:w w:val="120"/>
-          <w:sz w:val="18"/>
-        </w:rPr>
-        <w:t>Team</w:t>
-      </w:r>
-      <w:r>
-        <w:rPr>
-          <w:b/>
+          <w:i/>
+          <w:sz w:val="18"/>
+        </w:rPr>
+      </w:pPr>
+      <w:r>
+        <w:rPr>
+          <w:b/>
+          <w:i/>
+          <w:w w:val="110"/>
+          <w:sz w:val="18"/>
+        </w:rPr>
+        <w:t>Wide Receiver</w:t>
+      </w:r>
+      <w:r>
+        <w:rPr>
+          <w:b/>
+          <w:i/>
           <w:sz w:val="18"/>
         </w:rPr>
         <w:tab/>
       </w:r>
       <w:r>
         <w:rPr>
-          <w:w w:val="110"/>
-          <w:sz w:val="18"/>
-        </w:rPr>
-        <w:t>Paris,</w:t>
-      </w:r>
-      <w:r>
-        <w:rPr>
-          <w:spacing w:val="-14"/>
-          <w:w w:val="110"/>
-          <w:sz w:val="18"/>
-        </w:rPr>
-        <w:t xml:space="preserve"> </w:t>
-      </w:r>
-      <w:r>
-        <w:rPr>
-          <w:spacing w:val="-5"/>
-          <w:w w:val="115"/>
-          <w:sz w:val="18"/>
-        </w:rPr>
-        <w:t>FR</w:t>
-      </w:r>
-    </w:p>
-    <w:p>
-      <w:pPr>
-        <w:tabs>
-          <w:tab w:val="left" w:pos="9469"/>
-        </w:tabs>
-        <w:spacing w:before="1"/>
-        <w:ind w:left="14"/>
-        <w:rPr>
-          <w:i/>
-          <w:sz w:val="18"/>
-        </w:rPr>
-      </w:pPr>
-      <w:r>
-        <w:rPr>
-          <w:b/>
-          <w:i/>
-          <w:w w:val="120"/>
-          <w:sz w:val="18"/>
-        </w:rPr>
-        <w:t>Wide</w:t>
-      </w:r>
-      <w:r>
-        <w:rPr>
-          <w:b/>
-          <w:i/>
-          <w:spacing w:val="-13"/>
-          <w:w w:val="120"/>
-          <w:sz w:val="18"/>
-        </w:rPr>
-        <w:t xml:space="preserve"> </w:t>
-      </w:r>
-      <w:r>
-        <w:rPr>
-          <w:b/>
-          <w:i/>
-          <w:spacing w:val="-2"/>
-          <w:w w:val="120"/>
-          <w:sz w:val="18"/>
-        </w:rPr>
-        <w:t>Receiver</w:t>
-      </w:r>
-      <w:r>
-        <w:rPr>
-          <w:rFonts w:ascii="Times New Roman"/>
-          <w:sz w:val="18"/>
-        </w:rPr>
-        <w:tab/>
-      </w:r>
-      <w:r>
-        <w:rPr>
-          <w:i/>
-          <w:w w:val="115"/>
-          <w:sz w:val="18"/>
-        </w:rPr>
-        <w:t>2017-</w:t>
-      </w:r>
-      <w:r>
-        <w:rPr>
-          <w:i/>
-          <w:spacing w:val="-4"/>
-          <w:w w:val="120"/>
-          <w:sz w:val="18"/>
-        </w:rPr>
-        <w:t>2018</w:t>
+          <w:i/>
+          <w:w w:val="110"/>
+          <w:sz w:val="18"/>
+        </w:rPr>
+        <w:t>2017 – 2018</w:t>
       </w:r>
     </w:p>
     <w:p>
@@ -5913,475 +4791,55 @@
           <w:w w:val="110"/>
           <w:sz w:val="18"/>
         </w:rPr>
-        <w:t>University</w:t>
-      </w:r>
-      <w:r>
-        <w:rPr>
-          <w:spacing w:val="7"/>
-          <w:w w:val="110"/>
-          <w:sz w:val="18"/>
-        </w:rPr>
-        <w:t xml:space="preserve"> </w:t>
-      </w:r>
-      <w:r>
-        <w:rPr>
-          <w:w w:val="110"/>
-          <w:sz w:val="18"/>
-        </w:rPr>
-        <w:t>French</w:t>
-      </w:r>
-      <w:r>
-        <w:rPr>
-          <w:spacing w:val="7"/>
-          <w:w w:val="110"/>
-          <w:sz w:val="18"/>
-        </w:rPr>
-        <w:t xml:space="preserve"> </w:t>
-      </w:r>
-      <w:r>
-        <w:rPr>
-          <w:w w:val="110"/>
-          <w:sz w:val="18"/>
-        </w:rPr>
-        <w:t>Champion</w:t>
-      </w:r>
-      <w:r>
-        <w:rPr>
-          <w:spacing w:val="7"/>
-          <w:w w:val="110"/>
-          <w:sz w:val="18"/>
-        </w:rPr>
-        <w:t xml:space="preserve"> </w:t>
-      </w:r>
-      <w:r>
-        <w:rPr>
-          <w:w w:val="110"/>
-          <w:sz w:val="18"/>
-        </w:rPr>
-        <w:t>in</w:t>
-      </w:r>
-      <w:r>
-        <w:rPr>
-          <w:spacing w:val="5"/>
-          <w:w w:val="110"/>
-          <w:sz w:val="18"/>
-        </w:rPr>
-        <w:t xml:space="preserve"> </w:t>
-      </w:r>
-      <w:r>
-        <w:rPr>
-          <w:spacing w:val="-4"/>
-          <w:w w:val="110"/>
-          <w:sz w:val="18"/>
-        </w:rPr>
-        <w:t>2017</w:t>
-      </w:r>
-    </w:p>
-    <w:p>
-      <w:pPr>
-        <w:pStyle w:val="Paragraphedeliste"/>
-        <w:numPr>
-          <w:ilvl w:val="0"/>
-          <w:numId w:val="1"/>
-        </w:numPr>
-        <w:tabs>
-          <w:tab w:val="left" w:pos="733"/>
-        </w:tabs>
-        <w:ind w:left="733" w:hanging="359"/>
-        <w:rPr>
-          <w:sz w:val="18"/>
-        </w:rPr>
-      </w:pPr>
-      <w:r>
-        <w:rPr>
-          <w:w w:val="110"/>
-          <w:sz w:val="18"/>
-        </w:rPr>
-        <w:t>US</w:t>
-      </w:r>
-      <w:r>
-        <w:rPr>
-          <w:spacing w:val="-4"/>
-          <w:w w:val="110"/>
-          <w:sz w:val="18"/>
-        </w:rPr>
-        <w:t xml:space="preserve"> </w:t>
-      </w:r>
-      <w:r>
-        <w:rPr>
-          <w:w w:val="110"/>
-          <w:sz w:val="18"/>
-        </w:rPr>
-        <w:t>Football</w:t>
-      </w:r>
-      <w:r>
-        <w:rPr>
-          <w:spacing w:val="-1"/>
-          <w:w w:val="110"/>
-          <w:sz w:val="18"/>
-        </w:rPr>
-        <w:t xml:space="preserve"> </w:t>
-      </w:r>
-      <w:proofErr w:type="gramStart"/>
-      <w:r>
-        <w:rPr>
-          <w:spacing w:val="-2"/>
-          <w:w w:val="110"/>
-          <w:sz w:val="18"/>
-        </w:rPr>
-        <w:t>association</w:t>
-      </w:r>
-      <w:proofErr w:type="gramEnd"/>
-    </w:p>
-    <w:p>
-      <w:pPr>
-        <w:pStyle w:val="Corpsdetexte"/>
-        <w:ind w:left="14" w:right="642" w:firstLine="0"/>
-      </w:pPr>
-      <w:r>
-        <w:rPr>
-          <w:b/>
-          <w:w w:val="110"/>
-        </w:rPr>
-        <w:t xml:space="preserve">Sports: </w:t>
-      </w:r>
-      <w:r>
-        <w:rPr>
-          <w:w w:val="110"/>
-        </w:rPr>
-        <w:t>Rugby, Skiing, Swimming, Krav Maga</w:t>
-      </w:r>
-    </w:p>
-    <w:p>
-      <w:pPr>
-        <w:pStyle w:val="Titre1"/>
-        <w:spacing w:before="59"/>
-      </w:pPr>
-      <w:r>
-        <w:rPr>
-          <w:noProof/>
-        </w:rPr>
-        <mc:AlternateContent>
-          <mc:Choice Requires="wpg">
-            <w:drawing>
-              <wp:anchor distT="0" distB="0" distL="0" distR="0" simplePos="0" relativeHeight="15730176" behindDoc="0" locked="0" layoutInCell="1" allowOverlap="1" wp14:anchorId="5214FB41" wp14:editId="09F7C435">
-                <wp:simplePos x="0" y="0"/>
-                <wp:positionH relativeFrom="page">
-                  <wp:posOffset>457200</wp:posOffset>
-                </wp:positionH>
-                <wp:positionV relativeFrom="paragraph">
-                  <wp:posOffset>213665</wp:posOffset>
-                </wp:positionV>
-                <wp:extent cx="6645275" cy="57785"/>
-                <wp:effectExtent l="0" t="0" r="0" b="0"/>
-                <wp:wrapNone/>
-                <wp:docPr id="16" name="Group 16"/>
-                <wp:cNvGraphicFramePr>
-                  <a:graphicFrameLocks xmlns:a="http://schemas.openxmlformats.org/drawingml/2006/main"/>
-                </wp:cNvGraphicFramePr>
-                <a:graphic xmlns:a="http://schemas.openxmlformats.org/drawingml/2006/main">
-                  <a:graphicData uri="http://schemas.microsoft.com/office/word/2010/wordprocessingGroup">
-                    <wpg:wgp>
-                      <wpg:cNvGrpSpPr>
-                        <a:grpSpLocks/>
-                      </wpg:cNvGrpSpPr>
-                      <wpg:grpSpPr>
-                        <a:xfrm>
-                          <a:off x="0" y="0"/>
-                          <a:ext cx="6645275" cy="57785"/>
-                          <a:chOff x="0" y="0"/>
-                          <a:chExt cx="6645275" cy="57785"/>
-                        </a:xfrm>
-                      </wpg:grpSpPr>
-                      <wps:wsp>
-                        <wps:cNvPr id="17" name="Graphic 17"/>
-                        <wps:cNvSpPr/>
-                        <wps:spPr>
-                          <a:xfrm>
-                            <a:off x="0" y="52705"/>
-                            <a:ext cx="6645275" cy="1270"/>
-                          </a:xfrm>
-                          <a:custGeom>
-                            <a:avLst/>
-                            <a:gdLst/>
-                            <a:ahLst/>
-                            <a:cxnLst/>
-                            <a:rect l="l" t="t" r="r" b="b"/>
-                            <a:pathLst>
-                              <a:path w="6645275">
-                                <a:moveTo>
-                                  <a:pt x="6645275" y="0"/>
-                                </a:moveTo>
-                                <a:lnTo>
-                                  <a:pt x="0" y="0"/>
-                                </a:lnTo>
-                              </a:path>
-                            </a:pathLst>
-                          </a:custGeom>
-                          <a:ln w="9525">
-                            <a:solidFill>
-                              <a:srgbClr val="000000"/>
-                            </a:solidFill>
-                            <a:prstDash val="solid"/>
-                          </a:ln>
-                        </wps:spPr>
-                        <wps:bodyPr wrap="square" lIns="0" tIns="0" rIns="0" bIns="0" rtlCol="0">
-                          <a:prstTxWarp prst="textNoShape">
-                            <a:avLst/>
-                          </a:prstTxWarp>
-                          <a:noAutofit/>
-                        </wps:bodyPr>
-                      </wps:wsp>
-                      <wps:wsp>
-                        <wps:cNvPr id="18" name="Graphic 18"/>
-                        <wps:cNvSpPr/>
-                        <wps:spPr>
-                          <a:xfrm>
-                            <a:off x="0" y="0"/>
-                            <a:ext cx="6645275" cy="38100"/>
-                          </a:xfrm>
-                          <a:custGeom>
-                            <a:avLst/>
-                            <a:gdLst/>
-                            <a:ahLst/>
-                            <a:cxnLst/>
-                            <a:rect l="l" t="t" r="r" b="b"/>
-                            <a:pathLst>
-                              <a:path w="6645275" h="38100">
-                                <a:moveTo>
-                                  <a:pt x="0" y="38099"/>
-                                </a:moveTo>
-                                <a:lnTo>
-                                  <a:pt x="6645275" y="38099"/>
-                                </a:lnTo>
-                                <a:lnTo>
-                                  <a:pt x="6645275" y="0"/>
-                                </a:lnTo>
-                                <a:lnTo>
-                                  <a:pt x="0" y="0"/>
-                                </a:lnTo>
-                                <a:lnTo>
-                                  <a:pt x="0" y="38099"/>
-                                </a:lnTo>
-                                <a:close/>
-                              </a:path>
-                            </a:pathLst>
-                          </a:custGeom>
-                          <a:solidFill>
-                            <a:srgbClr val="000000"/>
-                          </a:solidFill>
-                        </wps:spPr>
-                        <wps:bodyPr wrap="square" lIns="0" tIns="0" rIns="0" bIns="0" rtlCol="0">
-                          <a:prstTxWarp prst="textNoShape">
-                            <a:avLst/>
-                          </a:prstTxWarp>
-                          <a:noAutofit/>
-                        </wps:bodyPr>
-                      </wps:wsp>
-                      <wps:wsp>
-                        <wps:cNvPr id="19" name="Graphic 19"/>
-                        <wps:cNvSpPr/>
-                        <wps:spPr>
-                          <a:xfrm>
-                            <a:off x="0" y="52705"/>
-                            <a:ext cx="6645275" cy="1270"/>
-                          </a:xfrm>
-                          <a:custGeom>
-                            <a:avLst/>
-                            <a:gdLst/>
-                            <a:ahLst/>
-                            <a:cxnLst/>
-                            <a:rect l="l" t="t" r="r" b="b"/>
-                            <a:pathLst>
-                              <a:path w="6645275">
-                                <a:moveTo>
-                                  <a:pt x="6645275" y="0"/>
-                                </a:moveTo>
-                                <a:lnTo>
-                                  <a:pt x="0" y="0"/>
-                                </a:lnTo>
-                              </a:path>
-                            </a:pathLst>
-                          </a:custGeom>
-                          <a:ln w="9525">
-                            <a:solidFill>
-                              <a:srgbClr val="000000"/>
-                            </a:solidFill>
-                            <a:prstDash val="solid"/>
-                          </a:ln>
-                        </wps:spPr>
-                        <wps:bodyPr wrap="square" lIns="0" tIns="0" rIns="0" bIns="0" rtlCol="0">
-                          <a:prstTxWarp prst="textNoShape">
-                            <a:avLst/>
-                          </a:prstTxWarp>
-                          <a:noAutofit/>
-                        </wps:bodyPr>
-                      </wps:wsp>
-                      <wps:wsp>
-                        <wps:cNvPr id="20" name="Graphic 20"/>
-                        <wps:cNvSpPr/>
-                        <wps:spPr>
-                          <a:xfrm>
-                            <a:off x="0" y="0"/>
-                            <a:ext cx="6645275" cy="38100"/>
-                          </a:xfrm>
-                          <a:custGeom>
-                            <a:avLst/>
-                            <a:gdLst/>
-                            <a:ahLst/>
-                            <a:cxnLst/>
-                            <a:rect l="l" t="t" r="r" b="b"/>
-                            <a:pathLst>
-                              <a:path w="6645275" h="38100">
-                                <a:moveTo>
-                                  <a:pt x="0" y="38099"/>
-                                </a:moveTo>
-                                <a:lnTo>
-                                  <a:pt x="6645275" y="38099"/>
-                                </a:lnTo>
-                                <a:lnTo>
-                                  <a:pt x="6645275" y="0"/>
-                                </a:lnTo>
-                                <a:lnTo>
-                                  <a:pt x="0" y="0"/>
-                                </a:lnTo>
-                                <a:lnTo>
-                                  <a:pt x="0" y="38099"/>
-                                </a:lnTo>
-                                <a:close/>
-                              </a:path>
-                            </a:pathLst>
-                          </a:custGeom>
-                          <a:solidFill>
-                            <a:srgbClr val="000000"/>
-                          </a:solidFill>
-                        </wps:spPr>
-                        <wps:bodyPr wrap="square" lIns="0" tIns="0" rIns="0" bIns="0" rtlCol="0">
-                          <a:prstTxWarp prst="textNoShape">
-                            <a:avLst/>
-                          </a:prstTxWarp>
-                          <a:noAutofit/>
-                        </wps:bodyPr>
-                      </wps:wsp>
-                    </wpg:wgp>
-                  </a:graphicData>
-                </a:graphic>
-              </wp:anchor>
-            </w:drawing>
-          </mc:Choice>
-          <mc:Fallback>
-            <w:pict>
-              <v:group w14:anchorId="0051B540" id="Group 16" o:spid="_x0000_s1026" style="position:absolute;margin-left:36pt;margin-top:16.8pt;width:523.25pt;height:4.55pt;z-index:15730176;mso-wrap-distance-left:0;mso-wrap-distance-right:0;mso-position-horizontal-relative:page" coordsize="66452,577" o:gfxdata="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">
-                <v:shape id="Graphic 17" o:spid="_x0000_s1027" style="position:absolute;top:527;width:66452;height:12;visibility:visible;mso-wrap-style:square;v-text-anchor:top" coordsize="6645275,1270" o:gfxdata="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" path="m6645275,l,e" filled="f">
-                  <v:path arrowok="t"/>
-                </v:shape>
-                <v:shape id="Graphic 18" o:spid="_x0000_s1028" style="position:absolute;width:66452;height:381;visibility:visible;mso-wrap-style:square;v-text-anchor:top" coordsize="6645275,38100" o:gfxdata="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" path="m,38099r6645275,l6645275,,,,,38099xe" fillcolor="black" stroked="f">
-                  <v:path arrowok="t"/>
-                </v:shape>
-                <v:shape id="Graphic 19" o:spid="_x0000_s1029" style="position:absolute;top:527;width:66452;height:12;visibility:visible;mso-wrap-style:square;v-text-anchor:top" coordsize="6645275,1270" o:gfxdata="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" path="m6645275,l,e" filled="f">
-                  <v:path arrowok="t"/>
-                </v:shape>
-                <v:shape id="Graphic 20" o:spid="_x0000_s1030" style="position:absolute;width:66452;height:381;visibility:visible;mso-wrap-style:square;v-text-anchor:top" coordsize="6645275,38100" o:gfxdata="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" path="m,38099r6645275,l6645275,,,,,38099xe" fillcolor="black" stroked="f">
-                  <v:path arrowok="t"/>
-                </v:shape>
-                <w10:wrap anchorx="page"/>
-              </v:group>
-            </w:pict>
-          </mc:Fallback>
-        </mc:AlternateContent>
-      </w:r>
-      <w:r>
-        <w:rPr>
-          <w:spacing w:val="-2"/>
-          <w:w w:val="125"/>
-        </w:rPr>
-        <w:t>SKILLS</w:t>
-      </w:r>
-    </w:p>
-    <w:p>
-      <w:pPr>
-        <w:pStyle w:val="Corpsdetexte"/>
-        <w:spacing w:before="168"/>
-        <w:ind w:left="14" w:right="68" w:firstLine="0"/>
-      </w:pPr>
-      <w:r>
-        <w:t>Technical: Python (</w:t>
-      </w:r>
-      <w:proofErr w:type="spellStart"/>
-      <w:r>
-        <w:t>PyTorch</w:t>
-      </w:r>
-      <w:proofErr w:type="spellEnd"/>
-      <w:r>
-        <w:t xml:space="preserve">, TensorFlow, scikit-learn), JavaScript/TypeScript (React, Next.js, Node.js), C#, MATLAB, </w:t>
-      </w:r>
-      <w:proofErr w:type="gramStart"/>
-      <w:r>
-        <w:t>R  ·</w:t>
-      </w:r>
-      <w:proofErr w:type="gramEnd"/>
-      <w:r>
-        <w:t xml:space="preserve">  Signal Processing &amp; Neural </w:t>
-      </w:r>
-      <w:proofErr w:type="gramStart"/>
-      <w:r>
-        <w:t>Decoding  ·</w:t>
-      </w:r>
-      <w:proofErr w:type="gramEnd"/>
-      <w:r>
-        <w:t xml:space="preserve">  Deep Learning (CNN, LSTM, Transformer </w:t>
-      </w:r>
-      <w:proofErr w:type="gramStart"/>
-      <w:r>
-        <w:t>architectures)  ·</w:t>
-      </w:r>
-      <w:proofErr w:type="gramEnd"/>
-      <w:r>
-        <w:t xml:space="preserve">  CAD &amp; Rapid </w:t>
-      </w:r>
-      <w:proofErr w:type="gramStart"/>
-      <w:r>
-        <w:t>Prototyping  ·</w:t>
-      </w:r>
-      <w:proofErr w:type="gramEnd"/>
-      <w:r>
-        <w:t xml:space="preserve">  </w:t>
-      </w:r>
-      <w:proofErr w:type="gramStart"/>
-      <w:r>
-        <w:t>Unity  ·</w:t>
-      </w:r>
-      <w:proofErr w:type="gramEnd"/>
-      <w:r>
-        <w:t xml:space="preserve">  Arduino &amp; Embedded </w:t>
-      </w:r>
-      <w:proofErr w:type="gramStart"/>
-      <w:r>
-        <w:t>Systems  ·</w:t>
-      </w:r>
-      <w:proofErr w:type="gramEnd"/>
-      <w:r>
-        <w:t xml:space="preserve">  Git, Docker, Linux</w:t>
-      </w:r>
-    </w:p>
-    <w:p>
-      <w:pPr>
-        <w:spacing w:before="59"/>
+        <w:t>University French Champion (2017), US Football Association</w:t>
+      </w:r>
+    </w:p>
+    <w:p>
+      <w:pPr>
+        <w:spacing w:before="80"/>
         <w:ind w:left="14"/>
         <w:rPr>
-          <w:sz w:val="20"/>
-        </w:rPr>
-      </w:pPr>
-      <w:r>
-        <w:rPr>
-          <w:sz w:val="18"/>
-        </w:rPr>
-        <w:t>Languages: French (native), English (fluent — academic writing &amp; presentations), Spanish (conversational)</w:t>
-      </w:r>
-      <w:r>
-        <w:rPr>
-          <w:sz w:val="18"/>
-        </w:rPr>
+          <w:sz w:val="18"/>
+        </w:rPr>
+      </w:pPr>
+      <w:r>
+        <w:rPr>
+          <w:b/>
+          <w:w w:val="110"/>
+          <w:sz w:val="18"/>
+        </w:rPr>
+        <w:t>Sports:</w:t>
+      </w:r>
+      <w:r>
+        <w:rPr>
+          <w:w w:val="110"/>
+          <w:sz w:val="18"/>
+        </w:rPr>
+        <w:t xml:space="preserve"> Rugby, Skiing, Swimming, Krav Maga</w:t>
+      </w:r>
+    </w:p>
+    <w:p>
+      <w:pPr>
+        <w:spacing w:before="80"/>
+        <w:ind w:left="14"/>
+        <w:rPr>
+          <w:sz w:val="18"/>
+        </w:rPr>
+      </w:pPr>
+      <w:r>
+        <w:rPr>
+          <w:b/>
+          <w:w w:val="110"/>
+          <w:sz w:val="18"/>
+        </w:rPr>
+        <w:t>Music:</w:t>
+      </w:r>
+      <w:r>
+        <w:rPr>
+          <w:w w:val="110"/>
+          <w:sz w:val="18"/>
+        </w:rPr>
+        <w:t xml:space="preserve"> composition with FL Studio (Fruity Loops)</w:t>
       </w:r>
     </w:p>
     <w:sectPr>
@@ -6758,7 +5216,7 @@
   <w:docDefaults>
     <w:rPrDefault>
       <w:rPr>
-        <w:rFonts w:asciiTheme="minorHAnsi" w:eastAsiaTheme="minorHAnsi" w:hAnsiTheme="minorHAnsi" w:cstheme="minorBidi"/>
+        <w:rFonts w:ascii="Trebuchet MS" w:eastAsia="Trebuchet MS" w:hAnsi="Trebuchet MS" w:cs="Trebuchet MS"/>
         <w:sz w:val="22"/>
         <w:szCs w:val="22"/>
         <w:lang w:val="en-US" w:eastAsia="en-US" w:bidi="ar-SA"/>
@@ -7153,9 +5611,6 @@
   <w:style w:type="paragraph" w:default="1" w:styleId="Normal">
     <w:name w:val="Normal"/>
     <w:qFormat/>
-    <w:rPr>
-      <w:rFonts w:ascii="Trebuchet MS" w:eastAsia="Trebuchet MS" w:hAnsi="Trebuchet MS" w:cs="Trebuchet MS"/>
-    </w:rPr>
   </w:style>
   <w:style w:type="paragraph" w:styleId="Titre1">
     <w:name w:val="heading 1"/>
@@ -7206,8 +5661,7 @@
       <w:outlineLvl w:val="2"/>
     </w:pPr>
     <w:rPr>
-      <w:rFonts w:asciiTheme="majorHAnsi" w:eastAsiaTheme="majorEastAsia" w:hAnsiTheme="majorHAnsi" w:cstheme="majorBidi"/>
-      <w:color w:val="243F60" w:themeColor="accent1" w:themeShade="7F"/>
+      <w:color w:val="000000"/>
       <w:sz w:val="24"/>
       <w:szCs w:val="24"/>
     </w:rPr>
@@ -7310,8 +5764,8 @@
     <w:semiHidden/>
     <w:rsid w:val="00DE3E70"/>
     <w:rPr>
-      <w:rFonts w:asciiTheme="majorHAnsi" w:eastAsiaTheme="majorEastAsia" w:hAnsiTheme="majorHAnsi" w:cstheme="majorBidi"/>
-      <w:color w:val="243F60" w:themeColor="accent1" w:themeShade="7F"/>
+      <w:rFonts w:ascii="Trebuchet MS" w:eastAsia="Trebuchet MS" w:hAnsi="Trebuchet MS" w:cs="Trebuchet MS"/>
+      <w:color w:val="000000"/>
       <w:sz w:val="24"/>
       <w:szCs w:val="24"/>
     </w:rPr>

</xml_diff>

<commit_message>
resume: integrate Google feedback (graduation date, paper links, PhD field in title)
</commit_message>
<xml_diff>
--- a/public/resume_2026.docx
+++ b/public/resume_2026.docx
@@ -216,7 +216,7 @@
           <w:b/>
           <w:sz w:val="20"/>
         </w:rPr>
-        <w:t>Ph.D. Researcher, Institute for Future Technologies / Neuroscience Institute Paris</w:t>
+        <w:t>Ph.D. Researcher — Data Science &amp; LLM Systems · IFT / Neuroscience Institute Paris</w:t>
       </w:r>
       <w:r>
         <w:rPr>
@@ -247,11 +247,12 @@
       </w:r>
       <w:r>
         <w:rPr>
+          <w:b/>
           <w:sz w:val="18"/>
           <w:szCs w:val="18"/>
         </w:rPr>
         <w:tab/>
-        <w:t>2023 – Present</w:t>
+        <w:t>2023 – Expected: July 2, 2026</w:t>
       </w:r>
     </w:p>
     <w:p>
@@ -356,10 +357,15 @@
     <w:p>
       <w:pPr>
         <w:pStyle w:val="Titre1"/>
+        <w:pBdr>
+          <w:bottom w:val="single" w:sz="6" w:space="1" w:color="auto"/>
+        </w:pBdr>
         <w:spacing w:before="3"/>
       </w:pPr>
       <w:r>
         <w:rPr>
+          <w:rFonts w:ascii="Calibri" w:hAnsi="Calibri"/>
+          <w:b/>
           <w:i/>
           <w:sz w:val="18"/>
         </w:rPr>
@@ -369,10 +375,14 @@
     <w:p>
       <w:pPr>
         <w:pStyle w:val="Titre1"/>
+        <w:pBdr>
+          <w:bottom w:val="single" w:sz="6" w:space="1" w:color="auto"/>
+        </w:pBdr>
         <w:spacing w:before="3"/>
       </w:pPr>
       <w:r>
         <w:rPr>
+          <w:rFonts w:ascii="Calibri" w:hAnsi="Calibri"/>
           <w:b w:val="0"/>
           <w:i/>
           <w:sz w:val="17"/>
@@ -383,23 +393,39 @@
     <w:p>
       <w:pPr>
         <w:pStyle w:val="Titre1"/>
+        <w:pBdr>
+          <w:bottom w:val="single" w:sz="6" w:space="1" w:color="auto"/>
+        </w:pBdr>
         <w:spacing w:before="3"/>
       </w:pPr>
       <w:r>
         <w:rPr>
-          <w:sz w:val="18"/>
-        </w:rPr>
-        <w:t>•  Arslan, P.-P.</w:t>
-      </w:r>
-      <w:r>
-        <w:rPr>
+          <w:rFonts w:ascii="Calibri" w:hAnsi="Calibri"/>
+          <w:sz w:val="18"/>
+        </w:rPr>
+        <w:t xml:space="preserve">•  </w:t>
+      </w:r>
+      <w:r>
+        <w:rPr>
+          <w:rFonts w:ascii="Calibri" w:hAnsi="Calibri"/>
+          <w:b/>
+          <w:i w:val="0"/>
+          <w:sz w:val="18"/>
+        </w:rPr>
+        <w:t>Arslan, P.-P.</w:t>
+      </w:r>
+      <w:r>
+        <w:rPr>
+          <w:rFonts w:ascii="Calibri" w:hAnsi="Calibri"/>
           <w:b w:val="0"/>
+          <w:i w:val="0"/>
           <w:sz w:val="18"/>
         </w:rPr>
         <w:t xml:space="preserve">, Xiao, X., et al. ReTouche: Embodied Representations for Self-Directed Piano Learning. </w:t>
       </w:r>
       <w:r>
         <w:rPr>
+          <w:rFonts w:ascii="Calibri" w:hAnsi="Calibri"/>
           <w:b w:val="0"/>
           <w:i/>
           <w:sz w:val="18"/>
@@ -408,19 +434,25 @@
       </w:r>
       <w:r>
         <w:rPr>
+          <w:rFonts w:ascii="Calibri" w:hAnsi="Calibri"/>
           <w:b w:val="0"/>
-          <w:sz w:val="18"/>
-        </w:rPr>
-        <w:t xml:space="preserve"> (full paper, accepted).</w:t>
+          <w:i w:val="0"/>
+          <w:sz w:val="18"/>
+        </w:rPr>
+        <w:t xml:space="preserve"> (full paper, accepted). [DOI: 10.1145/3772318.3791044]</w:t>
       </w:r>
     </w:p>
     <w:p>
       <w:pPr>
         <w:pStyle w:val="Titre1"/>
+        <w:pBdr>
+          <w:bottom w:val="single" w:sz="6" w:space="1" w:color="auto"/>
+        </w:pBdr>
         <w:spacing w:before="3"/>
       </w:pPr>
       <w:r>
         <w:rPr>
+          <w:rFonts w:ascii="Calibri" w:hAnsi="Calibri"/>
           <w:b w:val="0"/>
           <w:i/>
           <w:sz w:val="17"/>
@@ -431,36 +463,48 @@
     <w:p>
       <w:pPr>
         <w:pStyle w:val="Titre1"/>
+        <w:pBdr>
+          <w:bottom w:val="single" w:sz="6" w:space="1" w:color="auto"/>
+        </w:pBdr>
         <w:spacing w:before="3"/>
       </w:pPr>
       <w:r>
         <w:rPr>
+          <w:rFonts w:ascii="Calibri" w:hAnsi="Calibri"/>
           <w:sz w:val="18"/>
         </w:rPr>
         <w:t xml:space="preserve">•  </w:t>
       </w:r>
       <w:r>
         <w:rPr>
+          <w:rFonts w:ascii="Calibri" w:hAnsi="Calibri"/>
           <w:b w:val="0"/>
+          <w:i w:val="0"/>
           <w:sz w:val="18"/>
         </w:rPr>
         <w:t xml:space="preserve">Li, Y. L.*, Kuang, Q.*, </w:t>
       </w:r>
       <w:r>
         <w:rPr>
+          <w:rFonts w:ascii="Calibri" w:hAnsi="Calibri"/>
+          <w:b/>
+          <w:i w:val="0"/>
           <w:sz w:val="18"/>
         </w:rPr>
         <w:t>Arslan, P.-P.*</w:t>
       </w:r>
       <w:r>
         <w:rPr>
+          <w:rFonts w:ascii="Calibri" w:hAnsi="Calibri"/>
           <w:b w:val="0"/>
+          <w:i w:val="0"/>
           <w:sz w:val="18"/>
         </w:rPr>
         <w:t xml:space="preserve">, Xiao, X., Ishii, H. Tangible Prompting: A Physical Vocabulary for Navigating Conceptual Spaces in Human-AI Co-Ideation. Submitted to </w:t>
       </w:r>
       <w:r>
         <w:rPr>
+          <w:rFonts w:ascii="Calibri" w:hAnsi="Calibri"/>
           <w:b w:val="0"/>
           <w:i/>
           <w:sz w:val="18"/>
@@ -469,13 +513,16 @@
       </w:r>
       <w:r>
         <w:rPr>
+          <w:rFonts w:ascii="Calibri" w:hAnsi="Calibri"/>
           <w:b w:val="0"/>
+          <w:i w:val="0"/>
           <w:sz w:val="18"/>
         </w:rPr>
         <w:t xml:space="preserve">; Demo accepted at </w:t>
       </w:r>
       <w:r>
         <w:rPr>
+          <w:rFonts w:ascii="Calibri" w:hAnsi="Calibri"/>
           <w:b w:val="0"/>
           <w:i/>
           <w:sz w:val="18"/>
@@ -484,7 +531,9 @@
       </w:r>
       <w:r>
         <w:rPr>
+          <w:rFonts w:ascii="Calibri" w:hAnsi="Calibri"/>
           <w:b w:val="0"/>
+          <w:i w:val="0"/>
           <w:sz w:val="18"/>
         </w:rPr>
         <w:t>. (*equal contribution)</w:t>
@@ -493,36 +542,48 @@
     <w:p>
       <w:pPr>
         <w:pStyle w:val="Titre1"/>
+        <w:pBdr>
+          <w:bottom w:val="single" w:sz="6" w:space="1" w:color="auto"/>
+        </w:pBdr>
         <w:spacing w:before="3"/>
       </w:pPr>
       <w:r>
         <w:rPr>
+          <w:rFonts w:ascii="Calibri" w:hAnsi="Calibri"/>
           <w:sz w:val="18"/>
         </w:rPr>
         <w:t xml:space="preserve">•  </w:t>
       </w:r>
       <w:r>
         <w:rPr>
+          <w:rFonts w:ascii="Calibri" w:hAnsi="Calibri"/>
           <w:b w:val="0"/>
+          <w:i w:val="0"/>
           <w:sz w:val="18"/>
         </w:rPr>
         <w:t xml:space="preserve">Li, Y. L.*, Kuang, Q.*, </w:t>
       </w:r>
       <w:r>
         <w:rPr>
+          <w:rFonts w:ascii="Calibri" w:hAnsi="Calibri"/>
+          <w:b/>
+          <w:i w:val="0"/>
           <w:sz w:val="18"/>
         </w:rPr>
         <w:t>Arslan, P.-P.*</w:t>
       </w:r>
       <w:r>
         <w:rPr>
+          <w:rFonts w:ascii="Calibri" w:hAnsi="Calibri"/>
           <w:b w:val="0"/>
+          <w:i w:val="0"/>
           <w:sz w:val="18"/>
         </w:rPr>
         <w:t xml:space="preserve">, Xiao, X., Ishii, H. Tangible Co-Ideation: Designing Embodied Prompting for Creative Thinking with Large Language Models. </w:t>
       </w:r>
       <w:r>
         <w:rPr>
+          <w:rFonts w:ascii="Calibri" w:hAnsi="Calibri"/>
           <w:b w:val="0"/>
           <w:i/>
           <w:sz w:val="18"/>
@@ -531,32 +592,50 @@
       </w:r>
       <w:r>
         <w:rPr>
+          <w:rFonts w:ascii="Calibri" w:hAnsi="Calibri"/>
           <w:b w:val="0"/>
-          <w:sz w:val="18"/>
-        </w:rPr>
-        <w:t xml:space="preserve"> (finalist). (*equal contribution)</w:t>
+          <w:i w:val="0"/>
+          <w:sz w:val="18"/>
+        </w:rPr>
+        <w:t xml:space="preserve"> (finalist). (*equal contribution) [PDF: paulpeterarslan.com/api/doc/Tangible/tangible_co_ideation_submission.pdf]</w:t>
       </w:r>
     </w:p>
     <w:p>
       <w:pPr>
         <w:pStyle w:val="Titre1"/>
+        <w:pBdr>
+          <w:bottom w:val="single" w:sz="6" w:space="1" w:color="auto"/>
+        </w:pBdr>
         <w:spacing w:before="3"/>
       </w:pPr>
       <w:r>
         <w:rPr>
-          <w:sz w:val="18"/>
-        </w:rPr>
-        <w:t>•  Arslan, P.-P.</w:t>
-      </w:r>
-      <w:r>
-        <w:rPr>
+          <w:rFonts w:ascii="Calibri" w:hAnsi="Calibri"/>
+          <w:sz w:val="18"/>
+        </w:rPr>
+        <w:t xml:space="preserve">•  </w:t>
+      </w:r>
+      <w:r>
+        <w:rPr>
+          <w:rFonts w:ascii="Calibri" w:hAnsi="Calibri"/>
+          <w:b/>
+          <w:i w:val="0"/>
+          <w:sz w:val="18"/>
+        </w:rPr>
+        <w:t>Arslan, P.-P.</w:t>
+      </w:r>
+      <w:r>
+        <w:rPr>
+          <w:rFonts w:ascii="Calibri" w:hAnsi="Calibri"/>
           <w:b w:val="0"/>
+          <w:i w:val="0"/>
           <w:sz w:val="18"/>
         </w:rPr>
         <w:t xml:space="preserve">, et al. A Novel Method for Rhythmic Imitation of Finger Movements and the Effects of Auditory Stimuli and Feedback. Submitted to </w:t>
       </w:r>
       <w:r>
         <w:rPr>
+          <w:rFonts w:ascii="Calibri" w:hAnsi="Calibri"/>
           <w:b w:val="0"/>
           <w:i/>
           <w:sz w:val="18"/>
@@ -565,19 +644,25 @@
       </w:r>
       <w:r>
         <w:rPr>
+          <w:rFonts w:ascii="Calibri" w:hAnsi="Calibri"/>
           <w:b w:val="0"/>
-          <w:sz w:val="18"/>
-        </w:rPr>
-        <w:t xml:space="preserve"> (Springer Nature).</w:t>
+          <w:i w:val="0"/>
+          <w:sz w:val="18"/>
+        </w:rPr>
+        <w:t xml:space="preserve"> (Springer Nature). [PDF: paulpeterarslan.com/api/doc/RhythmKaraoke/Rhythm%20Karaoke_22july2025.pdf]</w:t>
       </w:r>
     </w:p>
     <w:p>
       <w:pPr>
         <w:pStyle w:val="Titre1"/>
+        <w:pBdr>
+          <w:bottom w:val="single" w:sz="6" w:space="1" w:color="auto"/>
+        </w:pBdr>
         <w:spacing w:before="3"/>
       </w:pPr>
       <w:r>
         <w:rPr>
+          <w:rFonts w:ascii="Calibri" w:hAnsi="Calibri"/>
           <w:b w:val="0"/>
           <w:i/>
           <w:sz w:val="17"/>
@@ -588,23 +673,39 @@
     <w:p>
       <w:pPr>
         <w:pStyle w:val="Titre1"/>
+        <w:pBdr>
+          <w:bottom w:val="single" w:sz="6" w:space="1" w:color="auto"/>
+        </w:pBdr>
         <w:spacing w:before="3"/>
       </w:pPr>
       <w:r>
         <w:rPr>
-          <w:sz w:val="18"/>
-        </w:rPr>
-        <w:t>•  Arslan, P.-P.</w:t>
-      </w:r>
-      <w:r>
-        <w:rPr>
+          <w:rFonts w:ascii="Calibri" w:hAnsi="Calibri"/>
+          <w:sz w:val="18"/>
+        </w:rPr>
+        <w:t xml:space="preserve">•  </w:t>
+      </w:r>
+      <w:r>
+        <w:rPr>
+          <w:rFonts w:ascii="Calibri" w:hAnsi="Calibri"/>
+          <w:b/>
+          <w:i w:val="0"/>
+          <w:sz w:val="18"/>
+        </w:rPr>
+        <w:t>Arslan, P.-P.</w:t>
+      </w:r>
+      <w:r>
+        <w:rPr>
+          <w:rFonts w:ascii="Calibri" w:hAnsi="Calibri"/>
           <w:b w:val="0"/>
+          <w:i w:val="0"/>
           <w:sz w:val="18"/>
         </w:rPr>
         <w:t xml:space="preserve">, et al. Predicting Continuous Finger Forces from High-Density EMG with AI Regression Models. In preparation (target: </w:t>
       </w:r>
       <w:r>
         <w:rPr>
+          <w:rFonts w:ascii="Calibri" w:hAnsi="Calibri"/>
           <w:b w:val="0"/>
           <w:i/>
           <w:sz w:val="18"/>
@@ -613,26 +714,43 @@
       </w:r>
       <w:r>
         <w:rPr>
+          <w:rFonts w:ascii="Calibri" w:hAnsi="Calibri"/>
           <w:b w:val="0"/>
-          <w:sz w:val="18"/>
-        </w:rPr>
-        <w:t>-family journal).</w:t>
+          <w:i w:val="0"/>
+          <w:sz w:val="18"/>
+        </w:rPr>
+        <w:t>-family journal). [PDF: paulpeterarslan.com/api/doc/HDEMG/HDEMG_10_2025.pdf]</w:t>
       </w:r>
     </w:p>
     <w:p>
       <w:pPr>
         <w:pStyle w:val="Titre1"/>
+        <w:pBdr>
+          <w:bottom w:val="single" w:sz="6" w:space="1" w:color="auto"/>
+        </w:pBdr>
         <w:spacing w:before="3"/>
       </w:pPr>
       <w:r>
         <w:rPr>
-          <w:sz w:val="18"/>
-        </w:rPr>
-        <w:t>•  Arslan, P.-P.</w:t>
-      </w:r>
-      <w:r>
-        <w:rPr>
+          <w:rFonts w:ascii="Calibri" w:hAnsi="Calibri"/>
+          <w:sz w:val="18"/>
+        </w:rPr>
+        <w:t xml:space="preserve">•  </w:t>
+      </w:r>
+      <w:r>
+        <w:rPr>
+          <w:rFonts w:ascii="Calibri" w:hAnsi="Calibri"/>
+          <w:b/>
+          <w:i w:val="0"/>
+          <w:sz w:val="18"/>
+        </w:rPr>
+        <w:t>Arslan, P.-P.</w:t>
+      </w:r>
+      <w:r>
+        <w:rPr>
+          <w:rFonts w:ascii="Calibri" w:hAnsi="Calibri"/>
           <w:b w:val="0"/>
+          <w:i w:val="0"/>
           <w:sz w:val="18"/>
         </w:rPr>
         <w:t>, et al. Rhythmic Finger Tapping Performance in Stroke Survivors: Effects of Auditory Stimuli and Feedback. In preparation.</w:t>
@@ -641,10 +759,15 @@
     <w:p>
       <w:pPr>
         <w:pStyle w:val="Titre1"/>
+        <w:pBdr>
+          <w:bottom w:val="single" w:sz="6" w:space="1" w:color="auto"/>
+        </w:pBdr>
         <w:spacing w:before="3"/>
       </w:pPr>
       <w:r>
         <w:rPr>
+          <w:rFonts w:ascii="Calibri" w:hAnsi="Calibri"/>
+          <w:b/>
           <w:i/>
           <w:sz w:val="18"/>
         </w:rPr>
@@ -654,10 +777,14 @@
     <w:p>
       <w:pPr>
         <w:pStyle w:val="Titre1"/>
+        <w:pBdr>
+          <w:bottom w:val="single" w:sz="6" w:space="1" w:color="auto"/>
+        </w:pBdr>
         <w:spacing w:before="3"/>
       </w:pPr>
       <w:r>
         <w:rPr>
+          <w:rFonts w:ascii="Calibri" w:hAnsi="Calibri"/>
           <w:b w:val="0"/>
           <w:i/>
           <w:sz w:val="17"/>
@@ -668,36 +795,48 @@
     <w:p>
       <w:pPr>
         <w:pStyle w:val="Titre1"/>
+        <w:pBdr>
+          <w:bottom w:val="single" w:sz="6" w:space="1" w:color="auto"/>
+        </w:pBdr>
         <w:spacing w:before="3"/>
       </w:pPr>
       <w:r>
         <w:rPr>
+          <w:rFonts w:ascii="Calibri" w:hAnsi="Calibri"/>
           <w:sz w:val="18"/>
         </w:rPr>
         <w:t xml:space="preserve">•  </w:t>
       </w:r>
       <w:r>
         <w:rPr>
+          <w:rFonts w:ascii="Calibri" w:hAnsi="Calibri"/>
           <w:b w:val="0"/>
+          <w:i w:val="0"/>
           <w:sz w:val="18"/>
         </w:rPr>
         <w:t xml:space="preserve">Dziezuk, E., </w:t>
       </w:r>
       <w:r>
         <w:rPr>
+          <w:rFonts w:ascii="Calibri" w:hAnsi="Calibri"/>
+          <w:b/>
+          <w:i w:val="0"/>
           <w:sz w:val="18"/>
         </w:rPr>
         <w:t>Arslan, P.-P.</w:t>
       </w:r>
       <w:r>
         <w:rPr>
+          <w:rFonts w:ascii="Calibri" w:hAnsi="Calibri"/>
           <w:b w:val="0"/>
+          <w:i w:val="0"/>
           <w:sz w:val="18"/>
         </w:rPr>
         <w:t xml:space="preserve">, et al. (2025). Mécanismes sensoriels de la récupération de la dextérité manuelle après AVC : protocole d’une étude de cohorte prospective. </w:t>
       </w:r>
       <w:r>
         <w:rPr>
+          <w:rFonts w:ascii="Calibri" w:hAnsi="Calibri"/>
           <w:b w:val="0"/>
           <w:i/>
           <w:sz w:val="18"/>
@@ -706,7 +845,9 @@
       </w:r>
       <w:r>
         <w:rPr>
+          <w:rFonts w:ascii="Calibri" w:hAnsi="Calibri"/>
           <w:b w:val="0"/>
+          <w:i w:val="0"/>
           <w:sz w:val="18"/>
         </w:rPr>
         <w:t>.</w:t>
@@ -715,10 +856,14 @@
     <w:p>
       <w:pPr>
         <w:pStyle w:val="Titre1"/>
+        <w:pBdr>
+          <w:bottom w:val="single" w:sz="6" w:space="1" w:color="auto"/>
+        </w:pBdr>
         <w:spacing w:before="3"/>
       </w:pPr>
       <w:r>
         <w:rPr>
+          <w:rFonts w:ascii="Calibri" w:hAnsi="Calibri"/>
           <w:b w:val="0"/>
           <w:i/>
           <w:sz w:val="17"/>
@@ -729,36 +874,48 @@
     <w:p>
       <w:pPr>
         <w:pStyle w:val="Titre1"/>
+        <w:pBdr>
+          <w:bottom w:val="single" w:sz="6" w:space="1" w:color="auto"/>
+        </w:pBdr>
         <w:spacing w:before="3"/>
       </w:pPr>
       <w:r>
         <w:rPr>
+          <w:rFonts w:ascii="Calibri" w:hAnsi="Calibri"/>
           <w:sz w:val="18"/>
         </w:rPr>
         <w:t xml:space="preserve">•  </w:t>
       </w:r>
       <w:r>
         <w:rPr>
+          <w:rFonts w:ascii="Calibri" w:hAnsi="Calibri"/>
           <w:b w:val="0"/>
+          <w:i w:val="0"/>
           <w:sz w:val="18"/>
         </w:rPr>
         <w:t xml:space="preserve">Dziezuk, E., Badr, L., </w:t>
       </w:r>
       <w:r>
         <w:rPr>
+          <w:rFonts w:ascii="Calibri" w:hAnsi="Calibri"/>
+          <w:b/>
+          <w:i w:val="0"/>
           <w:sz w:val="18"/>
         </w:rPr>
         <w:t>Arslan, P.-P.</w:t>
       </w:r>
       <w:r>
         <w:rPr>
+          <w:rFonts w:ascii="Calibri" w:hAnsi="Calibri"/>
           <w:b w:val="0"/>
+          <w:i w:val="0"/>
           <w:sz w:val="18"/>
         </w:rPr>
         <w:t xml:space="preserve">, et al. A novel haptic stimulation device to improve finger movements – a validation and reliability study in healthy subjects. Submitted to </w:t>
       </w:r>
       <w:r>
         <w:rPr>
+          <w:rFonts w:ascii="Calibri" w:hAnsi="Calibri"/>
           <w:b w:val="0"/>
           <w:i/>
           <w:sz w:val="18"/>
@@ -767,7 +924,9 @@
       </w:r>
       <w:r>
         <w:rPr>
+          <w:rFonts w:ascii="Calibri" w:hAnsi="Calibri"/>
           <w:b w:val="0"/>
+          <w:i w:val="0"/>
           <w:sz w:val="18"/>
         </w:rPr>
         <w:t xml:space="preserve"> (Feb. 2026).</w:t>
@@ -776,10 +935,14 @@
     <w:p>
       <w:pPr>
         <w:pStyle w:val="Titre1"/>
+        <w:pBdr>
+          <w:bottom w:val="single" w:sz="6" w:space="1" w:color="auto"/>
+        </w:pBdr>
         <w:spacing w:before="3"/>
       </w:pPr>
       <w:r>
         <w:rPr>
+          <w:rFonts w:ascii="Calibri" w:hAnsi="Calibri"/>
           <w:b w:val="0"/>
           <w:i/>
           <w:sz w:val="17"/>
@@ -790,39 +953,45 @@
     <w:p>
       <w:pPr>
         <w:pStyle w:val="Titre1"/>
+        <w:pBdr>
+          <w:bottom w:val="single" w:sz="6" w:space="1" w:color="auto"/>
+        </w:pBdr>
         <w:spacing w:before="3"/>
       </w:pPr>
       <w:r>
         <w:rPr>
+          <w:rFonts w:ascii="Calibri" w:hAnsi="Calibri"/>
           <w:sz w:val="18"/>
         </w:rPr>
         <w:t xml:space="preserve">•  </w:t>
       </w:r>
       <w:r>
         <w:rPr>
+          <w:rFonts w:ascii="Calibri" w:hAnsi="Calibri"/>
           <w:b w:val="0"/>
+          <w:i w:val="0"/>
           <w:sz w:val="18"/>
         </w:rPr>
         <w:t xml:space="preserve">Duan, Z., </w:t>
       </w:r>
       <w:r>
         <w:rPr>
+          <w:rFonts w:ascii="Calibri" w:hAnsi="Calibri"/>
+          <w:b/>
+          <w:i w:val="0"/>
           <w:sz w:val="18"/>
         </w:rPr>
         <w:t>Arslan, P.-P.</w:t>
       </w:r>
       <w:r>
         <w:rPr>
+          <w:rFonts w:ascii="Calibri" w:hAnsi="Calibri"/>
           <w:b w:val="0"/>
+          <w:i w:val="0"/>
           <w:sz w:val="18"/>
         </w:rPr>
         <w:t>, Plantin, J., Lindberg, P. G., Wang, R. Motor Unit Coherence and Discharge Behavior During Single-Finger Isometric Contractions After Stroke. In preparation.</w:t>
       </w:r>
-    </w:p>
-    <w:p>
-      <w:pPr>
-        <w:pStyle w:val="Corpsdetexte"/>
-      </w:pPr>
     </w:p>
     <w:p>
       <w:pPr>

</xml_diff>

<commit_message>
Add FaultLine project page; sharpen PolicyTown gif; sync publication statuses
- New FaultLine project (ICLR 2027 submission) with figures, PDF link, and GitHub repo
- Regenerate PolicyTown hero gif at higher resolution with palette-optimized encoding
- Update Rhythm Karaoke (accepted) and Tangible Co-Ideation (CHI 2026 Demo Award,
  submitted to CHI 2027) statuses on publications and resume pages

Co-Authored-By: Claude Sonnet 5 <noreply@anthropic.com>
</commit_message>
<xml_diff>
--- a/public/resume_2026.docx
+++ b/public/resume_2026.docx
@@ -156,7 +156,7 @@
           <w:sz w:val="20"/>
         </w:rPr>
         <w:tab/>
-        <w:t>Cambridge, MA, USA</w:t>
+        <w:t>Cambridge, MA, USA · 2026</w:t>
       </w:r>
     </w:p>
     <w:p>
@@ -170,7 +170,7 @@
         <w:rPr>
           <w:sz w:val="18"/>
         </w:rPr>
-        <w:t>• Co-first author (equal contribution), Tangible Co-Ideation: multi-agent LLM system with multimodal RAG, fine-tuning and prompt engineering. Within-subjects user study (N=32, 16 pairs) compared tangible vs. screen-only conditions with statistically significant effects on verbal interaction and ideation behaviour. Advised by Prof. Hiroshi Ishii. Submitted to ACM UIST 2026; ACM DIS 2026 SDC finalist.</w:t>
+        <w:t>• Co-first author (equal contribution), Tangible Co-Ideation: multi-agent LLM system with multimodal RAG, fine-tuning and prompt engineering. Within-subjects user study (N=32, 16 pairs) compared tangible vs. screen-only conditions with statistically significant effects on verbal interaction and ideation behaviour. Advised by Prof. Hiroshi Ishii. Demo Award at ACM CHI 2026; full paper submitted to ACM CHI 2027; ACM DIS 2026 SDC finalist.</w:t>
       </w:r>
     </w:p>
     <w:p>
@@ -252,7 +252,7 @@
           <w:szCs w:val="18"/>
         </w:rPr>
         <w:tab/>
-        <w:t>2023 – Expected: July 2, 2026</w:t>
+        <w:t>2023 – 2026</w:t>
       </w:r>
     </w:p>
     <w:p>
@@ -312,7 +312,7 @@
         <w:rPr>
           <w:sz w:val="18"/>
         </w:rPr>
-        <w:t>• Rhythm Karaoke: Millisecond-resolution timing engine for fine motor behavior; powers downstream ML feature extraction. Submitted to Springer Nature (Scientific Reports)</w:t>
+        <w:t>• Rhythm Karaoke: Millisecond-resolution timing engine for fine motor behavior; powers downstream ML feature extraction. Accepted, Scientific Reports (Springer Nature), 2026</w:t>
       </w:r>
     </w:p>
     <w:p>
@@ -360,7 +360,7 @@
         <w:pBdr>
           <w:bottom w:val="single" w:sz="6" w:space="1" w:color="auto"/>
         </w:pBdr>
-        <w:spacing w:before="3"/>
+        <w:spacing w:before="160"/>
       </w:pPr>
       <w:r>
         <w:rPr>
@@ -370,6 +370,24 @@
           <w:sz w:val="18"/>
         </w:rPr>
         <w:t>First Author</w:t>
+      </w:r>
+    </w:p>
+    <w:p>
+      <w:pPr>
+        <w:pStyle w:val="Titre1"/>
+        <w:pBdr>
+          <w:bottom w:val="single" w:sz="6" w:space="1" w:color="auto"/>
+        </w:pBdr>
+        <w:spacing w:before="100"/>
+      </w:pPr>
+      <w:r>
+        <w:rPr>
+          <w:rFonts w:ascii="Calibri" w:hAnsi="Calibri"/>
+          <w:b w:val="0"/>
+          <w:i/>
+          <w:sz w:val="17"/>
+        </w:rPr>
+        <w:t>Peer-Reviewed</w:t>
       </w:r>
     </w:p>
     <w:p>
@@ -383,11 +401,45 @@
       <w:r>
         <w:rPr>
           <w:rFonts w:ascii="Calibri" w:hAnsi="Calibri"/>
+          <w:sz w:val="18"/>
+        </w:rPr>
+        <w:t xml:space="preserve">•  </w:t>
+      </w:r>
+      <w:r>
+        <w:rPr>
+          <w:rFonts w:ascii="Calibri" w:hAnsi="Calibri"/>
+          <w:b/>
+          <w:i w:val="0"/>
+          <w:sz w:val="18"/>
+        </w:rPr>
+        <w:t>Arslan, P.-P.</w:t>
+      </w:r>
+      <w:r>
+        <w:rPr>
+          <w:rFonts w:ascii="Calibri" w:hAnsi="Calibri"/>
           <w:b w:val="0"/>
-          <w:i/>
-          <w:sz w:val="17"/>
-        </w:rPr>
-        <w:t>Peer-Reviewed</w:t>
+          <w:i w:val="0"/>
+          <w:sz w:val="18"/>
+        </w:rPr>
+        <w:t xml:space="preserve">, Xiao, X., et al. ReTouche: Embodied Representations for Self-Directed Piano Learning. </w:t>
+      </w:r>
+      <w:r>
+        <w:rPr>
+          <w:rFonts w:ascii="Calibri" w:hAnsi="Calibri"/>
+          <w:b w:val="0"/>
+          <w:i/>
+          <w:sz w:val="18"/>
+        </w:rPr>
+        <w:t>ACM CHI 2026</w:t>
+      </w:r>
+      <w:r>
+        <w:rPr>
+          <w:rFonts w:ascii="Calibri" w:hAnsi="Calibri"/>
+          <w:b w:val="0"/>
+          <w:i w:val="0"/>
+          <w:sz w:val="18"/>
+        </w:rPr>
+        <w:t xml:space="preserve"> (full paper, accepted). [DOI: 10.1145/3772318.3791044]</w:t>
       </w:r>
     </w:p>
     <w:p>
@@ -421,7 +473,7 @@
           <w:i w:val="0"/>
           <w:sz w:val="18"/>
         </w:rPr>
-        <w:t xml:space="preserve">, Xiao, X., et al. ReTouche: Embodied Representations for Self-Directed Piano Learning. </w:t>
+        <w:t xml:space="preserve">, et al. A Novel Method for Rhythmic Imitation of Finger Movements and the Effects of Auditory Stimuli and Feedback. Accepted for publication, </w:t>
       </w:r>
       <w:r>
         <w:rPr>
@@ -430,7 +482,7 @@
           <w:i/>
           <w:sz w:val="18"/>
         </w:rPr>
-        <w:t>ACM CHI 2026</w:t>
+        <w:t>Scientific Reports</w:t>
       </w:r>
       <w:r>
         <w:rPr>
@@ -439,7 +491,25 @@
           <w:i w:val="0"/>
           <w:sz w:val="18"/>
         </w:rPr>
-        <w:t xml:space="preserve"> (full paper, accepted). [DOI: 10.1145/3772318.3791044]</w:t>
+        <w:t xml:space="preserve"> (Springer Nature), 2026. [PDF: paulpeterarslan.com/api/doc/RhythmKaraoke/Rhythm%20Karaoke_22july2025.pdf]</w:t>
+      </w:r>
+    </w:p>
+    <w:p>
+      <w:pPr>
+        <w:pStyle w:val="Titre1"/>
+        <w:pBdr>
+          <w:bottom w:val="single" w:sz="6" w:space="1" w:color="auto"/>
+        </w:pBdr>
+        <w:spacing w:before="100"/>
+      </w:pPr>
+      <w:r>
+        <w:rPr>
+          <w:rFonts w:ascii="Calibri" w:hAnsi="Calibri"/>
+          <w:b w:val="0"/>
+          <w:i/>
+          <w:sz w:val="17"/>
+        </w:rPr>
+        <w:t>Under Review</w:t>
       </w:r>
     </w:p>
     <w:p>
@@ -453,11 +523,72 @@
       <w:r>
         <w:rPr>
           <w:rFonts w:ascii="Calibri" w:hAnsi="Calibri"/>
+          <w:sz w:val="18"/>
+        </w:rPr>
+        <w:t xml:space="preserve">•  </w:t>
+      </w:r>
+      <w:r>
+        <w:rPr>
+          <w:rFonts w:ascii="Calibri" w:hAnsi="Calibri"/>
           <w:b w:val="0"/>
-          <w:i/>
-          <w:sz w:val="17"/>
-        </w:rPr>
-        <w:t>Under Review</w:t>
+          <w:i w:val="0"/>
+          <w:sz w:val="18"/>
+        </w:rPr>
+        <w:t xml:space="preserve">Li, Y. L.*, Kuang, Q.*, </w:t>
+      </w:r>
+      <w:r>
+        <w:rPr>
+          <w:rFonts w:ascii="Calibri" w:hAnsi="Calibri"/>
+          <w:b/>
+          <w:i w:val="0"/>
+          <w:sz w:val="18"/>
+        </w:rPr>
+        <w:t>Arslan, P.-P.*</w:t>
+      </w:r>
+      <w:r>
+        <w:rPr>
+          <w:rFonts w:ascii="Calibri" w:hAnsi="Calibri"/>
+          <w:b w:val="0"/>
+          <w:i w:val="0"/>
+          <w:sz w:val="18"/>
+        </w:rPr>
+        <w:t xml:space="preserve">, Xiao, X., Ishii, H. Tangible Prompting: A Physical Vocabulary for Navigating Conceptual Spaces in Human-AI Co-Ideation. Demo Award, </w:t>
+      </w:r>
+      <w:r>
+        <w:rPr>
+          <w:rFonts w:ascii="Calibri" w:hAnsi="Calibri"/>
+          <w:b w:val="0"/>
+          <w:i/>
+          <w:sz w:val="18"/>
+        </w:rPr>
+        <w:t>ACM CHI 2026</w:t>
+      </w:r>
+      <w:r>
+        <w:rPr>
+          <w:rFonts w:ascii="Calibri" w:hAnsi="Calibri"/>
+          <w:b w:val="0"/>
+          <w:i w:val="0"/>
+          <w:sz w:val="18"/>
+        </w:rPr>
+        <w:t xml:space="preserve">; full paper submitted to </w:t>
+      </w:r>
+      <w:r>
+        <w:rPr>
+          <w:rFonts w:ascii="Calibri" w:hAnsi="Calibri"/>
+          <w:b w:val="0"/>
+          <w:i/>
+          <w:sz w:val="18"/>
+        </w:rPr>
+        <w:t>ACM CHI 2027</w:t>
+      </w:r>
+      <w:r>
+        <w:rPr>
+          <w:rFonts w:ascii="Calibri" w:hAnsi="Calibri"/>
+          <w:b w:val="0"/>
+          <w:i w:val="0"/>
+          <w:sz w:val="18"/>
+        </w:rPr>
+        <w:t>. (*equal contribution)</w:t>
       </w:r>
     </w:p>
     <w:p>
@@ -500,7 +631,7 @@
           <w:i w:val="0"/>
           <w:sz w:val="18"/>
         </w:rPr>
-        <w:t xml:space="preserve">, Xiao, X., Ishii, H. Tangible Prompting: A Physical Vocabulary for Navigating Conceptual Spaces in Human-AI Co-Ideation. Submitted to </w:t>
+        <w:t xml:space="preserve">, Xiao, X., Ishii, H. Tangible Co-Ideation: Designing Embodied Prompting for Creative Thinking with Large Language Models. </w:t>
       </w:r>
       <w:r>
         <w:rPr>
@@ -509,7 +640,7 @@
           <w:i/>
           <w:sz w:val="18"/>
         </w:rPr>
-        <w:t>ACM UIST 2026</w:t>
+        <w:t>ACM DIS 2026 SDC</w:t>
       </w:r>
       <w:r>
         <w:rPr>
@@ -518,25 +649,25 @@
           <w:i w:val="0"/>
           <w:sz w:val="18"/>
         </w:rPr>
-        <w:t xml:space="preserve">; Demo accepted at </w:t>
-      </w:r>
+        <w:t xml:space="preserve"> (finalist). (*equal contribution) [PDF: paulpeterarslan.com/api/doc/Tangible/tangible_co_ideation_submission.pdf]</w:t>
+      </w:r>
+    </w:p>
+    <w:p>
+      <w:pPr>
+        <w:pStyle w:val="Titre1"/>
+        <w:pBdr>
+          <w:bottom w:val="single" w:sz="6" w:space="1" w:color="auto"/>
+        </w:pBdr>
+        <w:spacing w:before="100"/>
+      </w:pPr>
       <w:r>
         <w:rPr>
           <w:rFonts w:ascii="Calibri" w:hAnsi="Calibri"/>
           <w:b w:val="0"/>
           <w:i/>
-          <w:sz w:val="18"/>
-        </w:rPr>
-        <w:t>ACM CHI 2026</w:t>
-      </w:r>
-      <w:r>
-        <w:rPr>
-          <w:rFonts w:ascii="Calibri" w:hAnsi="Calibri"/>
-          <w:b w:val="0"/>
-          <w:i w:val="0"/>
-          <w:sz w:val="18"/>
-        </w:rPr>
-        <w:t>. (*equal contribution)</w:t>
+          <w:sz w:val="17"/>
+        </w:rPr>
+        <w:t>In Preparation</w:t>
       </w:r>
     </w:p>
     <w:p>
@@ -557,20 +688,11 @@
       <w:r>
         <w:rPr>
           <w:rFonts w:ascii="Calibri" w:hAnsi="Calibri"/>
-          <w:b w:val="0"/>
+          <w:b/>
           <w:i w:val="0"/>
           <w:sz w:val="18"/>
         </w:rPr>
-        <w:t xml:space="preserve">Li, Y. L.*, Kuang, Q.*, </w:t>
-      </w:r>
-      <w:r>
-        <w:rPr>
-          <w:rFonts w:ascii="Calibri" w:hAnsi="Calibri"/>
-          <w:b/>
-          <w:i w:val="0"/>
-          <w:sz w:val="18"/>
-        </w:rPr>
-        <w:t>Arslan, P.-P.*</w:t>
+        <w:t>Arslan, P.-P.</w:t>
       </w:r>
       <w:r>
         <w:rPr>
@@ -579,7 +701,7 @@
           <w:i w:val="0"/>
           <w:sz w:val="18"/>
         </w:rPr>
-        <w:t xml:space="preserve">, Xiao, X., Ishii, H. Tangible Co-Ideation: Designing Embodied Prompting for Creative Thinking with Large Language Models. </w:t>
+        <w:t xml:space="preserve">, et al. Predicting Continuous Finger Forces from High-Density EMG with AI Regression Models. In preparation (target: </w:t>
       </w:r>
       <w:r>
         <w:rPr>
@@ -588,7 +710,7 @@
           <w:i/>
           <w:sz w:val="18"/>
         </w:rPr>
-        <w:t>ACM DIS 2026 SDC</w:t>
+        <w:t>Nature</w:t>
       </w:r>
       <w:r>
         <w:rPr>
@@ -597,7 +719,7 @@
           <w:i w:val="0"/>
           <w:sz w:val="18"/>
         </w:rPr>
-        <w:t xml:space="preserve"> (finalist). (*equal contribution) [PDF: paulpeterarslan.com/api/doc/Tangible/tangible_co_ideation_submission.pdf]</w:t>
+        <w:t>-family journal).</w:t>
       </w:r>
     </w:p>
     <w:p>
@@ -631,25 +753,43 @@
           <w:i w:val="0"/>
           <w:sz w:val="18"/>
         </w:rPr>
-        <w:t xml:space="preserve">, et al. A Novel Method for Rhythmic Imitation of Finger Movements and the Effects of Auditory Stimuli and Feedback. Submitted to </w:t>
-      </w:r>
+        <w:t>, et al. Rhythmic Finger Tapping Performance in Stroke Survivors: Effects of Auditory Stimuli and Feedback. In preparation.</w:t>
+      </w:r>
+    </w:p>
+    <w:p>
+      <w:pPr>
+        <w:pStyle w:val="Titre1"/>
+        <w:pBdr>
+          <w:bottom w:val="single" w:sz="6" w:space="1" w:color="auto"/>
+        </w:pBdr>
+        <w:spacing w:before="160"/>
+      </w:pPr>
+      <w:r>
+        <w:rPr>
+          <w:rFonts w:ascii="Calibri" w:hAnsi="Calibri"/>
+          <w:b/>
+          <w:i/>
+          <w:sz w:val="18"/>
+        </w:rPr>
+        <w:t>Co-Authored</w:t>
+      </w:r>
+    </w:p>
+    <w:p>
+      <w:pPr>
+        <w:pStyle w:val="Titre1"/>
+        <w:pBdr>
+          <w:bottom w:val="single" w:sz="6" w:space="1" w:color="auto"/>
+        </w:pBdr>
+        <w:spacing w:before="100"/>
+      </w:pPr>
       <w:r>
         <w:rPr>
           <w:rFonts w:ascii="Calibri" w:hAnsi="Calibri"/>
           <w:b w:val="0"/>
           <w:i/>
-          <w:sz w:val="18"/>
-        </w:rPr>
-        <w:t>Scientific Reports</w:t>
-      </w:r>
-      <w:r>
-        <w:rPr>
-          <w:rFonts w:ascii="Calibri" w:hAnsi="Calibri"/>
-          <w:b w:val="0"/>
-          <w:i w:val="0"/>
-          <w:sz w:val="18"/>
-        </w:rPr>
-        <w:t xml:space="preserve"> (Springer Nature). [PDF: paulpeterarslan.com/api/doc/RhythmKaraoke/Rhythm%20Karaoke_22july2025.pdf]</w:t>
+          <w:sz w:val="17"/>
+        </w:rPr>
+        <w:t>Peer-Reviewed</w:t>
       </w:r>
     </w:p>
     <w:p>
@@ -663,11 +803,72 @@
       <w:r>
         <w:rPr>
           <w:rFonts w:ascii="Calibri" w:hAnsi="Calibri"/>
+          <w:sz w:val="18"/>
+        </w:rPr>
+        <w:t xml:space="preserve">•  </w:t>
+      </w:r>
+      <w:r>
+        <w:rPr>
+          <w:rFonts w:ascii="Calibri" w:hAnsi="Calibri"/>
           <w:b w:val="0"/>
+          <w:i w:val="0"/>
+          <w:sz w:val="18"/>
+        </w:rPr>
+        <w:t xml:space="preserve">Dziezuk, E., </w:t>
+      </w:r>
+      <w:r>
+        <w:rPr>
+          <w:rFonts w:ascii="Calibri" w:hAnsi="Calibri"/>
+          <w:b/>
+          <w:i w:val="0"/>
+          <w:sz w:val="18"/>
+        </w:rPr>
+        <w:t>Arslan, P.-P.</w:t>
+      </w:r>
+      <w:r>
+        <w:rPr>
+          <w:rFonts w:ascii="Calibri" w:hAnsi="Calibri"/>
+          <w:b w:val="0"/>
+          <w:i w:val="0"/>
+          <w:sz w:val="18"/>
+        </w:rPr>
+        <w:t xml:space="preserve">, et al. (2025). Mécanismes sensoriels de la récupération de la dextérité manuelle après AVC : protocole d’une étude de cohorte prospective. </w:t>
+      </w:r>
+      <w:r>
+        <w:rPr>
+          <w:rFonts w:ascii="Calibri" w:hAnsi="Calibri"/>
+          <w:b w:val="0"/>
+          <w:i/>
+          <w:sz w:val="18"/>
+        </w:rPr>
+        <w:t>Kinésithérapie Scientifique</w:t>
+      </w:r>
+      <w:r>
+        <w:rPr>
+          <w:rFonts w:ascii="Calibri" w:hAnsi="Calibri"/>
+          <w:b w:val="0"/>
+          <w:i w:val="0"/>
+          <w:sz w:val="18"/>
+        </w:rPr>
+        <w:t>.</w:t>
+      </w:r>
+    </w:p>
+    <w:p>
+      <w:pPr>
+        <w:pStyle w:val="Titre1"/>
+        <w:pBdr>
+          <w:bottom w:val="single" w:sz="6" w:space="1" w:color="auto"/>
+        </w:pBdr>
+        <w:spacing w:before="100"/>
+      </w:pPr>
+      <w:r>
+        <w:rPr>
+          <w:rFonts w:ascii="Calibri" w:hAnsi="Calibri"/>
+          <w:b w:val="0"/>
           <w:i/>
           <w:sz w:val="17"/>
         </w:rPr>
-        <w:t>In Preparation</w:t>
+        <w:t>Under Review</w:t>
       </w:r>
     </w:p>
     <w:p>
@@ -688,6 +889,15 @@
       <w:r>
         <w:rPr>
           <w:rFonts w:ascii="Calibri" w:hAnsi="Calibri"/>
+          <w:b w:val="0"/>
+          <w:i w:val="0"/>
+          <w:sz w:val="18"/>
+        </w:rPr>
+        <w:t xml:space="preserve">Dziezuk, E., Badr, L., </w:t>
+      </w:r>
+      <w:r>
+        <w:rPr>
+          <w:rFonts w:ascii="Calibri" w:hAnsi="Calibri"/>
           <w:b/>
           <w:i w:val="0"/>
           <w:sz w:val="18"/>
@@ -701,7 +911,7 @@
           <w:i w:val="0"/>
           <w:sz w:val="18"/>
         </w:rPr>
-        <w:t xml:space="preserve">, et al. Predicting Continuous Finger Forces from High-Density EMG with AI Regression Models. In preparation (target: </w:t>
+        <w:t xml:space="preserve">, et al. A novel haptic stimulation device to improve finger movements – a validation and reliability study in healthy subjects. Submitted to </w:t>
       </w:r>
       <w:r>
         <w:rPr>
@@ -710,7 +920,7 @@
           <w:i/>
           <w:sz w:val="18"/>
         </w:rPr>
-        <w:t>Nature</w:t>
+        <w:t>IEEE Transactions on Haptics</w:t>
       </w:r>
       <w:r>
         <w:rPr>
@@ -719,7 +929,7 @@
           <w:i w:val="0"/>
           <w:sz w:val="18"/>
         </w:rPr>
-        <w:t>-family journal).</w:t>
+        <w:t xml:space="preserve"> (Feb. 2026).</w:t>
       </w:r>
     </w:p>
     <w:p>
@@ -728,217 +938,7 @@
         <w:pBdr>
           <w:bottom w:val="single" w:sz="6" w:space="1" w:color="auto"/>
         </w:pBdr>
-        <w:spacing w:before="3"/>
-      </w:pPr>
-      <w:r>
-        <w:rPr>
-          <w:rFonts w:ascii="Calibri" w:hAnsi="Calibri"/>
-          <w:sz w:val="18"/>
-        </w:rPr>
-        <w:t xml:space="preserve">•  </w:t>
-      </w:r>
-      <w:r>
-        <w:rPr>
-          <w:rFonts w:ascii="Calibri" w:hAnsi="Calibri"/>
-          <w:b/>
-          <w:i w:val="0"/>
-          <w:sz w:val="18"/>
-        </w:rPr>
-        <w:t>Arslan, P.-P.</w:t>
-      </w:r>
-      <w:r>
-        <w:rPr>
-          <w:rFonts w:ascii="Calibri" w:hAnsi="Calibri"/>
-          <w:b w:val="0"/>
-          <w:i w:val="0"/>
-          <w:sz w:val="18"/>
-        </w:rPr>
-        <w:t>, et al. Rhythmic Finger Tapping Performance in Stroke Survivors: Effects of Auditory Stimuli and Feedback. In preparation.</w:t>
-      </w:r>
-    </w:p>
-    <w:p>
-      <w:pPr>
-        <w:pStyle w:val="Titre1"/>
-        <w:pBdr>
-          <w:bottom w:val="single" w:sz="6" w:space="1" w:color="auto"/>
-        </w:pBdr>
-        <w:spacing w:before="3"/>
-      </w:pPr>
-      <w:r>
-        <w:rPr>
-          <w:rFonts w:ascii="Calibri" w:hAnsi="Calibri"/>
-          <w:b/>
-          <w:i/>
-          <w:sz w:val="18"/>
-        </w:rPr>
-        <w:t>Co-Authored</w:t>
-      </w:r>
-    </w:p>
-    <w:p>
-      <w:pPr>
-        <w:pStyle w:val="Titre1"/>
-        <w:pBdr>
-          <w:bottom w:val="single" w:sz="6" w:space="1" w:color="auto"/>
-        </w:pBdr>
-        <w:spacing w:before="3"/>
-      </w:pPr>
-      <w:r>
-        <w:rPr>
-          <w:rFonts w:ascii="Calibri" w:hAnsi="Calibri"/>
-          <w:b w:val="0"/>
-          <w:i/>
-          <w:sz w:val="17"/>
-        </w:rPr>
-        <w:t>Peer-Reviewed</w:t>
-      </w:r>
-    </w:p>
-    <w:p>
-      <w:pPr>
-        <w:pStyle w:val="Titre1"/>
-        <w:pBdr>
-          <w:bottom w:val="single" w:sz="6" w:space="1" w:color="auto"/>
-        </w:pBdr>
-        <w:spacing w:before="3"/>
-      </w:pPr>
-      <w:r>
-        <w:rPr>
-          <w:rFonts w:ascii="Calibri" w:hAnsi="Calibri"/>
-          <w:sz w:val="18"/>
-        </w:rPr>
-        <w:t xml:space="preserve">•  </w:t>
-      </w:r>
-      <w:r>
-        <w:rPr>
-          <w:rFonts w:ascii="Calibri" w:hAnsi="Calibri"/>
-          <w:b w:val="0"/>
-          <w:i w:val="0"/>
-          <w:sz w:val="18"/>
-        </w:rPr>
-        <w:t xml:space="preserve">Dziezuk, E., </w:t>
-      </w:r>
-      <w:r>
-        <w:rPr>
-          <w:rFonts w:ascii="Calibri" w:hAnsi="Calibri"/>
-          <w:b/>
-          <w:i w:val="0"/>
-          <w:sz w:val="18"/>
-        </w:rPr>
-        <w:t>Arslan, P.-P.</w:t>
-      </w:r>
-      <w:r>
-        <w:rPr>
-          <w:rFonts w:ascii="Calibri" w:hAnsi="Calibri"/>
-          <w:b w:val="0"/>
-          <w:i w:val="0"/>
-          <w:sz w:val="18"/>
-        </w:rPr>
-        <w:t xml:space="preserve">, et al. (2025). Mécanismes sensoriels de la récupération de la dextérité manuelle après AVC : protocole d’une étude de cohorte prospective. </w:t>
-      </w:r>
-      <w:r>
-        <w:rPr>
-          <w:rFonts w:ascii="Calibri" w:hAnsi="Calibri"/>
-          <w:b w:val="0"/>
-          <w:i/>
-          <w:sz w:val="18"/>
-        </w:rPr>
-        <w:t>Kinésithérapie Scientifique</w:t>
-      </w:r>
-      <w:r>
-        <w:rPr>
-          <w:rFonts w:ascii="Calibri" w:hAnsi="Calibri"/>
-          <w:b w:val="0"/>
-          <w:i w:val="0"/>
-          <w:sz w:val="18"/>
-        </w:rPr>
-        <w:t>.</w:t>
-      </w:r>
-    </w:p>
-    <w:p>
-      <w:pPr>
-        <w:pStyle w:val="Titre1"/>
-        <w:pBdr>
-          <w:bottom w:val="single" w:sz="6" w:space="1" w:color="auto"/>
-        </w:pBdr>
-        <w:spacing w:before="3"/>
-      </w:pPr>
-      <w:r>
-        <w:rPr>
-          <w:rFonts w:ascii="Calibri" w:hAnsi="Calibri"/>
-          <w:b w:val="0"/>
-          <w:i/>
-          <w:sz w:val="17"/>
-        </w:rPr>
-        <w:t>Under Review</w:t>
-      </w:r>
-    </w:p>
-    <w:p>
-      <w:pPr>
-        <w:pStyle w:val="Titre1"/>
-        <w:pBdr>
-          <w:bottom w:val="single" w:sz="6" w:space="1" w:color="auto"/>
-        </w:pBdr>
-        <w:spacing w:before="3"/>
-      </w:pPr>
-      <w:r>
-        <w:rPr>
-          <w:rFonts w:ascii="Calibri" w:hAnsi="Calibri"/>
-          <w:sz w:val="18"/>
-        </w:rPr>
-        <w:t xml:space="preserve">•  </w:t>
-      </w:r>
-      <w:r>
-        <w:rPr>
-          <w:rFonts w:ascii="Calibri" w:hAnsi="Calibri"/>
-          <w:b w:val="0"/>
-          <w:i w:val="0"/>
-          <w:sz w:val="18"/>
-        </w:rPr>
-        <w:t xml:space="preserve">Dziezuk, E., Badr, L., </w:t>
-      </w:r>
-      <w:r>
-        <w:rPr>
-          <w:rFonts w:ascii="Calibri" w:hAnsi="Calibri"/>
-          <w:b/>
-          <w:i w:val="0"/>
-          <w:sz w:val="18"/>
-        </w:rPr>
-        <w:t>Arslan, P.-P.</w:t>
-      </w:r>
-      <w:r>
-        <w:rPr>
-          <w:rFonts w:ascii="Calibri" w:hAnsi="Calibri"/>
-          <w:b w:val="0"/>
-          <w:i w:val="0"/>
-          <w:sz w:val="18"/>
-        </w:rPr>
-        <w:t xml:space="preserve">, et al. A novel haptic stimulation device to improve finger movements – a validation and reliability study in healthy subjects. Submitted to </w:t>
-      </w:r>
-      <w:r>
-        <w:rPr>
-          <w:rFonts w:ascii="Calibri" w:hAnsi="Calibri"/>
-          <w:b w:val="0"/>
-          <w:i/>
-          <w:sz w:val="18"/>
-        </w:rPr>
-        <w:t>IEEE Transactions on Haptics</w:t>
-      </w:r>
-      <w:r>
-        <w:rPr>
-          <w:rFonts w:ascii="Calibri" w:hAnsi="Calibri"/>
-          <w:b w:val="0"/>
-          <w:i w:val="0"/>
-          <w:sz w:val="18"/>
-        </w:rPr>
-        <w:t xml:space="preserve"> (Feb. 2026).</w:t>
-      </w:r>
-    </w:p>
-    <w:p>
-      <w:pPr>
-        <w:pStyle w:val="Titre1"/>
-        <w:pBdr>
-          <w:bottom w:val="single" w:sz="6" w:space="1" w:color="auto"/>
-        </w:pBdr>
-        <w:spacing w:before="3"/>
+        <w:spacing w:before="100"/>
       </w:pPr>
       <w:r>
         <w:rPr>

</xml_diff>